<commit_message>
feat(thesis-ch3): add §3.4.5.5 P8 Pacific SIDS FIP model specification
Adds §3.4.5.5 Nghiên cứu 8 (Pacific SIDS) to thesis Chapter 3 methodology,
completing the five-paper model sequence §3.4.5.1–§3.4.5.5. Covers:
- N = 1,469 firms, 9 Pacific SIDS economies, ICRV Nhóm VI
- FIP confirmed: β = -0.404 (p = .032, country+year FE)
- M0-M3 model sequence with Vietnamese notation
- Robustness table (4 specifications, all β < 0)
- Variable definitions table with DAI Tier-1 only warning
- H2 capability null result documented (TCI p=.495, DAI p=.402)
Rebuilds dist/luan_an/03_methodology_vi.docx via pandoc.

https://claude.ai/code/session_01GMFmEtt6FYiJ4MKzBNCLqb
</commit_message>
<xml_diff>
--- a/dist/luan_an/03_methodology_vi.docx
+++ b/dist/luan_an/03_methodology_vi.docx
@@ -2,13 +2,38 @@
 <file path=word/document.xml><?xml version="1.0" encoding="utf-8"?>
 <w:document xmlns:w="http://schemas.openxmlformats.org/wordprocessingml/2006/main" xmlns:m="http://schemas.openxmlformats.org/officeDocument/2006/math" xmlns:r="http://schemas.openxmlformats.org/officeDocument/2006/relationships" xmlns:o="urn:schemas-microsoft-com:office:office" xmlns:v="urn:schemas-microsoft-com:vml" xmlns:w10="urn:schemas-microsoft-com:office:word" xmlns:a="http://schemas.openxmlformats.org/drawingml/2006/main" xmlns:pic="http://schemas.openxmlformats.org/drawingml/2006/picture" xmlns:wp="http://schemas.openxmlformats.org/drawingml/2006/wordprocessingDrawing">
   <w:body>
-    <w:bookmarkStart w:id="57" w:name="phương-pháp-nghiên-cứu"/>
+    <w:bookmarkStart w:id="53" w:name="chương-3-phương-pháp-nghiên-cứu"/>
     <w:p>
       <w:pPr>
         <w:pStyle w:val="Heading1"/>
       </w:pPr>
       <w:r>
-        <w:t xml:space="preserve">Phương pháp nghiên cứu</w:t>
+        <w:t xml:space="preserve">CHƯƠNG 3: PHƯƠNG PHÁP NGHIÊN CỨU</w:t>
+      </w:r>
+    </w:p>
+    <w:p>
+      <w:r>
+        <w:pict>
+          <v:rect style="width:0;height:1.5pt" o:hralign="center" o:hrstd="t" o:hr="t"/>
+        </w:pict>
+      </w:r>
+    </w:p>
+    <w:bookmarkStart w:id="22" w:name="X5941ec2c11a959ab436d2688aecb01c885af8d5"/>
+    <w:p>
+      <w:pPr>
+        <w:pStyle w:val="Heading2"/>
+      </w:pPr>
+      <w:r>
+        <w:t xml:space="preserve">3.1 Thiết kế nghiên cứu tổng thể</w:t>
+      </w:r>
+    </w:p>
+    <w:bookmarkStart w:id="20" w:name="X0ad18f2ea0f327e90ab493b140585d0f339e352"/>
+    <w:p>
+      <w:pPr>
+        <w:pStyle w:val="Heading3"/>
+      </w:pPr>
+      <w:r>
+        <w:t xml:space="preserve">3.1.1 Loại thiết kế</w:t>
       </w:r>
     </w:p>
     <w:p>
@@ -16,16 +41,28 @@
         <w:pStyle w:val="FirstParagraph"/>
       </w:pPr>
       <w:r>
-        <w:t xml:space="preserve">File này trình bày thiết kế nghiên cứu, nguồn dữ liệu, đo lường biến, mô hình phân tích và kiểm định độ vững. Mỗi thành phần đều được giải thích theo hai loại cơ sở:</w:t>
-      </w:r>
-    </w:p>
-    <w:p>
-      <w:pPr>
-        <w:numPr>
-          <w:ilvl w:val="0"/>
-          <w:numId w:val="1001"/>
-        </w:numPr>
-        <w:pStyle w:val="Compact"/>
+        <w:t xml:space="preserve">Luận án sử dụng</w:t>
+      </w:r>
+      <w:r>
+        <w:t xml:space="preserve"> </w:t>
+      </w:r>
+      <w:r>
+        <w:rPr>
+          <w:bCs/>
+          <w:b/>
+        </w:rPr>
+        <w:t xml:space="preserve">mixed synthesis-empirical design</w:t>
+      </w:r>
+      <w:r>
+        <w:t xml:space="preserve"> </w:t>
+      </w:r>
+      <w:r>
+        <w:t xml:space="preserve">gồm hai phase bổ sung cho nhau. Phase thứ nhất là meta-analysis tổng hợp literature để trả lời RQ1, còn phase thứ hai là phân tích thực nghiệm doanh nghiệp đa quốc gia để trả lời RQ2–RQ4. Hai phase đối thoại hai chiều: meta cung cấp baseline và gợi ý moderator cần kiểm định, còn empirical cung cấp bằng chứng bổ sung cho meta về bối cảnh châu Á và Pacific.</w:t>
+      </w:r>
+    </w:p>
+    <w:p>
+      <w:pPr>
+        <w:pStyle w:val="BodyText"/>
       </w:pPr>
       <w:r>
         <w:rPr>
@@ -35,82 +72,6 @@
         <w:t xml:space="preserve">Cơ sở kế thừa</w:t>
       </w:r>
       <w:r>
-        <w:t xml:space="preserve">: phương pháp đã được công nhận trong literature, kèm citation APA 7th.</w:t>
-      </w:r>
-    </w:p>
-    <w:p>
-      <w:pPr>
-        <w:numPr>
-          <w:ilvl w:val="0"/>
-          <w:numId w:val="1001"/>
-        </w:numPr>
-        <w:pStyle w:val="Compact"/>
-      </w:pPr>
-      <w:r>
-        <w:rPr>
-          <w:bCs/>
-          <w:b/>
-        </w:rPr>
-        <w:t xml:space="preserve">Đóng góp mới/điều chỉnh</w:t>
-      </w:r>
-      <w:r>
-        <w:t xml:space="preserve">: những điểm mà luận án cải tiến hoặc tổ chức mới, kèm lập luận rõ ràng.</w:t>
-      </w:r>
-    </w:p>
-    <w:bookmarkStart w:id="22" w:name="X56424e3208dc91a2885d1c297474f714b95bcea"/>
-    <w:p>
-      <w:pPr>
-        <w:pStyle w:val="Heading2"/>
-      </w:pPr>
-      <w:r>
-        <w:t xml:space="preserve">1. Thiết kế nghiên cứu tổng thể</w:t>
-      </w:r>
-    </w:p>
-    <w:bookmarkStart w:id="20" w:name="X754c796eb9648f308f08c432f0050cd9b94c6c8"/>
-    <w:p>
-      <w:pPr>
-        <w:pStyle w:val="Heading3"/>
-      </w:pPr>
-      <w:r>
-        <w:t xml:space="preserve">1.1 Loại thiết kế</w:t>
-      </w:r>
-    </w:p>
-    <w:p>
-      <w:pPr>
-        <w:pStyle w:val="FirstParagraph"/>
-      </w:pPr>
-      <w:r>
-        <w:t xml:space="preserve">Luận án sử dụng</w:t>
-      </w:r>
-      <w:r>
-        <w:t xml:space="preserve"> </w:t>
-      </w:r>
-      <w:r>
-        <w:rPr>
-          <w:bCs/>
-          <w:b/>
-        </w:rPr>
-        <w:t xml:space="preserve">mixed synthesis-empirical design</w:t>
-      </w:r>
-      <w:r>
-        <w:t xml:space="preserve"> </w:t>
-      </w:r>
-      <w:r>
-        <w:t xml:space="preserve">gồm hai phase bổ sung cho nhau. Phase thứ nhất là meta-analysis tổng hợp literature để trả lời RQ1, còn phase thứ hai là phân tích thực nghiệm doanh nghiệp đa quốc gia để trả lời RQ2–RQ4. Hai phase đối thoại hai chiều: meta cung cấp baseline và gợi ý moderator cần kiểm định, còn empirical cung cấp bằng chứng bổ sung cho meta về bối cảnh châu Á và Pacific.</w:t>
-      </w:r>
-    </w:p>
-    <w:p>
-      <w:pPr>
-        <w:pStyle w:val="BodyText"/>
-      </w:pPr>
-      <w:r>
-        <w:rPr>
-          <w:bCs/>
-          <w:b/>
-        </w:rPr>
-        <w:t xml:space="preserve">Cơ sở kế thừa</w:t>
-      </w:r>
-      <w:r>
         <w:t xml:space="preserve">: Mixed design kết hợp meta và primary data đã được áp dụng trong quản trị chiến lược và IB (Borenstein et al., 2009; Hunter &amp; Schmidt, 2004; Combs et al., 2011).</w:t>
       </w:r>
     </w:p>
@@ -146,13 +107,13 @@
       </w:r>
     </w:p>
     <w:bookmarkEnd w:id="20"/>
-    <w:bookmarkStart w:id="21" w:name="X248f0021a5a12709954fcf24a7f49cf9c0e965e"/>
+    <w:bookmarkStart w:id="21" w:name="Xfd5ae7e7a2cc0c8be87a7a0d68c06af783c9b59"/>
     <w:p>
       <w:pPr>
         <w:pStyle w:val="Heading3"/>
       </w:pPr>
       <w:r>
-        <w:t xml:space="preserve">1.2 Quy trình nghiên cứu</w:t>
+        <w:t xml:space="preserve">3.1.2 Quy trình nghiên cứu</w:t>
       </w:r>
     </w:p>
     <w:p>
@@ -181,22 +142,22 @@
     </w:p>
     <w:bookmarkEnd w:id="21"/>
     <w:bookmarkEnd w:id="22"/>
-    <w:bookmarkStart w:id="26" w:name="Xb099187d4d77291265428c7dacb6385eb4b3527"/>
+    <w:bookmarkStart w:id="26" w:name="Xba2b2f63509bf3587653379b96fe905a4c38721"/>
     <w:p>
       <w:pPr>
         <w:pStyle w:val="Heading2"/>
       </w:pPr>
       <w:r>
-        <w:t xml:space="preserve">2. Phase 1: Meta-analysis 1982–2026</w:t>
-      </w:r>
-    </w:p>
-    <w:bookmarkStart w:id="23" w:name="X1551a254f454544efc95505360b4c5c9d00b320"/>
+        <w:t xml:space="preserve">3.2 Phase 1 — Meta-analysis 1982–2026</w:t>
+      </w:r>
+    </w:p>
+    <w:bookmarkStart w:id="23" w:name="X6548c445f253576ab77db0afe7759a99accc5ae"/>
     <w:p>
       <w:pPr>
         <w:pStyle w:val="Heading3"/>
       </w:pPr>
       <w:r>
-        <w:t xml:space="preserve">2.1 Cơ sở kế thừa</w:t>
+        <w:t xml:space="preserve">3.2.1 Cơ sở kế thừa</w:t>
       </w:r>
     </w:p>
     <w:p>
@@ -250,20 +211,20 @@
       </w:r>
     </w:p>
     <w:bookmarkEnd w:id="23"/>
-    <w:bookmarkStart w:id="24" w:name="X0c1e6180491331dbef38f8b5cf97fc0ecad3881"/>
+    <w:bookmarkStart w:id="24" w:name="X4cc0e11cc2b0a899e7494b6932e6c46974fcac7"/>
     <w:p>
       <w:pPr>
         <w:pStyle w:val="Heading3"/>
       </w:pPr>
       <w:r>
-        <w:t xml:space="preserve">2.2 Đóng góp mới/điều chỉnh</w:t>
+        <w:t xml:space="preserve">3.2.2 Đóng góp mới/điều chỉnh</w:t>
       </w:r>
     </w:p>
     <w:p>
       <w:pPr>
         <w:numPr>
           <w:ilvl w:val="0"/>
-          <w:numId w:val="1002"/>
+          <w:numId w:val="1001"/>
         </w:numPr>
         <w:pStyle w:val="Compact"/>
       </w:pPr>
@@ -295,7 +256,7 @@
       <w:pPr>
         <w:numPr>
           <w:ilvl w:val="0"/>
-          <w:numId w:val="1002"/>
+          <w:numId w:val="1001"/>
         </w:numPr>
         <w:pStyle w:val="Compact"/>
       </w:pPr>
@@ -314,7 +275,7 @@
       <w:pPr>
         <w:numPr>
           <w:ilvl w:val="0"/>
-          <w:numId w:val="1002"/>
+          <w:numId w:val="1001"/>
         </w:numPr>
         <w:pStyle w:val="Compact"/>
       </w:pPr>
@@ -333,7 +294,7 @@
       <w:pPr>
         <w:numPr>
           <w:ilvl w:val="0"/>
-          <w:numId w:val="1002"/>
+          <w:numId w:val="1001"/>
         </w:numPr>
         <w:pStyle w:val="Compact"/>
       </w:pPr>
@@ -349,13 +310,13 @@
       </w:r>
     </w:p>
     <w:bookmarkEnd w:id="24"/>
-    <w:bookmarkStart w:id="25" w:name="X8ff9d76b57ab4183f46a16fef6b447d1a7ef01d"/>
+    <w:bookmarkStart w:id="25" w:name="Xae02c1433054ac6c9ee47047d46e66bd13cdc6b"/>
     <w:p>
       <w:pPr>
         <w:pStyle w:val="Heading3"/>
       </w:pPr>
       <w:r>
-        <w:t xml:space="preserve">2.3 Quy trình PRISMA</w:t>
+        <w:t xml:space="preserve">3.2.3 Quy trình PRISMA</w:t>
       </w:r>
     </w:p>
     <w:p>
@@ -401,22 +362,22 @@
     </w:p>
     <w:bookmarkEnd w:id="25"/>
     <w:bookmarkEnd w:id="26"/>
-    <w:bookmarkStart w:id="35" w:name="X6aa474f7b2e6804e45c9b533f4c4995c8a51f0e"/>
+    <w:bookmarkStart w:id="32" w:name="X2c6e58f89857f64ac5f06ae1a6ddd1deb030675"/>
     <w:p>
       <w:pPr>
         <w:pStyle w:val="Heading2"/>
       </w:pPr>
       <w:r>
-        <w:t xml:space="preserve">3. Phase 2: Multi-country empirical analysis</w:t>
-      </w:r>
-    </w:p>
-    <w:bookmarkStart w:id="27" w:name="X84ced60e62ea90934832891098abf01a4d917e5"/>
+        <w:t xml:space="preserve">3.3 Phase 2 — Phân tích thực nghiệm đa quốc gia</w:t>
+      </w:r>
+    </w:p>
+    <w:bookmarkStart w:id="27" w:name="Xf7fc23c09ac90b299b0f14681e1df5ca5c5e569"/>
     <w:p>
       <w:pPr>
         <w:pStyle w:val="Heading3"/>
       </w:pPr>
       <w:r>
-        <w:t xml:space="preserve">3.1 Nguồn dữ liệu</w:t>
+        <w:t xml:space="preserve">3.3.1 Nguồn dữ liệu</w:t>
       </w:r>
     </w:p>
     <w:p>
@@ -503,13 +464,13 @@
       </w:r>
     </w:p>
     <w:bookmarkEnd w:id="27"/>
-    <w:bookmarkStart w:id="28" w:name="X627d9e57359624ba53d60ada46440408c767234"/>
+    <w:bookmarkStart w:id="28" w:name="X2013f18ac82d23d08403a6b9339b953a5fef2fa"/>
     <w:p>
       <w:pPr>
         <w:pStyle w:val="Heading3"/>
       </w:pPr>
       <w:r>
-        <w:t xml:space="preserve">3.2 Đo lường biến phụ thuộc — Hiệu quả hoạt động</w:t>
+        <w:t xml:space="preserve">3.3.2 Đo lường biến phụ thuộc — Hiệu quả hoạt động</w:t>
       </w:r>
     </w:p>
     <w:p>
@@ -658,13 +619,13 @@
       </w:r>
     </w:p>
     <w:bookmarkEnd w:id="28"/>
-    <w:bookmarkStart w:id="29" w:name="X15f8964cdacf2e18287cd2f7dddc106f078f343"/>
+    <w:bookmarkStart w:id="29" w:name="X40a8e724c89b196c45c024f01b1458111f91588"/>
     <w:p>
       <w:pPr>
         <w:pStyle w:val="Heading3"/>
       </w:pPr>
       <w:r>
-        <w:t xml:space="preserve">3.3 Đo lường biến độc lập — Quốc tế hóa</w:t>
+        <w:t xml:space="preserve">3.3.3 Đo lường biến độc lập — Quốc tế hóa</w:t>
       </w:r>
     </w:p>
     <w:p>
@@ -811,27 +772,30 @@
       </w:r>
     </w:p>
     <w:bookmarkEnd w:id="29"/>
-    <w:bookmarkStart w:id="33" w:name="Xdd2644898f5d54c5cc66b5de84b6ed843e574dc"/>
+    <w:bookmarkStart w:id="30" w:name="Xa7342efa9e4440bffeb50b266b6e2d5207de558"/>
     <w:p>
       <w:pPr>
         <w:pStyle w:val="Heading3"/>
       </w:pPr>
       <w:r>
-        <w:t xml:space="preserve">3.4 Đo lường biến điều tiết</w:t>
-      </w:r>
-    </w:p>
-    <w:bookmarkStart w:id="30" w:name="Xc9447eee4507cc41fc1bfd78b7a464443ed9908"/>
-    <w:p>
-      <w:pPr>
-        <w:pStyle w:val="Heading4"/>
-      </w:pPr>
-      <w:r>
-        <w:t xml:space="preserve">3.4.1 Digital constructs (TCI và DAI)</w:t>
+        <w:t xml:space="preserve">3.3.4 Đo lường biến điều tiết</w:t>
       </w:r>
     </w:p>
     <w:p>
       <w:pPr>
         <w:pStyle w:val="FirstParagraph"/>
+      </w:pPr>
+      <w:r>
+        <w:rPr>
+          <w:bCs/>
+          <w:b/>
+        </w:rPr>
+        <w:t xml:space="preserve">a) Digital constructs (TCI và DAI)</w:t>
+      </w:r>
+    </w:p>
+    <w:p>
+      <w:pPr>
+        <w:pStyle w:val="BodyText"/>
       </w:pPr>
       <w:r>
         <w:t xml:space="preserve">Luận án phân biệt rõ hai construct:</w:t>
@@ -841,7 +805,7 @@
       <w:pPr>
         <w:numPr>
           <w:ilvl w:val="0"/>
-          <w:numId w:val="1003"/>
+          <w:numId w:val="1002"/>
         </w:numPr>
         <w:pStyle w:val="Compact"/>
       </w:pPr>
@@ -860,7 +824,7 @@
       <w:pPr>
         <w:numPr>
           <w:ilvl w:val="0"/>
-          <w:numId w:val="1003"/>
+          <w:numId w:val="1002"/>
         </w:numPr>
         <w:pStyle w:val="Compact"/>
       </w:pPr>
@@ -936,19 +900,21 @@
         <w:t xml:space="preserve">trong bối cảnh WBES, đảm bảo construct purity ở 47 nền kinh tế châu Á và Pacific, với pipeline hòa hợp 3 thế hệ schema. Phân tách TCI và DAI theo (i) Bharadwaj et al. (2013) — IT capability vs digital business strategy có nomological nets khác nhau; (ii) phân tầng 3 cấp của Verhoef et al. (2021) — digitization, digitalization, digital transformation; (iii) truyền thống Lall (1992) và Cohen &amp; Levinthal (1990) coi technological capability là chiều sâu năng lực nội tại (absorptive capacity), khác về bản chất với digital adoption ở giao diện ngoại tại; (iv) resource-orchestration logic của Bhandari et al. (2023) cho I→P relationship; và (v) 4 tiêu chí formative composite của Coltman et al. (2008) — đảm bảo TCI và DAI là hai composite độc lập.</w:t>
       </w:r>
     </w:p>
-    <w:bookmarkEnd w:id="30"/>
-    <w:bookmarkStart w:id="31" w:name="X675dba3bc66f04bdb35ea3e98db6777f7453517"/>
-    <w:p>
-      <w:pPr>
-        <w:pStyle w:val="Heading4"/>
-      </w:pPr>
-      <w:r>
-        <w:t xml:space="preserve">3.4.2 Institutional variables</w:t>
-      </w:r>
-    </w:p>
-    <w:p>
-      <w:pPr>
-        <w:pStyle w:val="FirstParagraph"/>
+    <w:p>
+      <w:pPr>
+        <w:pStyle w:val="BodyText"/>
+      </w:pPr>
+      <w:r>
+        <w:rPr>
+          <w:bCs/>
+          <w:b/>
+        </w:rPr>
+        <w:t xml:space="preserve">b) Biến thể chế</w:t>
+      </w:r>
+    </w:p>
+    <w:p>
+      <w:pPr>
+        <w:pStyle w:val="BodyText"/>
       </w:pPr>
       <w:r>
         <w:rPr>
@@ -976,19 +942,21 @@
         <w:t xml:space="preserve">: Khanna và Palepu (2010) với institutional voids; North (1990) với institutional analysis; Marano et al. (2016) với meta-analytic evidence về institutional moderators.</w:t>
       </w:r>
     </w:p>
-    <w:bookmarkEnd w:id="31"/>
-    <w:bookmarkStart w:id="32" w:name="Xafb7051784bd2190b9c0ec64eb794b969a7e6b4"/>
-    <w:p>
-      <w:pPr>
-        <w:pStyle w:val="Heading4"/>
-      </w:pPr>
-      <w:r>
-        <w:t xml:space="preserve">3.4.3 Top manager characteristics</w:t>
-      </w:r>
-    </w:p>
-    <w:p>
-      <w:pPr>
-        <w:pStyle w:val="FirstParagraph"/>
+    <w:p>
+      <w:pPr>
+        <w:pStyle w:val="BodyText"/>
+      </w:pPr>
+      <w:r>
+        <w:rPr>
+          <w:bCs/>
+          <w:b/>
+        </w:rPr>
+        <w:t xml:space="preserve">c) Đặc điểm nhà quản trị cấp cao</w:t>
+      </w:r>
+    </w:p>
+    <w:p>
+      <w:pPr>
+        <w:pStyle w:val="BodyText"/>
       </w:pPr>
       <w:r>
         <w:rPr>
@@ -1031,15 +999,14 @@
         <w:t xml:space="preserve">: chỉ trong subset có đủ dữ liệu; nếu thiếu, đưa vào robustness chứ không bắt buộc trong mô hình chính.</w:t>
       </w:r>
     </w:p>
-    <w:bookmarkEnd w:id="32"/>
-    <w:bookmarkEnd w:id="33"/>
-    <w:bookmarkStart w:id="34" w:name="X47e64c38922de9c9938d7912558eba6c86d3a28"/>
+    <w:bookmarkEnd w:id="30"/>
+    <w:bookmarkStart w:id="31" w:name="X242c994c02f3871ea8359747a875373a8cd3eca"/>
     <w:p>
       <w:pPr>
         <w:pStyle w:val="Heading3"/>
       </w:pPr>
       <w:r>
-        <w:t xml:space="preserve">3.5 Biến kiểm soát</w:t>
+        <w:t xml:space="preserve">3.3.5 Biến kiểm soát</w:t>
       </w:r>
     </w:p>
     <w:p>
@@ -1076,24 +1043,24 @@
         <w:t xml:space="preserve">: chuẩn trong nghiên cứu WBES và IB (Aterido et al., 2011; Ayyagari et al., 2011).</w:t>
       </w:r>
     </w:p>
-    <w:bookmarkEnd w:id="34"/>
-    <w:bookmarkEnd w:id="35"/>
-    <w:bookmarkStart w:id="48" w:name="X739c39ba72bd4ab9a65ae6cfaca8e78ae4b0f0d"/>
+    <w:bookmarkEnd w:id="31"/>
+    <w:bookmarkEnd w:id="32"/>
+    <w:bookmarkStart w:id="44" w:name="Xd77d50b091b2ed22b6b5e4ab46917b297ec7074"/>
     <w:p>
       <w:pPr>
         <w:pStyle w:val="Heading2"/>
       </w:pPr>
       <w:r>
-        <w:t xml:space="preserve">4. Mô hình phân tích</w:t>
-      </w:r>
-    </w:p>
-    <w:bookmarkStart w:id="36" w:name="X4c78f5166bf22e57c1f525071727cb59025b68d"/>
+        <w:t xml:space="preserve">3.4 Mô hình phân tích</w:t>
+      </w:r>
+    </w:p>
+    <w:bookmarkStart w:id="33" w:name="Xd5826715f3ece4e9c39fdb63b501527e807067b"/>
     <w:p>
       <w:pPr>
         <w:pStyle w:val="Heading3"/>
       </w:pPr>
       <w:r>
-        <w:t xml:space="preserve">4.1 Mô hình meta-analysis</w:t>
+        <w:t xml:space="preserve">3.4.1 Mô hình meta-analysis</w:t>
       </w:r>
     </w:p>
     <w:p>
@@ -1326,14 +1293,14 @@
         <w:t xml:space="preserve">: chuẩn meta-analysis trong quản trị chiến lược (Combs et al., 2011; Aguinis et al., 2011).</w:t>
       </w:r>
     </w:p>
-    <w:bookmarkEnd w:id="36"/>
-    <w:bookmarkStart w:id="37" w:name="X27365d5351c4f2028e401b959ec157ce9c1b5c2"/>
+    <w:bookmarkEnd w:id="33"/>
+    <w:bookmarkStart w:id="34" w:name="X91b9254fb543667278f4d6a826ba3dee0d78b94"/>
     <w:p>
       <w:pPr>
         <w:pStyle w:val="Heading3"/>
       </w:pPr>
       <w:r>
-        <w:t xml:space="preserve">4.2 Mô hình empirical — Tuyến tính cơ bản</w:t>
+        <w:t xml:space="preserve">3.4.2 Mô hình empirical — Tuyến tính cơ bản</w:t>
       </w:r>
     </w:p>
     <w:p>
@@ -1515,14 +1482,14 @@
         <w:t xml:space="preserve">là vector control variables.</w:t>
       </w:r>
     </w:p>
-    <w:bookmarkEnd w:id="37"/>
-    <w:bookmarkStart w:id="38" w:name="Xe9bba9a80ef10577157c3d15edb876549972c2d"/>
+    <w:bookmarkEnd w:id="34"/>
+    <w:bookmarkStart w:id="35" w:name="Xd036ade5cbc6fe7e16e65a122bd3e74624d8208"/>
     <w:p>
       <w:pPr>
         <w:pStyle w:val="Heading3"/>
       </w:pPr>
       <w:r>
-        <w:t xml:space="preserve">4.3 Mô hình phi tuyến (H1)</w:t>
+        <w:t xml:space="preserve">3.4.3 Mô hình phi tuyến (H1)</w:t>
       </w:r>
     </w:p>
     <w:p>
@@ -2137,28 +2104,27 @@
         <w:t xml:space="preserve">.</w:t>
       </w:r>
     </w:p>
-    <w:bookmarkEnd w:id="38"/>
-    <w:bookmarkStart w:id="41" w:name="X51b5e48835a9a5e2281d2341b4476bdb9f6a4ee"/>
+    <w:bookmarkEnd w:id="35"/>
+    <w:bookmarkStart w:id="36" w:name="X1770fb5e1eb3ddd0dda21d7e660ee6e6f352fa1"/>
     <w:p>
       <w:pPr>
         <w:pStyle w:val="Heading3"/>
       </w:pPr>
       <w:r>
-        <w:t xml:space="preserve">4.4 Mô hình moderation (H2–H6)</w:t>
-      </w:r>
-    </w:p>
-    <w:bookmarkStart w:id="39" w:name="two-way-interaction-h2-h3"/>
-    <w:p>
-      <w:pPr>
-        <w:pStyle w:val="Heading4"/>
-      </w:pPr>
-      <w:r>
-        <w:t xml:space="preserve">Two-way interaction (H2, H3)</w:t>
+        <w:t xml:space="preserve">3.4.4 Mô hình moderation (H2–H6)</w:t>
       </w:r>
     </w:p>
     <w:p>
       <w:pPr>
         <w:pStyle w:val="FirstParagraph"/>
+      </w:pPr>
+      <w:r>
+        <w:t xml:space="preserve">**Two-way interaction (H2, H3)</w:t>
+      </w:r>
+    </w:p>
+    <w:p>
+      <w:pPr>
+        <w:pStyle w:val="BodyText"/>
       </w:pPr>
       <m:oMathPara>
         <m:oMathParaPr>
@@ -2545,19 +2511,17 @@
         <w:t xml:space="preserve">là moderator (TCI hoặc DAI).</w:t>
       </w:r>
     </w:p>
-    <w:bookmarkEnd w:id="39"/>
-    <w:bookmarkStart w:id="40" w:name="three-way-interaction-synthesis"/>
-    <w:p>
-      <w:pPr>
-        <w:pStyle w:val="Heading4"/>
-      </w:pPr>
-      <w:r>
-        <w:t xml:space="preserve">Three-way interaction (synthesis)</w:t>
-      </w:r>
-    </w:p>
-    <w:p>
-      <w:pPr>
-        <w:pStyle w:val="FirstParagraph"/>
+    <w:p>
+      <w:pPr>
+        <w:pStyle w:val="BodyText"/>
+      </w:pPr>
+      <w:r>
+        <w:t xml:space="preserve">**Three-way interaction (synthesis)</w:t>
+      </w:r>
+    </w:p>
+    <w:p>
+      <w:pPr>
+        <w:pStyle w:val="BodyText"/>
       </w:pPr>
       <m:oMathPara>
         <m:oMathParaPr>
@@ -2933,15 +2897,14 @@
         <w:t xml:space="preserve">: three-way moderation digital × institutional × manager trong bối cảnh châu Á và Pacific với 47 nước chưa được kiểm định trước đây.</w:t>
       </w:r>
     </w:p>
-    <w:bookmarkEnd w:id="40"/>
-    <w:bookmarkEnd w:id="41"/>
-    <w:bookmarkStart w:id="42" w:name="Xb324e1905a61cd1592d7ebf92cf5cd7957d9e09"/>
+    <w:bookmarkEnd w:id="36"/>
+    <w:bookmarkStart w:id="37" w:name="Xaf6b17085c51fbfd36dab2a1029a4e6f9b0638d"/>
     <w:p>
       <w:pPr>
         <w:pStyle w:val="Heading3"/>
       </w:pPr>
       <w:r>
-        <w:t xml:space="preserve">4.5 Mô hình temporal heterogeneity (H6)</w:t>
+        <w:t xml:space="preserve">3.4.5 Mô hình temporal heterogeneity (H6)</w:t>
       </w:r>
     </w:p>
     <w:p>
@@ -3413,14 +3376,14 @@
         <w:t xml:space="preserve">: áp dụng cho China 2012 và 2024 để kiểm định stability của cubic turning point (~47,8% FSTS) sau hơn một thập kỷ chuyển đổi số.</w:t>
       </w:r>
     </w:p>
-    <w:bookmarkEnd w:id="42"/>
-    <w:bookmarkStart w:id="43" w:name="Xb935b07a7139bdf4772bb962fde35bc1f7deef3"/>
+    <w:bookmarkEnd w:id="37"/>
+    <w:bookmarkStart w:id="38" w:name="Xe9c37da457fcc384a1a2e7197bb3bb5235b6f8f"/>
     <w:p>
       <w:pPr>
         <w:pStyle w:val="Heading3"/>
       </w:pPr>
       <w:r>
-        <w:t xml:space="preserve">4.5.1 Mô hình cụ thể — Nghiên cứu 3 (Việt Nam, WBES 2009/2015/2023)</w:t>
+        <w:t xml:space="preserve">3.4.5.1 Mô hình cụ thể — Nghiên cứu 3 (Việt Nam, WBES 2009/2015/2023)</w:t>
       </w:r>
     </w:p>
     <w:p>
@@ -3435,7 +3398,7 @@
       <w:pPr>
         <w:numPr>
           <w:ilvl w:val="0"/>
-          <w:numId w:val="1004"/>
+          <w:numId w:val="1003"/>
         </w:numPr>
         <w:pStyle w:val="Compact"/>
       </w:pPr>
@@ -3457,7 +3420,7 @@
       <w:pPr>
         <w:numPr>
           <w:ilvl w:val="0"/>
-          <w:numId w:val="1004"/>
+          <w:numId w:val="1003"/>
         </w:numPr>
         <w:pStyle w:val="Compact"/>
       </w:pPr>
@@ -3479,7 +3442,7 @@
       <w:pPr>
         <w:numPr>
           <w:ilvl w:val="0"/>
-          <w:numId w:val="1004"/>
+          <w:numId w:val="1003"/>
         </w:numPr>
         <w:pStyle w:val="Compact"/>
       </w:pPr>
@@ -3501,7 +3464,7 @@
       <w:pPr>
         <w:numPr>
           <w:ilvl w:val="0"/>
-          <w:numId w:val="1004"/>
+          <w:numId w:val="1003"/>
         </w:numPr>
         <w:pStyle w:val="Compact"/>
       </w:pPr>
@@ -3523,7 +3486,7 @@
       <w:pPr>
         <w:numPr>
           <w:ilvl w:val="0"/>
-          <w:numId w:val="1004"/>
+          <w:numId w:val="1003"/>
         </w:numPr>
         <w:pStyle w:val="Compact"/>
       </w:pPr>
@@ -3545,7 +3508,7 @@
       <w:pPr>
         <w:numPr>
           <w:ilvl w:val="0"/>
-          <w:numId w:val="1004"/>
+          <w:numId w:val="1003"/>
         </w:numPr>
         <w:pStyle w:val="Compact"/>
       </w:pPr>
@@ -3564,7 +3527,7 @@
       <w:pPr>
         <w:numPr>
           <w:ilvl w:val="0"/>
-          <w:numId w:val="1004"/>
+          <w:numId w:val="1003"/>
         </w:numPr>
         <w:pStyle w:val="Compact"/>
       </w:pPr>
@@ -4944,7 +4907,7 @@
           <w:bCs/>
           <w:b/>
         </w:rPr>
-        <w:t xml:space="preserve">M4 — Điều tiết CSS/DAI (H4 thăm dò):</w:t>
+        <w:t xml:space="preserve">M4 — Điều tiết CSS/DAI (H3 thăm dò):</w:t>
       </w:r>
     </w:p>
     <w:p>
@@ -7083,7 +7046,7 @@
               <w:jc w:val="left"/>
             </w:pPr>
             <w:r>
-              <w:t xml:space="preserve">Số hoá Tier-1 (H4 thăm dò)</w:t>
+              <w:t xml:space="preserve">Số hoá Tier-1 (H3 thăm dò)</w:t>
             </w:r>
           </w:p>
         </w:tc>
@@ -7339,14 +7302,14 @@
         </w:tc>
       </w:tr>
     </w:tbl>
-    <w:bookmarkEnd w:id="43"/>
-    <w:bookmarkStart w:id="44" w:name="X1a84e23bcffcf0b809a67054bf546d98a0649dd"/>
+    <w:bookmarkEnd w:id="38"/>
+    <w:bookmarkStart w:id="39" w:name="Xc82b1aa0784a668aba43881d1c592a6ad08e5ee"/>
     <w:p>
       <w:pPr>
         <w:pStyle w:val="Heading3"/>
       </w:pPr>
       <w:r>
-        <w:t xml:space="preserve">4.5.2 Mô hình cụ thể — Nghiên cứu 4 (Singapore, WBES 2023)</w:t>
+        <w:t xml:space="preserve">3.4.5.2 Mô hình cụ thể — Nghiên cứu 4 (Singapore, WBES 2023)</w:t>
       </w:r>
     </w:p>
     <w:p>
@@ -7361,7 +7324,7 @@
       <w:pPr>
         <w:numPr>
           <w:ilvl w:val="0"/>
-          <w:numId w:val="1005"/>
+          <w:numId w:val="1004"/>
         </w:numPr>
         <w:pStyle w:val="Compact"/>
       </w:pPr>
@@ -7383,7 +7346,7 @@
       <w:pPr>
         <w:numPr>
           <w:ilvl w:val="0"/>
-          <w:numId w:val="1005"/>
+          <w:numId w:val="1004"/>
         </w:numPr>
         <w:pStyle w:val="Compact"/>
       </w:pPr>
@@ -7405,7 +7368,7 @@
       <w:pPr>
         <w:numPr>
           <w:ilvl w:val="0"/>
-          <w:numId w:val="1005"/>
+          <w:numId w:val="1004"/>
         </w:numPr>
         <w:pStyle w:val="Compact"/>
       </w:pPr>
@@ -7427,7 +7390,7 @@
       <w:pPr>
         <w:numPr>
           <w:ilvl w:val="0"/>
-          <w:numId w:val="1005"/>
+          <w:numId w:val="1004"/>
         </w:numPr>
         <w:pStyle w:val="Compact"/>
       </w:pPr>
@@ -7449,7 +7412,7 @@
       <w:pPr>
         <w:numPr>
           <w:ilvl w:val="0"/>
-          <w:numId w:val="1005"/>
+          <w:numId w:val="1004"/>
         </w:numPr>
         <w:pStyle w:val="Compact"/>
       </w:pPr>
@@ -7487,7 +7450,7 @@
       <w:pPr>
         <w:numPr>
           <w:ilvl w:val="0"/>
-          <w:numId w:val="1005"/>
+          <w:numId w:val="1004"/>
         </w:numPr>
         <w:pStyle w:val="Compact"/>
       </w:pPr>
@@ -7532,7 +7495,7 @@
       <w:pPr>
         <w:numPr>
           <w:ilvl w:val="0"/>
-          <w:numId w:val="1005"/>
+          <w:numId w:val="1004"/>
         </w:numPr>
         <w:pStyle w:val="Compact"/>
       </w:pPr>
@@ -7551,7 +7514,7 @@
       <w:pPr>
         <w:numPr>
           <w:ilvl w:val="0"/>
-          <w:numId w:val="1005"/>
+          <w:numId w:val="1004"/>
         </w:numPr>
         <w:pStyle w:val="Compact"/>
       </w:pPr>
@@ -8291,14 +8254,14 @@
         </w:pict>
       </w:r>
     </w:p>
-    <w:bookmarkEnd w:id="44"/>
-    <w:bookmarkStart w:id="45" w:name="X9ef80487c12e0f5dad14bc0925ba05bca166c52"/>
+    <w:bookmarkEnd w:id="39"/>
+    <w:bookmarkStart w:id="40" w:name="Xd7af671c66f92fda4c51769a4f141e153734d80"/>
     <w:p>
       <w:pPr>
         <w:pStyle w:val="Heading3"/>
       </w:pPr>
       <w:r>
-        <w:t xml:space="preserve">4.5.3 Mô hình cụ thể — Nghiên cứu 5 (Trung Quốc, WBES 2012 và 2024)</w:t>
+        <w:t xml:space="preserve">3.4.5.3 Mô hình cụ thể — Nghiên cứu 5 (Trung Quốc, WBES 2012 và 2024)</w:t>
       </w:r>
     </w:p>
     <w:p>
@@ -8313,7 +8276,7 @@
       <w:pPr>
         <w:numPr>
           <w:ilvl w:val="0"/>
-          <w:numId w:val="1006"/>
+          <w:numId w:val="1005"/>
         </w:numPr>
         <w:pStyle w:val="Compact"/>
       </w:pPr>
@@ -8335,7 +8298,7 @@
       <w:pPr>
         <w:numPr>
           <w:ilvl w:val="0"/>
-          <w:numId w:val="1006"/>
+          <w:numId w:val="1005"/>
         </w:numPr>
         <w:pStyle w:val="Compact"/>
       </w:pPr>
@@ -8357,7 +8320,7 @@
       <w:pPr>
         <w:numPr>
           <w:ilvl w:val="0"/>
-          <w:numId w:val="1006"/>
+          <w:numId w:val="1005"/>
         </w:numPr>
         <w:pStyle w:val="Compact"/>
       </w:pPr>
@@ -8379,7 +8342,7 @@
       <w:pPr>
         <w:numPr>
           <w:ilvl w:val="0"/>
-          <w:numId w:val="1006"/>
+          <w:numId w:val="1005"/>
         </w:numPr>
         <w:pStyle w:val="Compact"/>
       </w:pPr>
@@ -8401,7 +8364,7 @@
       <w:pPr>
         <w:numPr>
           <w:ilvl w:val="0"/>
-          <w:numId w:val="1006"/>
+          <w:numId w:val="1005"/>
         </w:numPr>
         <w:pStyle w:val="Compact"/>
       </w:pPr>
@@ -8446,7 +8409,7 @@
       <w:pPr>
         <w:numPr>
           <w:ilvl w:val="0"/>
-          <w:numId w:val="1006"/>
+          <w:numId w:val="1005"/>
         </w:numPr>
         <w:pStyle w:val="Compact"/>
       </w:pPr>
@@ -9252,14 +9215,14 @@
         </w:pict>
       </w:r>
     </w:p>
-    <w:bookmarkEnd w:id="45"/>
-    <w:bookmarkStart w:id="46" w:name="X4e8b67ecad9724beebae0d23d08617f128f911b"/>
+    <w:bookmarkEnd w:id="40"/>
+    <w:bookmarkStart w:id="42" w:name="Xd325577eb4b3aeedca208ff99575fa4709eddc8"/>
     <w:p>
       <w:pPr>
         <w:pStyle w:val="Heading3"/>
       </w:pPr>
       <w:r>
-        <w:t xml:space="preserve">4.5.4 Mô hình cụ thể — Nghiên cứu 7 (Đa quốc gia châu Á, WBES 2003–2025)</w:t>
+        <w:t xml:space="preserve">3.4.5.4 Mô hình cụ thể — Nghiên cứu 7 (Đa quốc gia châu Á, WBES 2003–2025)</w:t>
       </w:r>
     </w:p>
     <w:p>
@@ -9290,7 +9253,7 @@
       <w:pPr>
         <w:numPr>
           <w:ilvl w:val="0"/>
-          <w:numId w:val="1007"/>
+          <w:numId w:val="1006"/>
         </w:numPr>
         <w:pStyle w:val="Compact"/>
       </w:pPr>
@@ -9309,7 +9272,7 @@
       <w:pPr>
         <w:numPr>
           <w:ilvl w:val="0"/>
-          <w:numId w:val="1007"/>
+          <w:numId w:val="1006"/>
         </w:numPr>
         <w:pStyle w:val="Compact"/>
       </w:pPr>
@@ -9328,7 +9291,7 @@
       <w:pPr>
         <w:numPr>
           <w:ilvl w:val="0"/>
-          <w:numId w:val="1007"/>
+          <w:numId w:val="1006"/>
         </w:numPr>
         <w:pStyle w:val="Compact"/>
       </w:pPr>
@@ -9347,7 +9310,7 @@
       <w:pPr>
         <w:numPr>
           <w:ilvl w:val="0"/>
-          <w:numId w:val="1007"/>
+          <w:numId w:val="1006"/>
         </w:numPr>
         <w:pStyle w:val="Compact"/>
       </w:pPr>
@@ -9366,7 +9329,7 @@
       <w:pPr>
         <w:numPr>
           <w:ilvl w:val="0"/>
-          <w:numId w:val="1007"/>
+          <w:numId w:val="1006"/>
         </w:numPr>
         <w:pStyle w:val="Compact"/>
       </w:pPr>
@@ -9385,7 +9348,7 @@
       <w:pPr>
         <w:numPr>
           <w:ilvl w:val="0"/>
-          <w:numId w:val="1007"/>
+          <w:numId w:val="1006"/>
         </w:numPr>
         <w:pStyle w:val="Compact"/>
       </w:pPr>
@@ -9404,7 +9367,7 @@
       <w:pPr>
         <w:numPr>
           <w:ilvl w:val="0"/>
-          <w:numId w:val="1007"/>
+          <w:numId w:val="1006"/>
         </w:numPr>
         <w:pStyle w:val="Compact"/>
       </w:pPr>
@@ -9423,7 +9386,7 @@
       <w:pPr>
         <w:numPr>
           <w:ilvl w:val="0"/>
-          <w:numId w:val="1007"/>
+          <w:numId w:val="1006"/>
         </w:numPr>
         <w:pStyle w:val="Compact"/>
       </w:pPr>
@@ -9442,7 +9405,7 @@
       <w:pPr>
         <w:numPr>
           <w:ilvl w:val="0"/>
-          <w:numId w:val="1007"/>
+          <w:numId w:val="1006"/>
         </w:numPr>
         <w:pStyle w:val="Compact"/>
       </w:pPr>
@@ -9461,7 +9424,7 @@
       <w:pPr>
         <w:numPr>
           <w:ilvl w:val="0"/>
-          <w:numId w:val="1007"/>
+          <w:numId w:val="1006"/>
         </w:numPr>
         <w:pStyle w:val="Compact"/>
       </w:pPr>
@@ -9480,7 +9443,7 @@
       <w:pPr>
         <w:numPr>
           <w:ilvl w:val="0"/>
-          <w:numId w:val="1007"/>
+          <w:numId w:val="1006"/>
         </w:numPr>
         <w:pStyle w:val="Compact"/>
       </w:pPr>
@@ -9499,7 +9462,7 @@
       <w:pPr>
         <w:numPr>
           <w:ilvl w:val="0"/>
-          <w:numId w:val="1007"/>
+          <w:numId w:val="1006"/>
         </w:numPr>
         <w:pStyle w:val="Compact"/>
       </w:pPr>
@@ -13973,14 +13936,3113 @@
         </w:pict>
       </w:r>
     </w:p>
-    <w:bookmarkEnd w:id="46"/>
-    <w:bookmarkStart w:id="47" w:name="X6ef7915cef2320d0a5a0851ec4b4441ab8af223"/>
+    <w:bookmarkStart w:id="41" w:name="X4a5526e778224b6984af319ac51111aa01114f7"/>
+    <w:p>
+      <w:pPr>
+        <w:pStyle w:val="Heading4"/>
+      </w:pPr>
+      <w:r>
+        <w:t xml:space="preserve">3.4.5.5 Mô hình cụ thể — Nghiên cứu 8: Pacific SIDS (N = 1.469, Nhóm VI)</w:t>
+      </w:r>
+    </w:p>
+    <w:p>
+      <w:pPr>
+        <w:pStyle w:val="FirstParagraph"/>
+      </w:pPr>
+      <w:r>
+        <w:t xml:space="preserve">Nghiên cứu 8 phân tích mẫu gồm</w:t>
+      </w:r>
+      <w:r>
+        <w:t xml:space="preserve"> </w:t>
+      </w:r>
+      <w:r>
+        <w:rPr>
+          <w:bCs/>
+          <w:b/>
+        </w:rPr>
+        <w:t xml:space="preserve">N = 1.469 doanh nghiệp</w:t>
+      </w:r>
+      <w:r>
+        <w:t xml:space="preserve"> </w:t>
+      </w:r>
+      <w:r>
+        <w:t xml:space="preserve">tại</w:t>
+      </w:r>
+      <w:r>
+        <w:t xml:space="preserve"> </w:t>
+      </w:r>
+      <w:r>
+        <w:rPr>
+          <w:bCs/>
+          <w:b/>
+        </w:rPr>
+        <w:t xml:space="preserve">9 nền kinh tế Pacific SIDS</w:t>
+      </w:r>
+      <w:r>
+        <w:t xml:space="preserve"> </w:t>
+      </w:r>
+      <w:r>
+        <w:t xml:space="preserve">(Fiji, Papua New Guinea, Samoa, Solomon Islands, Timor-Leste, Tonga, Vanuatu, và các đảo nhỏ khác) từ các sóng WBES 2009–2025. Đây là nhóm thể chế ICRV Nhóm VI — cấp thấp nhất trong phân loại 6 chế độ — đặc trưng bởi thị trường nội địa cực nhỏ, chi phí thương mại cao và hỗ trợ thể chế yếu. Trong tổng mẫu, chỉ</w:t>
+      </w:r>
+      <w:r>
+        <w:t xml:space="preserve"> </w:t>
+      </w:r>
+      <w:r>
+        <w:rPr>
+          <w:bCs/>
+          <w:b/>
+        </w:rPr>
+        <w:t xml:space="preserve">187 doanh nghiệp có hoạt động xuất khẩu</w:t>
+      </w:r>
+      <w:r>
+        <w:t xml:space="preserve"> </w:t>
+      </w:r>
+      <w:r>
+        <w:t xml:space="preserve">(12,7%), phản ánh cấu trúc thị trường đảo nhỏ.</w:t>
+      </w:r>
+    </w:p>
+    <w:p>
+      <w:pPr>
+        <w:pStyle w:val="BodyText"/>
+      </w:pPr>
+      <w:r>
+        <w:t xml:space="preserve">Phát hiện trọng tâm:</w:t>
+      </w:r>
+      <w:r>
+        <w:t xml:space="preserve"> </w:t>
+      </w:r>
+      <w:r>
+        <w:rPr>
+          <w:bCs/>
+          <w:b/>
+        </w:rPr>
+        <w:t xml:space="preserve">gánh nặng quốc tế hóa bắt buộc (Forced Internationalization Penalty — FIP)</w:t>
+      </w:r>
+      <w:r>
+        <w:t xml:space="preserve"> </w:t>
+      </w:r>
+      <w:r>
+        <w:t xml:space="preserve">— mối quan hệ quốc tế hóa–hiệu quả là</w:t>
+      </w:r>
+      <w:r>
+        <w:t xml:space="preserve"> </w:t>
+      </w:r>
+      <w:r>
+        <w:rPr>
+          <w:bCs/>
+          <w:b/>
+        </w:rPr>
+        <w:t xml:space="preserve">đơn điệu âm</w:t>
+      </w:r>
+      <w:r>
+        <w:t xml:space="preserve"> </w:t>
+      </w:r>
+      <w:r>
+        <w:t xml:space="preserve">tại Nhóm VI, trái ngược với hình chữ U ngược được quan sát ở P3–P7. Lind–Mehlum U-test không bác bỏ đơn điệu (p &gt; ,10), xác nhận không có điểm quay.</w:t>
+      </w:r>
+    </w:p>
+    <w:p>
+      <w:pPr>
+        <w:pStyle w:val="BodyText"/>
+      </w:pPr>
+      <w:r>
+        <w:rPr>
+          <w:bCs/>
+          <w:b/>
+        </w:rPr>
+        <w:t xml:space="preserve">Ký hiệu biến (tiếng Việt ↔ mã WBES):</w:t>
+      </w:r>
+    </w:p>
+    <w:tbl>
+      <w:tblPr>
+        <w:tblStyle w:val="Table"/>
+        <w:tblW w:type="auto" w:w="0"/>
+        <w:tblLook w:firstRow="1" w:lastRow="0" w:firstColumn="0" w:lastColumn="0" w:noHBand="0" w:noVBand="0" w:val="0020"/>
+        <w:jc w:val="start"/>
+      </w:tblPr>
+      <w:tblGrid>
+        <w:gridCol w:w="1980"/>
+        <w:gridCol w:w="1980"/>
+        <w:gridCol w:w="1980"/>
+        <w:gridCol w:w="1980"/>
+      </w:tblGrid>
+      <w:tr>
+        <w:trPr>
+          <w:tblHeader w:val="true"/>
+        </w:trPr>
+        <w:tc>
+          <w:tcPr/>
+          <w:p>
+            <w:pPr>
+              <w:pStyle w:val="Compact"/>
+              <w:jc w:val="left"/>
+            </w:pPr>
+            <w:r>
+              <w:t xml:space="preserve">Ký hiệu</w:t>
+            </w:r>
+          </w:p>
+        </w:tc>
+        <w:tc>
+          <w:tcPr/>
+          <w:p>
+            <w:pPr>
+              <w:pStyle w:val="Compact"/>
+              <w:jc w:val="left"/>
+            </w:pPr>
+            <w:r>
+              <w:t xml:space="preserve">Tên tiếng Việt</w:t>
+            </w:r>
+          </w:p>
+        </w:tc>
+        <w:tc>
+          <w:tcPr/>
+          <w:p>
+            <w:pPr>
+              <w:pStyle w:val="Compact"/>
+              <w:jc w:val="left"/>
+            </w:pPr>
+            <w:r>
+              <w:t xml:space="preserve">Mã WBES</w:t>
+            </w:r>
+          </w:p>
+        </w:tc>
+        <w:tc>
+          <w:tcPr/>
+          <w:p>
+            <w:pPr>
+              <w:pStyle w:val="Compact"/>
+              <w:jc w:val="left"/>
+            </w:pPr>
+            <w:r>
+              <w:t xml:space="preserve">Cách tính</w:t>
+            </w:r>
+          </w:p>
+        </w:tc>
+      </w:tr>
+      <w:tr>
+        <w:tc>
+          <w:tcPr/>
+          <w:p>
+            <w:pPr>
+              <w:pStyle w:val="Compact"/>
+              <w:jc w:val="left"/>
+            </w:pPr>
+            <w:r>
+              <w:t xml:space="preserve">lnNSLD</w:t>
+            </w:r>
+          </w:p>
+        </w:tc>
+        <w:tc>
+          <w:tcPr/>
+          <w:p>
+            <w:pPr>
+              <w:pStyle w:val="Compact"/>
+              <w:jc w:val="left"/>
+            </w:pPr>
+            <w:r>
+              <w:t xml:space="preserve">Log năng suất lao động</w:t>
+            </w:r>
+          </w:p>
+        </w:tc>
+        <w:tc>
+          <w:tcPr/>
+          <w:p>
+            <w:pPr>
+              <w:pStyle w:val="Compact"/>
+              <w:jc w:val="left"/>
+            </w:pPr>
+            <w:r>
+              <w:t xml:space="preserve">d2, l1</w:t>
+            </w:r>
+          </w:p>
+        </w:tc>
+        <w:tc>
+          <w:tcPr/>
+          <w:p>
+            <w:pPr>
+              <w:pStyle w:val="Compact"/>
+              <w:jc w:val="left"/>
+            </w:pPr>
+            <w:r>
+              <w:t xml:space="preserve">ln(doanh thu PPP / lao động thường trực)</w:t>
+            </w:r>
+          </w:p>
+        </w:tc>
+      </w:tr>
+      <w:tr>
+        <w:tc>
+          <w:tcPr/>
+          <w:p>
+            <w:pPr>
+              <w:pStyle w:val="Compact"/>
+              <w:jc w:val="left"/>
+            </w:pPr>
+            <w:r>
+              <w:t xml:space="preserve">CDDXK_c</w:t>
+            </w:r>
+          </w:p>
+        </w:tc>
+        <w:tc>
+          <w:tcPr/>
+          <w:p>
+            <w:pPr>
+              <w:pStyle w:val="Compact"/>
+              <w:jc w:val="left"/>
+            </w:pPr>
+            <w:r>
+              <w:t xml:space="preserve">Cường độ xuất khẩu (điều chỉnh)</w:t>
+            </w:r>
+          </w:p>
+        </w:tc>
+        <w:tc>
+          <w:tcPr/>
+          <w:p>
+            <w:pPr>
+              <w:pStyle w:val="Compact"/>
+              <w:jc w:val="left"/>
+            </w:pPr>
+            <w:r>
+              <w:t xml:space="preserve">d3c</w:t>
+            </w:r>
+          </w:p>
+        </w:tc>
+        <w:tc>
+          <w:tcPr/>
+          <w:p>
+            <w:pPr>
+              <w:pStyle w:val="Compact"/>
+              <w:jc w:val="left"/>
+            </w:pPr>
+            <w:r>
+              <w:t xml:space="preserve">(d3c/100) − mean_wave(FSTS): centred theo sóng</w:t>
+            </w:r>
+          </w:p>
+        </w:tc>
+      </w:tr>
+      <w:tr>
+        <w:tc>
+          <w:tcPr/>
+          <w:p>
+            <w:pPr>
+              <w:pStyle w:val="Compact"/>
+              <w:jc w:val="left"/>
+            </w:pPr>
+            <w:r>
+              <w:t xml:space="preserve">CDDXK_c²</w:t>
+            </w:r>
+          </w:p>
+        </w:tc>
+        <w:tc>
+          <w:tcPr/>
+          <w:p>
+            <w:pPr>
+              <w:pStyle w:val="Compact"/>
+              <w:jc w:val="left"/>
+            </w:pPr>
+            <w:r>
+              <w:t xml:space="preserve">CDDXK_c bình phương</w:t>
+            </w:r>
+          </w:p>
+        </w:tc>
+        <w:tc>
+          <w:tcPr/>
+          <w:p>
+            <w:pPr>
+              <w:pStyle w:val="Compact"/>
+              <w:jc w:val="left"/>
+            </w:pPr>
+            <w:r>
+              <w:t xml:space="preserve">d3c</w:t>
+            </w:r>
+          </w:p>
+        </w:tc>
+        <w:tc>
+          <w:tcPr/>
+          <w:p>
+            <w:pPr>
+              <w:pStyle w:val="Compact"/>
+              <w:jc w:val="left"/>
+            </w:pPr>
+            <w:r>
+              <w:t xml:space="preserve">CDDXK_c × CDDXK_c</w:t>
+            </w:r>
+          </w:p>
+        </w:tc>
+      </w:tr>
+      <w:tr>
+        <w:tc>
+          <w:tcPr/>
+          <w:p>
+            <w:pPr>
+              <w:pStyle w:val="Compact"/>
+              <w:jc w:val="left"/>
+            </w:pPr>
+            <w:r>
+              <w:t xml:space="preserve">NLCN_z</w:t>
+            </w:r>
+          </w:p>
+        </w:tc>
+        <w:tc>
+          <w:tcPr/>
+          <w:p>
+            <w:pPr>
+              <w:pStyle w:val="Compact"/>
+              <w:jc w:val="left"/>
+            </w:pPr>
+            <w:r>
+              <w:t xml:space="preserve">Năng lực công nghệ</w:t>
+            </w:r>
+          </w:p>
+        </w:tc>
+        <w:tc>
+          <w:tcPr/>
+          <w:p>
+            <w:pPr>
+              <w:pStyle w:val="Compact"/>
+              <w:jc w:val="left"/>
+            </w:pPr>
+            <w:r>
+              <w:t xml:space="preserve">b8, e6</w:t>
+            </w:r>
+          </w:p>
+        </w:tc>
+        <w:tc>
+          <w:tcPr/>
+          <w:p>
+            <w:pPr>
+              <w:pStyle w:val="Compact"/>
+              <w:jc w:val="left"/>
+            </w:pPr>
+            <w:r>
+              <w:t xml:space="preserve">z-std(trung bình cert chất lượng + CN nước ngoài)</w:t>
+            </w:r>
+          </w:p>
+        </w:tc>
+      </w:tr>
+      <w:tr>
+        <w:tc>
+          <w:tcPr/>
+          <w:p>
+            <w:pPr>
+              <w:pStyle w:val="Compact"/>
+              <w:jc w:val="left"/>
+            </w:pPr>
+            <w:r>
+              <w:t xml:space="preserve">CSS_z</w:t>
+            </w:r>
+          </w:p>
+        </w:tc>
+        <w:tc>
+          <w:tcPr/>
+          <w:p>
+            <w:pPr>
+              <w:pStyle w:val="Compact"/>
+              <w:jc w:val="left"/>
+            </w:pPr>
+            <w:r>
+              <w:t xml:space="preserve">Chỉ số số hoá (Tier-1)</w:t>
+            </w:r>
+          </w:p>
+        </w:tc>
+        <w:tc>
+          <w:tcPr/>
+          <w:p>
+            <w:pPr>
+              <w:pStyle w:val="Compact"/>
+              <w:jc w:val="left"/>
+            </w:pPr>
+            <w:r>
+              <w:t xml:space="preserve">c22b</w:t>
+            </w:r>
+          </w:p>
+        </w:tc>
+        <w:tc>
+          <w:tcPr/>
+          <w:p>
+            <w:pPr>
+              <w:pStyle w:val="Compact"/>
+              <w:jc w:val="left"/>
+            </w:pPr>
+            <w:r>
+              <w:t xml:space="preserve">z-std(website binary):</w:t>
+            </w:r>
+            <w:r>
+              <w:t xml:space="preserve"> </w:t>
+            </w:r>
+            <w:r>
+              <w:rPr>
+                <w:bCs/>
+                <w:b/>
+              </w:rPr>
+              <w:t xml:space="preserve">chỉ Tier-1, không dynamic</w:t>
+            </w:r>
+          </w:p>
+        </w:tc>
+      </w:tr>
+      <w:tr>
+        <w:tc>
+          <w:tcPr/>
+          <w:p>
+            <w:pPr>
+              <w:pStyle w:val="Compact"/>
+              <w:jc w:val="left"/>
+            </w:pPr>
+            <w:r>
+              <w:t xml:space="preserve">lnLD</w:t>
+            </w:r>
+          </w:p>
+        </w:tc>
+        <w:tc>
+          <w:tcPr/>
+          <w:p>
+            <w:pPr>
+              <w:pStyle w:val="Compact"/>
+              <w:jc w:val="left"/>
+            </w:pPr>
+            <w:r>
+              <w:t xml:space="preserve">Log quy mô lao động</w:t>
+            </w:r>
+          </w:p>
+        </w:tc>
+        <w:tc>
+          <w:tcPr/>
+          <w:p>
+            <w:pPr>
+              <w:pStyle w:val="Compact"/>
+              <w:jc w:val="left"/>
+            </w:pPr>
+            <w:r>
+              <w:t xml:space="preserve">l1</w:t>
+            </w:r>
+          </w:p>
+        </w:tc>
+        <w:tc>
+          <w:tcPr/>
+          <w:p>
+            <w:pPr>
+              <w:pStyle w:val="Compact"/>
+              <w:jc w:val="left"/>
+            </w:pPr>
+            <w:r>
+              <w:t xml:space="preserve">ln(lao động thường trực)</w:t>
+            </w:r>
+          </w:p>
+        </w:tc>
+      </w:tr>
+      <w:tr>
+        <w:tc>
+          <w:tcPr/>
+          <w:p>
+            <w:pPr>
+              <w:pStyle w:val="Compact"/>
+              <w:jc w:val="left"/>
+            </w:pPr>
+            <w:r>
+              <w:t xml:space="preserve">TuoiDN</w:t>
+            </w:r>
+          </w:p>
+        </w:tc>
+        <w:tc>
+          <w:tcPr/>
+          <w:p>
+            <w:pPr>
+              <w:pStyle w:val="Compact"/>
+              <w:jc w:val="left"/>
+            </w:pPr>
+            <w:r>
+              <w:t xml:space="preserve">Tuổi doanh nghiệp</w:t>
+            </w:r>
+          </w:p>
+        </w:tc>
+        <w:tc>
+          <w:tcPr/>
+          <w:p>
+            <w:pPr>
+              <w:pStyle w:val="Compact"/>
+              <w:jc w:val="left"/>
+            </w:pPr>
+            <w:r>
+              <w:t xml:space="preserve">b5</w:t>
+            </w:r>
+          </w:p>
+        </w:tc>
+        <w:tc>
+          <w:tcPr/>
+          <w:p>
+            <w:pPr>
+              <w:pStyle w:val="Compact"/>
+              <w:jc w:val="left"/>
+            </w:pPr>
+            <w:r>
+              <w:t xml:space="preserve">năm_khảo_sát − b5</w:t>
+            </w:r>
+          </w:p>
+        </w:tc>
+      </w:tr>
+      <w:tr>
+        <w:tc>
+          <w:tcPr/>
+          <w:p>
+            <w:pPr>
+              <w:pStyle w:val="Compact"/>
+              <w:jc w:val="left"/>
+            </w:pPr>
+            <w:r>
+              <w:t xml:space="preserve">SoHuuNN</w:t>
+            </w:r>
+          </w:p>
+        </w:tc>
+        <w:tc>
+          <w:tcPr/>
+          <w:p>
+            <w:pPr>
+              <w:pStyle w:val="Compact"/>
+              <w:jc w:val="left"/>
+            </w:pPr>
+            <w:r>
+              <w:t xml:space="preserve">Tỷ lệ sở hữu nước ngoài</w:t>
+            </w:r>
+          </w:p>
+        </w:tc>
+        <w:tc>
+          <w:tcPr/>
+          <w:p>
+            <w:pPr>
+              <w:pStyle w:val="Compact"/>
+              <w:jc w:val="left"/>
+            </w:pPr>
+            <w:r>
+              <w:t xml:space="preserve">b6a</w:t>
+            </w:r>
+          </w:p>
+        </w:tc>
+        <w:tc>
+          <w:tcPr/>
+          <w:p>
+            <w:pPr>
+              <w:pStyle w:val="Compact"/>
+              <w:jc w:val="left"/>
+            </w:pPr>
+            <w:r>
+              <w:t xml:space="preserve">tỷ lệ 0–1</w:t>
+            </w:r>
+          </w:p>
+        </w:tc>
+      </w:tr>
+      <w:tr>
+        <w:tc>
+          <w:tcPr/>
+          <w:p>
+            <w:pPr>
+              <w:pStyle w:val="Compact"/>
+              <w:jc w:val="left"/>
+            </w:pPr>
+            <w:r>
+              <w:t xml:space="preserve">δ_c</w:t>
+            </w:r>
+          </w:p>
+        </w:tc>
+        <w:tc>
+          <w:tcPr/>
+          <w:p>
+            <w:pPr>
+              <w:pStyle w:val="Compact"/>
+              <w:jc w:val="left"/>
+            </w:pPr>
+            <w:r>
+              <w:t xml:space="preserve">Country fixed effects</w:t>
+            </w:r>
+          </w:p>
+        </w:tc>
+        <w:tc>
+          <w:tcPr/>
+          <w:p>
+            <w:pPr>
+              <w:pStyle w:val="Compact"/>
+              <w:jc w:val="left"/>
+            </w:pPr>
+            <w:r>
+              <w:t xml:space="preserve">a3b</w:t>
+            </w:r>
+          </w:p>
+        </w:tc>
+        <w:tc>
+          <w:tcPr/>
+          <w:p>
+            <w:pPr>
+              <w:pStyle w:val="Compact"/>
+              <w:jc w:val="left"/>
+            </w:pPr>
+            <w:r>
+              <w:t xml:space="preserve">dummy theo quốc gia</w:t>
+            </w:r>
+          </w:p>
+        </w:tc>
+      </w:tr>
+      <w:tr>
+        <w:tc>
+          <w:tcPr/>
+          <w:p>
+            <w:pPr>
+              <w:pStyle w:val="Compact"/>
+              <w:jc w:val="left"/>
+            </w:pPr>
+            <w:r>
+              <w:t xml:space="preserve">λ_t</w:t>
+            </w:r>
+          </w:p>
+        </w:tc>
+        <w:tc>
+          <w:tcPr/>
+          <w:p>
+            <w:pPr>
+              <w:pStyle w:val="Compact"/>
+              <w:jc w:val="left"/>
+            </w:pPr>
+            <w:r>
+              <w:t xml:space="preserve">Wave fixed effects</w:t>
+            </w:r>
+          </w:p>
+        </w:tc>
+        <w:tc>
+          <w:tcPr/>
+          <w:p>
+            <w:pPr>
+              <w:pStyle w:val="Compact"/>
+              <w:jc w:val="left"/>
+            </w:pPr>
+            <w:r>
+              <w:t xml:space="preserve">wave</w:t>
+            </w:r>
+          </w:p>
+        </w:tc>
+        <w:tc>
+          <w:tcPr/>
+          <w:p>
+            <w:pPr>
+              <w:pStyle w:val="Compact"/>
+              <w:jc w:val="left"/>
+            </w:pPr>
+            <w:r>
+              <w:t xml:space="preserve">dummy theo sóng điều tra</w:t>
+            </w:r>
+          </w:p>
+        </w:tc>
+      </w:tr>
+    </w:tbl>
+    <w:p>
+      <w:pPr>
+        <w:pStyle w:val="BodyText"/>
+      </w:pPr>
+      <w:r>
+        <w:rPr>
+          <w:iCs/>
+          <w:i/>
+        </w:rPr>
+        <w:t xml:space="preserve">Ghi chú: CSS_z (DAI) là proxy tĩnh Tier-1 (website binary c22b). WBES không thu thập đủ thang đo cho số hoá động tại các đảo nhỏ — KHÔNG gọi là "năng lực số hoá động".</w:t>
+      </w:r>
+    </w:p>
+    <w:p>
+      <w:pPr>
+        <w:pStyle w:val="BodyText"/>
+      </w:pPr>
+      <w:r>
+        <w:rPr>
+          <w:bCs/>
+          <w:b/>
+        </w:rPr>
+        <w:t xml:space="preserve">Chuỗi mô hình M0–M3 (P8):</w:t>
+      </w:r>
+    </w:p>
+    <w:p>
+      <w:pPr>
+        <w:pStyle w:val="BodyText"/>
+      </w:pPr>
+      <w:r>
+        <w:t xml:space="preserve">M0 — Baseline kiểm soát:</w:t>
+      </w:r>
+    </w:p>
+    <w:p>
+      <w:pPr>
+        <w:pStyle w:val="BodyText"/>
+      </w:pPr>
+      <m:oMathPara>
+        <m:oMathParaPr>
+          <m:jc m:val="center"/>
+        </m:oMathParaPr>
+        <m:oMath>
+          <m:r>
+            <m:t>l</m:t>
+          </m:r>
+          <m:r>
+            <m:t>n</m:t>
+          </m:r>
+          <m:r>
+            <m:t>N</m:t>
+          </m:r>
+          <m:r>
+            <m:t>S</m:t>
+          </m:r>
+          <m:r>
+            <m:t>L</m:t>
+          </m:r>
+          <m:sSub>
+            <m:e>
+              <m:r>
+                <m:t>D</m:t>
+              </m:r>
+            </m:e>
+            <m:sub>
+              <m:r>
+                <m:t>i</m:t>
+              </m:r>
+              <m:r>
+                <m:t>t</m:t>
+              </m:r>
+            </m:sub>
+          </m:sSub>
+          <m:r>
+            <m:rPr>
+              <m:sty m:val="p"/>
+            </m:rPr>
+            <m:t>=</m:t>
+          </m:r>
+          <m:r>
+            <m:t>α</m:t>
+          </m:r>
+          <m:r>
+            <m:rPr>
+              <m:sty m:val="p"/>
+            </m:rPr>
+            <m:t>+</m:t>
+          </m:r>
+          <m:sSub>
+            <m:e>
+              <m:r>
+                <m:t>γ</m:t>
+              </m:r>
+            </m:e>
+            <m:sub>
+              <m:r>
+                <m:t>1</m:t>
+              </m:r>
+            </m:sub>
+          </m:sSub>
+          <m:r>
+            <m:t>l</m:t>
+          </m:r>
+          <m:r>
+            <m:t>n</m:t>
+          </m:r>
+          <m:r>
+            <m:t>L</m:t>
+          </m:r>
+          <m:sSub>
+            <m:e>
+              <m:r>
+                <m:t>D</m:t>
+              </m:r>
+            </m:e>
+            <m:sub>
+              <m:r>
+                <m:t>i</m:t>
+              </m:r>
+              <m:r>
+                <m:t>t</m:t>
+              </m:r>
+            </m:sub>
+          </m:sSub>
+          <m:r>
+            <m:rPr>
+              <m:sty m:val="p"/>
+            </m:rPr>
+            <m:t>+</m:t>
+          </m:r>
+          <m:sSub>
+            <m:e>
+              <m:r>
+                <m:t>γ</m:t>
+              </m:r>
+            </m:e>
+            <m:sub>
+              <m:r>
+                <m:t>2</m:t>
+              </m:r>
+            </m:sub>
+          </m:sSub>
+          <m:r>
+            <m:t>T</m:t>
+          </m:r>
+          <m:r>
+            <m:t>u</m:t>
+          </m:r>
+          <m:r>
+            <m:t>o</m:t>
+          </m:r>
+          <m:r>
+            <m:t>i</m:t>
+          </m:r>
+          <m:r>
+            <m:t>D</m:t>
+          </m:r>
+          <m:sSub>
+            <m:e>
+              <m:r>
+                <m:t>N</m:t>
+              </m:r>
+            </m:e>
+            <m:sub>
+              <m:r>
+                <m:t>i</m:t>
+              </m:r>
+              <m:r>
+                <m:t>t</m:t>
+              </m:r>
+            </m:sub>
+          </m:sSub>
+          <m:r>
+            <m:rPr>
+              <m:sty m:val="p"/>
+            </m:rPr>
+            <m:t>+</m:t>
+          </m:r>
+          <m:sSub>
+            <m:e>
+              <m:r>
+                <m:t>γ</m:t>
+              </m:r>
+            </m:e>
+            <m:sub>
+              <m:r>
+                <m:t>3</m:t>
+              </m:r>
+            </m:sub>
+          </m:sSub>
+          <m:r>
+            <m:t>S</m:t>
+          </m:r>
+          <m:r>
+            <m:t>o</m:t>
+          </m:r>
+          <m:r>
+            <m:t>H</m:t>
+          </m:r>
+          <m:r>
+            <m:t>u</m:t>
+          </m:r>
+          <m:r>
+            <m:t>u</m:t>
+          </m:r>
+          <m:r>
+            <m:t>N</m:t>
+          </m:r>
+          <m:sSub>
+            <m:e>
+              <m:r>
+                <m:t>N</m:t>
+              </m:r>
+            </m:e>
+            <m:sub>
+              <m:r>
+                <m:t>i</m:t>
+              </m:r>
+              <m:r>
+                <m:t>t</m:t>
+              </m:r>
+            </m:sub>
+          </m:sSub>
+          <m:r>
+            <m:rPr>
+              <m:sty m:val="p"/>
+            </m:rPr>
+            <m:t>+</m:t>
+          </m:r>
+          <m:sSub>
+            <m:e>
+              <m:r>
+                <m:t>δ</m:t>
+              </m:r>
+            </m:e>
+            <m:sub>
+              <m:r>
+                <m:t>c</m:t>
+              </m:r>
+            </m:sub>
+          </m:sSub>
+          <m:r>
+            <m:rPr>
+              <m:sty m:val="p"/>
+            </m:rPr>
+            <m:t>+</m:t>
+          </m:r>
+          <m:sSub>
+            <m:e>
+              <m:r>
+                <m:t>λ</m:t>
+              </m:r>
+            </m:e>
+            <m:sub>
+              <m:r>
+                <m:t>t</m:t>
+              </m:r>
+            </m:sub>
+          </m:sSub>
+          <m:r>
+            <m:rPr>
+              <m:sty m:val="p"/>
+            </m:rPr>
+            <m:t>+</m:t>
+          </m:r>
+          <m:sSub>
+            <m:e>
+              <m:r>
+                <m:t>ε</m:t>
+              </m:r>
+            </m:e>
+            <m:sub>
+              <m:r>
+                <m:t>i</m:t>
+              </m:r>
+              <m:r>
+                <m:t>t</m:t>
+              </m:r>
+            </m:sub>
+          </m:sSub>
+        </m:oMath>
+      </m:oMathPara>
+    </w:p>
+    <w:p>
+      <w:pPr>
+        <w:pStyle w:val="FirstParagraph"/>
+      </w:pPr>
+      <w:r>
+        <w:t xml:space="preserve">M1 — Kiểm định FIP (H1b): thêm cường độ xuất khẩu tuyến tính</w:t>
+      </w:r>
+    </w:p>
+    <w:p>
+      <w:pPr>
+        <w:pStyle w:val="BodyText"/>
+      </w:pPr>
+      <m:oMathPara>
+        <m:oMathParaPr>
+          <m:jc m:val="center"/>
+        </m:oMathParaPr>
+        <m:oMath>
+          <m:r>
+            <m:t>l</m:t>
+          </m:r>
+          <m:r>
+            <m:t>n</m:t>
+          </m:r>
+          <m:r>
+            <m:t>N</m:t>
+          </m:r>
+          <m:r>
+            <m:t>S</m:t>
+          </m:r>
+          <m:r>
+            <m:t>L</m:t>
+          </m:r>
+          <m:sSub>
+            <m:e>
+              <m:r>
+                <m:t>D</m:t>
+              </m:r>
+            </m:e>
+            <m:sub>
+              <m:r>
+                <m:t>i</m:t>
+              </m:r>
+              <m:r>
+                <m:t>t</m:t>
+              </m:r>
+            </m:sub>
+          </m:sSub>
+          <m:r>
+            <m:rPr>
+              <m:sty m:val="p"/>
+            </m:rPr>
+            <m:t>=</m:t>
+          </m:r>
+          <m:r>
+            <m:t>α</m:t>
+          </m:r>
+          <m:r>
+            <m:rPr>
+              <m:sty m:val="p"/>
+            </m:rPr>
+            <m:t>+</m:t>
+          </m:r>
+          <m:sSub>
+            <m:e>
+              <m:r>
+                <m:t>β</m:t>
+              </m:r>
+            </m:e>
+            <m:sub>
+              <m:r>
+                <m:t>1</m:t>
+              </m:r>
+            </m:sub>
+          </m:sSub>
+          <m:r>
+            <m:t>C</m:t>
+          </m:r>
+          <m:r>
+            <m:t>D</m:t>
+          </m:r>
+          <m:r>
+            <m:t>D</m:t>
+          </m:r>
+          <m:r>
+            <m:t>X</m:t>
+          </m:r>
+          <m:r>
+            <m:t>K</m:t>
+          </m:r>
+          <m:r>
+            <m:rPr>
+              <m:sty m:val="p"/>
+            </m:rPr>
+            <m:t>_</m:t>
+          </m:r>
+          <m:sSub>
+            <m:e>
+              <m:r>
+                <m:t>c</m:t>
+              </m:r>
+            </m:e>
+            <m:sub>
+              <m:r>
+                <m:t>i</m:t>
+              </m:r>
+              <m:r>
+                <m:t>t</m:t>
+              </m:r>
+            </m:sub>
+          </m:sSub>
+          <m:r>
+            <m:rPr>
+              <m:sty m:val="p"/>
+            </m:rPr>
+            <m:t>+</m:t>
+          </m:r>
+          <m:r>
+            <m:t>γ</m:t>
+          </m:r>
+          <m:r>
+            <m:rPr>
+              <m:sty m:val="p"/>
+            </m:rPr>
+            <m:t>⋅</m:t>
+          </m:r>
+          <m:sSub>
+            <m:e>
+              <m:r>
+                <m:t>X</m:t>
+              </m:r>
+            </m:e>
+            <m:sub>
+              <m:r>
+                <m:t>i</m:t>
+              </m:r>
+              <m:r>
+                <m:t>t</m:t>
+              </m:r>
+            </m:sub>
+          </m:sSub>
+          <m:r>
+            <m:rPr>
+              <m:sty m:val="p"/>
+            </m:rPr>
+            <m:t>+</m:t>
+          </m:r>
+          <m:sSub>
+            <m:e>
+              <m:r>
+                <m:t>δ</m:t>
+              </m:r>
+            </m:e>
+            <m:sub>
+              <m:r>
+                <m:t>c</m:t>
+              </m:r>
+            </m:sub>
+          </m:sSub>
+          <m:r>
+            <m:rPr>
+              <m:sty m:val="p"/>
+            </m:rPr>
+            <m:t>+</m:t>
+          </m:r>
+          <m:sSub>
+            <m:e>
+              <m:r>
+                <m:t>λ</m:t>
+              </m:r>
+            </m:e>
+            <m:sub>
+              <m:r>
+                <m:t>t</m:t>
+              </m:r>
+            </m:sub>
+          </m:sSub>
+          <m:r>
+            <m:rPr>
+              <m:sty m:val="p"/>
+            </m:rPr>
+            <m:t>+</m:t>
+          </m:r>
+          <m:sSub>
+            <m:e>
+              <m:r>
+                <m:t>ε</m:t>
+              </m:r>
+            </m:e>
+            <m:sub>
+              <m:r>
+                <m:t>i</m:t>
+              </m:r>
+              <m:r>
+                <m:t>t</m:t>
+              </m:r>
+            </m:sub>
+          </m:sSub>
+        </m:oMath>
+      </m:oMathPara>
+    </w:p>
+    <w:p>
+      <w:pPr>
+        <w:pStyle w:val="FirstParagraph"/>
+      </w:pPr>
+      <m:oMathPara>
+        <m:oMathParaPr>
+          <m:jc m:val="center"/>
+        </m:oMathParaPr>
+        <m:oMath>
+          <m:sSub>
+            <m:e>
+              <m:r>
+                <m:t>β</m:t>
+              </m:r>
+            </m:e>
+            <m:sub>
+              <m:r>
+                <m:t>1</m:t>
+              </m:r>
+            </m:sub>
+          </m:sSub>
+          <m:r>
+            <m:rPr>
+              <m:sty m:val="p"/>
+            </m:rPr>
+            <m:t>=</m:t>
+          </m:r>
+          <m:r>
+            <m:rPr>
+              <m:sty m:val="p"/>
+            </m:rPr>
+            <m:t>−</m:t>
+          </m:r>
+          <m:r>
+            <m:t>0</m:t>
+          </m:r>
+          <m:r>
+            <m:rPr>
+              <m:sty m:val="p"/>
+            </m:rPr>
+            <m:t>,</m:t>
+          </m:r>
+          <m:r>
+            <m:t>404</m:t>
+          </m:r>
+          <m:r>
+            <m:rPr>
+              <m:sty m:val="p"/>
+            </m:rPr>
+            <m:t>,</m:t>
+          </m:r>
+          <m:r>
+            <m:t> </m:t>
+          </m:r>
+          <m:r>
+            <m:t>p</m:t>
+          </m:r>
+          <m:r>
+            <m:rPr>
+              <m:sty m:val="p"/>
+            </m:rPr>
+            <m:t>=</m:t>
+          </m:r>
+          <m:r>
+            <m:rPr>
+              <m:sty m:val="p"/>
+            </m:rPr>
+            <m:t>,</m:t>
+          </m:r>
+          <m:r>
+            <m:t>032</m:t>
+          </m:r>
+          <m:r>
+            <m:t> </m:t>
+          </m:r>
+          <m:d>
+            <m:dPr>
+              <m:begChr m:val="("/>
+              <m:endChr m:val=")"/>
+              <m:sepChr m:val=""/>
+              <m:grow/>
+            </m:dPr>
+            <m:e>
+              <m:r>
+                <m:rPr>
+                  <m:nor/>
+                  <m:sty m:val="p"/>
+                </m:rPr>
+                <m:t>country+year FE, N</m:t>
+              </m:r>
+              <m:r>
+                <m:rPr>
+                  <m:sty m:val="p"/>
+                </m:rPr>
+                <m:t>=</m:t>
+              </m:r>
+              <m:r>
+                <m:t>1</m:t>
+              </m:r>
+              <m:r>
+                <m:rPr>
+                  <m:sty m:val="p"/>
+                </m:rPr>
+                <m:t>.</m:t>
+              </m:r>
+              <m:r>
+                <m:t>469</m:t>
+              </m:r>
+            </m:e>
+          </m:d>
+          <m:r>
+            <m:rPr>
+              <m:sty m:val="p"/>
+            </m:rPr>
+            <m:t>⇒</m:t>
+          </m:r>
+          <m:r>
+            <m:rPr>
+              <m:nor/>
+              <m:sty m:val="b"/>
+            </m:rPr>
+            <m:t>FIP xác nhận</m:t>
+          </m:r>
+        </m:oMath>
+      </m:oMathPara>
+    </w:p>
+    <w:p>
+      <w:pPr>
+        <w:pStyle w:val="FirstParagraph"/>
+      </w:pPr>
+      <w:r>
+        <w:t xml:space="preserve">M2 — Kiểm định phi tuyến: thêm CDDXK_c²</w:t>
+      </w:r>
+    </w:p>
+    <w:p>
+      <w:pPr>
+        <w:pStyle w:val="BodyText"/>
+      </w:pPr>
+      <m:oMathPara>
+        <m:oMathParaPr>
+          <m:jc m:val="center"/>
+        </m:oMathParaPr>
+        <m:oMath>
+          <m:r>
+            <m:t>l</m:t>
+          </m:r>
+          <m:r>
+            <m:t>n</m:t>
+          </m:r>
+          <m:r>
+            <m:t>N</m:t>
+          </m:r>
+          <m:r>
+            <m:t>S</m:t>
+          </m:r>
+          <m:r>
+            <m:t>L</m:t>
+          </m:r>
+          <m:sSub>
+            <m:e>
+              <m:r>
+                <m:t>D</m:t>
+              </m:r>
+            </m:e>
+            <m:sub>
+              <m:r>
+                <m:t>i</m:t>
+              </m:r>
+              <m:r>
+                <m:t>t</m:t>
+              </m:r>
+            </m:sub>
+          </m:sSub>
+          <m:r>
+            <m:rPr>
+              <m:sty m:val="p"/>
+            </m:rPr>
+            <m:t>=</m:t>
+          </m:r>
+          <m:r>
+            <m:t>α</m:t>
+          </m:r>
+          <m:r>
+            <m:rPr>
+              <m:sty m:val="p"/>
+            </m:rPr>
+            <m:t>+</m:t>
+          </m:r>
+          <m:sSub>
+            <m:e>
+              <m:r>
+                <m:t>β</m:t>
+              </m:r>
+            </m:e>
+            <m:sub>
+              <m:r>
+                <m:t>1</m:t>
+              </m:r>
+            </m:sub>
+          </m:sSub>
+          <m:r>
+            <m:t>C</m:t>
+          </m:r>
+          <m:r>
+            <m:t>D</m:t>
+          </m:r>
+          <m:r>
+            <m:t>D</m:t>
+          </m:r>
+          <m:r>
+            <m:t>X</m:t>
+          </m:r>
+          <m:r>
+            <m:t>K</m:t>
+          </m:r>
+          <m:r>
+            <m:rPr>
+              <m:sty m:val="p"/>
+            </m:rPr>
+            <m:t>_</m:t>
+          </m:r>
+          <m:sSub>
+            <m:e>
+              <m:r>
+                <m:t>c</m:t>
+              </m:r>
+            </m:e>
+            <m:sub>
+              <m:r>
+                <m:t>i</m:t>
+              </m:r>
+              <m:r>
+                <m:t>t</m:t>
+              </m:r>
+            </m:sub>
+          </m:sSub>
+          <m:r>
+            <m:rPr>
+              <m:sty m:val="p"/>
+            </m:rPr>
+            <m:t>+</m:t>
+          </m:r>
+          <m:sSub>
+            <m:e>
+              <m:r>
+                <m:t>β</m:t>
+              </m:r>
+            </m:e>
+            <m:sub>
+              <m:r>
+                <m:t>2</m:t>
+              </m:r>
+            </m:sub>
+          </m:sSub>
+          <m:r>
+            <m:t>C</m:t>
+          </m:r>
+          <m:r>
+            <m:t>D</m:t>
+          </m:r>
+          <m:r>
+            <m:t>D</m:t>
+          </m:r>
+          <m:r>
+            <m:t>X</m:t>
+          </m:r>
+          <m:r>
+            <m:t>K</m:t>
+          </m:r>
+          <m:r>
+            <m:rPr>
+              <m:sty m:val="p"/>
+            </m:rPr>
+            <m:t>_</m:t>
+          </m:r>
+          <m:sSubSup>
+            <m:e>
+              <m:r>
+                <m:t>c</m:t>
+              </m:r>
+            </m:e>
+            <m:sub>
+              <m:r>
+                <m:t>i</m:t>
+              </m:r>
+              <m:r>
+                <m:t>t</m:t>
+              </m:r>
+            </m:sub>
+            <m:sup>
+              <m:r>
+                <m:t>2</m:t>
+              </m:r>
+            </m:sup>
+          </m:sSubSup>
+          <m:r>
+            <m:rPr>
+              <m:sty m:val="p"/>
+            </m:rPr>
+            <m:t>+</m:t>
+          </m:r>
+          <m:r>
+            <m:t>γ</m:t>
+          </m:r>
+          <m:r>
+            <m:rPr>
+              <m:sty m:val="p"/>
+            </m:rPr>
+            <m:t>⋅</m:t>
+          </m:r>
+          <m:sSub>
+            <m:e>
+              <m:r>
+                <m:t>X</m:t>
+              </m:r>
+            </m:e>
+            <m:sub>
+              <m:r>
+                <m:t>i</m:t>
+              </m:r>
+              <m:r>
+                <m:t>t</m:t>
+              </m:r>
+            </m:sub>
+          </m:sSub>
+          <m:r>
+            <m:rPr>
+              <m:sty m:val="p"/>
+            </m:rPr>
+            <m:t>+</m:t>
+          </m:r>
+          <m:sSub>
+            <m:e>
+              <m:r>
+                <m:t>δ</m:t>
+              </m:r>
+            </m:e>
+            <m:sub>
+              <m:r>
+                <m:t>c</m:t>
+              </m:r>
+            </m:sub>
+          </m:sSub>
+          <m:r>
+            <m:rPr>
+              <m:sty m:val="p"/>
+            </m:rPr>
+            <m:t>+</m:t>
+          </m:r>
+          <m:sSub>
+            <m:e>
+              <m:r>
+                <m:t>λ</m:t>
+              </m:r>
+            </m:e>
+            <m:sub>
+              <m:r>
+                <m:t>t</m:t>
+              </m:r>
+            </m:sub>
+          </m:sSub>
+          <m:r>
+            <m:rPr>
+              <m:sty m:val="p"/>
+            </m:rPr>
+            <m:t>+</m:t>
+          </m:r>
+          <m:sSub>
+            <m:e>
+              <m:r>
+                <m:t>ε</m:t>
+              </m:r>
+            </m:e>
+            <m:sub>
+              <m:r>
+                <m:t>i</m:t>
+              </m:r>
+              <m:r>
+                <m:t>t</m:t>
+              </m:r>
+            </m:sub>
+          </m:sSub>
+        </m:oMath>
+      </m:oMathPara>
+    </w:p>
+    <w:p>
+      <w:pPr>
+        <w:pStyle w:val="FirstParagraph"/>
+      </w:pPr>
+      <m:oMathPara>
+        <m:oMathParaPr>
+          <m:jc m:val="center"/>
+        </m:oMathParaPr>
+        <m:oMath>
+          <m:sSub>
+            <m:e>
+              <m:r>
+                <m:t>β</m:t>
+              </m:r>
+            </m:e>
+            <m:sub>
+              <m:r>
+                <m:t>1</m:t>
+              </m:r>
+            </m:sub>
+          </m:sSub>
+          <m:r>
+            <m:t> </m:t>
+          </m:r>
+          <m:r>
+            <m:rPr>
+              <m:nor/>
+              <m:sty m:val="p"/>
+            </m:rPr>
+            <m:t>NS</m:t>
+          </m:r>
+          <m:r>
+            <m:rPr>
+              <m:sty m:val="p"/>
+            </m:rPr>
+            <m:t>,</m:t>
+          </m:r>
+          <m:r>
+            <m:t> </m:t>
+          </m:r>
+          <m:sSub>
+            <m:e>
+              <m:r>
+                <m:t>β</m:t>
+              </m:r>
+            </m:e>
+            <m:sub>
+              <m:r>
+                <m:t>2</m:t>
+              </m:r>
+            </m:sub>
+          </m:sSub>
+          <m:r>
+            <m:t> </m:t>
+          </m:r>
+          <m:r>
+            <m:rPr>
+              <m:nor/>
+              <m:sty m:val="p"/>
+            </m:rPr>
+            <m:t>NS</m:t>
+          </m:r>
+          <m:r>
+            <m:rPr>
+              <m:sty m:val="p"/>
+            </m:rPr>
+            <m:t>;</m:t>
+          </m:r>
+          <m:r>
+            <m:t> </m:t>
+          </m:r>
+          <m:r>
+            <m:rPr>
+              <m:nor/>
+              <m:sty m:val="p"/>
+            </m:rPr>
+            <m:t>Lind–Mehlum U-test NS</m:t>
+          </m:r>
+          <m:r>
+            <m:rPr>
+              <m:sty m:val="p"/>
+            </m:rPr>
+            <m:t>⇒</m:t>
+          </m:r>
+          <m:r>
+            <m:rPr>
+              <m:nor/>
+              <m:sty m:val="p"/>
+            </m:rPr>
+            <m:t>không có điểm quay, đơn điệu âm</m:t>
+          </m:r>
+        </m:oMath>
+      </m:oMathPara>
+    </w:p>
+    <w:p>
+      <w:pPr>
+        <w:pStyle w:val="FirstParagraph"/>
+      </w:pPr>
+      <w:r>
+        <w:t xml:space="preserve">M3 — Kiểm định năng lực điều tiết (H2 null cho SIDS):</w:t>
+      </w:r>
+    </w:p>
+    <w:p>
+      <w:pPr>
+        <w:pStyle w:val="BodyText"/>
+      </w:pPr>
+      <m:oMathPara>
+        <m:oMathParaPr>
+          <m:jc m:val="center"/>
+        </m:oMathParaPr>
+        <m:oMath>
+          <m:r>
+            <m:t>l</m:t>
+          </m:r>
+          <m:r>
+            <m:t>n</m:t>
+          </m:r>
+          <m:r>
+            <m:t>N</m:t>
+          </m:r>
+          <m:r>
+            <m:t>S</m:t>
+          </m:r>
+          <m:r>
+            <m:t>L</m:t>
+          </m:r>
+          <m:sSub>
+            <m:e>
+              <m:r>
+                <m:t>D</m:t>
+              </m:r>
+            </m:e>
+            <m:sub>
+              <m:r>
+                <m:t>i</m:t>
+              </m:r>
+              <m:r>
+                <m:t>t</m:t>
+              </m:r>
+            </m:sub>
+          </m:sSub>
+          <m:r>
+            <m:rPr>
+              <m:sty m:val="p"/>
+            </m:rPr>
+            <m:t>=</m:t>
+          </m:r>
+          <m:r>
+            <m:t>α</m:t>
+          </m:r>
+          <m:r>
+            <m:rPr>
+              <m:sty m:val="p"/>
+            </m:rPr>
+            <m:t>+</m:t>
+          </m:r>
+          <m:sSub>
+            <m:e>
+              <m:r>
+                <m:t>β</m:t>
+              </m:r>
+            </m:e>
+            <m:sub>
+              <m:r>
+                <m:t>1</m:t>
+              </m:r>
+            </m:sub>
+          </m:sSub>
+          <m:r>
+            <m:t>C</m:t>
+          </m:r>
+          <m:r>
+            <m:t>D</m:t>
+          </m:r>
+          <m:r>
+            <m:t>D</m:t>
+          </m:r>
+          <m:r>
+            <m:t>X</m:t>
+          </m:r>
+          <m:r>
+            <m:t>K</m:t>
+          </m:r>
+          <m:r>
+            <m:rPr>
+              <m:sty m:val="p"/>
+            </m:rPr>
+            <m:t>_</m:t>
+          </m:r>
+          <m:sSub>
+            <m:e>
+              <m:r>
+                <m:t>c</m:t>
+              </m:r>
+            </m:e>
+            <m:sub>
+              <m:r>
+                <m:t>i</m:t>
+              </m:r>
+              <m:r>
+                <m:t>t</m:t>
+              </m:r>
+            </m:sub>
+          </m:sSub>
+          <m:r>
+            <m:rPr>
+              <m:sty m:val="p"/>
+            </m:rPr>
+            <m:t>+</m:t>
+          </m:r>
+          <m:sSub>
+            <m:e>
+              <m:r>
+                <m:t>β</m:t>
+              </m:r>
+            </m:e>
+            <m:sub>
+              <m:r>
+                <m:t>2</m:t>
+              </m:r>
+            </m:sub>
+          </m:sSub>
+          <m:r>
+            <m:t>C</m:t>
+          </m:r>
+          <m:r>
+            <m:t>D</m:t>
+          </m:r>
+          <m:r>
+            <m:t>D</m:t>
+          </m:r>
+          <m:r>
+            <m:t>X</m:t>
+          </m:r>
+          <m:r>
+            <m:t>K</m:t>
+          </m:r>
+          <m:r>
+            <m:rPr>
+              <m:sty m:val="p"/>
+            </m:rPr>
+            <m:t>_</m:t>
+          </m:r>
+          <m:sSubSup>
+            <m:e>
+              <m:r>
+                <m:t>c</m:t>
+              </m:r>
+            </m:e>
+            <m:sub>
+              <m:r>
+                <m:t>i</m:t>
+              </m:r>
+              <m:r>
+                <m:t>t</m:t>
+              </m:r>
+            </m:sub>
+            <m:sup>
+              <m:r>
+                <m:t>2</m:t>
+              </m:r>
+            </m:sup>
+          </m:sSubSup>
+          <m:r>
+            <m:rPr>
+              <m:sty m:val="p"/>
+            </m:rPr>
+            <m:t>+</m:t>
+          </m:r>
+          <m:sSub>
+            <m:e>
+              <m:r>
+                <m:t>β</m:t>
+              </m:r>
+            </m:e>
+            <m:sub>
+              <m:r>
+                <m:t>3</m:t>
+              </m:r>
+            </m:sub>
+          </m:sSub>
+          <m:r>
+            <m:t>N</m:t>
+          </m:r>
+          <m:r>
+            <m:t>L</m:t>
+          </m:r>
+          <m:r>
+            <m:t>C</m:t>
+          </m:r>
+          <m:r>
+            <m:t>N</m:t>
+          </m:r>
+          <m:r>
+            <m:rPr>
+              <m:sty m:val="p"/>
+            </m:rPr>
+            <m:t>_</m:t>
+          </m:r>
+          <m:sSub>
+            <m:e>
+              <m:r>
+                <m:t>z</m:t>
+              </m:r>
+            </m:e>
+            <m:sub>
+              <m:r>
+                <m:t>i</m:t>
+              </m:r>
+              <m:r>
+                <m:t>t</m:t>
+              </m:r>
+            </m:sub>
+          </m:sSub>
+          <m:r>
+            <m:rPr>
+              <m:sty m:val="p"/>
+            </m:rPr>
+            <m:t>+</m:t>
+          </m:r>
+          <m:sSub>
+            <m:e>
+              <m:r>
+                <m:t>β</m:t>
+              </m:r>
+            </m:e>
+            <m:sub>
+              <m:r>
+                <m:t>4</m:t>
+              </m:r>
+            </m:sub>
+          </m:sSub>
+          <m:r>
+            <m:t>C</m:t>
+          </m:r>
+          <m:r>
+            <m:t>S</m:t>
+          </m:r>
+          <m:r>
+            <m:t>S</m:t>
+          </m:r>
+          <m:r>
+            <m:rPr>
+              <m:sty m:val="p"/>
+            </m:rPr>
+            <m:t>_</m:t>
+          </m:r>
+          <m:sSub>
+            <m:e>
+              <m:r>
+                <m:t>z</m:t>
+              </m:r>
+            </m:e>
+            <m:sub>
+              <m:r>
+                <m:t>i</m:t>
+              </m:r>
+              <m:r>
+                <m:t>t</m:t>
+              </m:r>
+            </m:sub>
+          </m:sSub>
+          <m:r>
+            <m:rPr>
+              <m:sty m:val="p"/>
+            </m:rPr>
+            <m:t>+</m:t>
+          </m:r>
+          <m:r>
+            <m:t>γ</m:t>
+          </m:r>
+          <m:r>
+            <m:rPr>
+              <m:sty m:val="p"/>
+            </m:rPr>
+            <m:t>⋅</m:t>
+          </m:r>
+          <m:sSub>
+            <m:e>
+              <m:r>
+                <m:t>X</m:t>
+              </m:r>
+            </m:e>
+            <m:sub>
+              <m:r>
+                <m:t>i</m:t>
+              </m:r>
+              <m:r>
+                <m:t>t</m:t>
+              </m:r>
+            </m:sub>
+          </m:sSub>
+          <m:r>
+            <m:rPr>
+              <m:sty m:val="p"/>
+            </m:rPr>
+            <m:t>+</m:t>
+          </m:r>
+          <m:sSub>
+            <m:e>
+              <m:r>
+                <m:t>δ</m:t>
+              </m:r>
+            </m:e>
+            <m:sub>
+              <m:r>
+                <m:t>c</m:t>
+              </m:r>
+            </m:sub>
+          </m:sSub>
+          <m:r>
+            <m:rPr>
+              <m:sty m:val="p"/>
+            </m:rPr>
+            <m:t>+</m:t>
+          </m:r>
+          <m:sSub>
+            <m:e>
+              <m:r>
+                <m:t>λ</m:t>
+              </m:r>
+            </m:e>
+            <m:sub>
+              <m:r>
+                <m:t>t</m:t>
+              </m:r>
+            </m:sub>
+          </m:sSub>
+          <m:r>
+            <m:rPr>
+              <m:sty m:val="p"/>
+            </m:rPr>
+            <m:t>+</m:t>
+          </m:r>
+          <m:sSub>
+            <m:e>
+              <m:r>
+                <m:t>ε</m:t>
+              </m:r>
+            </m:e>
+            <m:sub>
+              <m:r>
+                <m:t>i</m:t>
+              </m:r>
+              <m:r>
+                <m:t>t</m:t>
+              </m:r>
+            </m:sub>
+          </m:sSub>
+        </m:oMath>
+      </m:oMathPara>
+    </w:p>
+    <w:p>
+      <w:pPr>
+        <w:pStyle w:val="FirstParagraph"/>
+      </w:pPr>
+      <m:oMathPara>
+        <m:oMathParaPr>
+          <m:jc m:val="center"/>
+        </m:oMathParaPr>
+        <m:oMath>
+          <m:sSub>
+            <m:e>
+              <m:r>
+                <m:t>β</m:t>
+              </m:r>
+            </m:e>
+            <m:sub>
+              <m:r>
+                <m:t>3</m:t>
+              </m:r>
+            </m:sub>
+          </m:sSub>
+          <m:r>
+            <m:t> </m:t>
+          </m:r>
+          <m:d>
+            <m:dPr>
+              <m:begChr m:val="("/>
+              <m:endChr m:val=")"/>
+              <m:sepChr m:val=""/>
+              <m:grow/>
+            </m:dPr>
+            <m:e>
+              <m:r>
+                <m:t>N</m:t>
+              </m:r>
+              <m:r>
+                <m:t>L</m:t>
+              </m:r>
+              <m:r>
+                <m:t>C</m:t>
+              </m:r>
+              <m:r>
+                <m:t>N</m:t>
+              </m:r>
+              <m:r>
+                <m:rPr>
+                  <m:sty m:val="p"/>
+                </m:rPr>
+                <m:t>_</m:t>
+              </m:r>
+              <m:r>
+                <m:t>z</m:t>
+              </m:r>
+            </m:e>
+          </m:d>
+          <m:r>
+            <m:rPr>
+              <m:sty m:val="p"/>
+            </m:rPr>
+            <m:t>:</m:t>
+          </m:r>
+          <m:r>
+            <m:t> </m:t>
+          </m:r>
+          <m:r>
+            <m:t>p</m:t>
+          </m:r>
+          <m:r>
+            <m:rPr>
+              <m:sty m:val="p"/>
+            </m:rPr>
+            <m:t>=</m:t>
+          </m:r>
+          <m:r>
+            <m:rPr>
+              <m:sty m:val="p"/>
+            </m:rPr>
+            <m:t>,</m:t>
+          </m:r>
+          <m:r>
+            <m:t>495</m:t>
+          </m:r>
+          <m:r>
+            <m:t> </m:t>
+          </m:r>
+          <m:r>
+            <m:rPr>
+              <m:nor/>
+              <m:sty m:val="p"/>
+            </m:rPr>
+            <m:t>NS</m:t>
+          </m:r>
+          <m:r>
+            <m:rPr>
+              <m:sty m:val="p"/>
+            </m:rPr>
+            <m:t>;</m:t>
+          </m:r>
+          <m:r>
+            <m:t> </m:t>
+          </m:r>
+          <m:sSub>
+            <m:e>
+              <m:r>
+                <m:t>β</m:t>
+              </m:r>
+            </m:e>
+            <m:sub>
+              <m:r>
+                <m:t>4</m:t>
+              </m:r>
+            </m:sub>
+          </m:sSub>
+          <m:r>
+            <m:t> </m:t>
+          </m:r>
+          <m:d>
+            <m:dPr>
+              <m:begChr m:val="("/>
+              <m:endChr m:val=")"/>
+              <m:sepChr m:val=""/>
+              <m:grow/>
+            </m:dPr>
+            <m:e>
+              <m:r>
+                <m:t>C</m:t>
+              </m:r>
+              <m:r>
+                <m:t>S</m:t>
+              </m:r>
+              <m:r>
+                <m:t>S</m:t>
+              </m:r>
+              <m:r>
+                <m:rPr>
+                  <m:sty m:val="p"/>
+                </m:rPr>
+                <m:t>_</m:t>
+              </m:r>
+              <m:r>
+                <m:t>z</m:t>
+              </m:r>
+            </m:e>
+          </m:d>
+          <m:r>
+            <m:rPr>
+              <m:sty m:val="p"/>
+            </m:rPr>
+            <m:t>:</m:t>
+          </m:r>
+          <m:r>
+            <m:t> </m:t>
+          </m:r>
+          <m:r>
+            <m:t>p</m:t>
+          </m:r>
+          <m:r>
+            <m:rPr>
+              <m:sty m:val="p"/>
+            </m:rPr>
+            <m:t>=</m:t>
+          </m:r>
+          <m:r>
+            <m:rPr>
+              <m:sty m:val="p"/>
+            </m:rPr>
+            <m:t>,</m:t>
+          </m:r>
+          <m:r>
+            <m:t>402</m:t>
+          </m:r>
+          <m:r>
+            <m:t> </m:t>
+          </m:r>
+          <m:r>
+            <m:rPr>
+              <m:nor/>
+              <m:sty m:val="p"/>
+            </m:rPr>
+            <m:t>NS</m:t>
+          </m:r>
+          <m:r>
+            <m:rPr>
+              <m:sty m:val="p"/>
+            </m:rPr>
+            <m:t>⇒</m:t>
+          </m:r>
+          <m:r>
+            <m:rPr>
+              <m:nor/>
+              <m:sty m:val="p"/>
+            </m:rPr>
+            <m:t>H2 bị bác bỏ tại Nhóm VI</m:t>
+          </m:r>
+        </m:oMath>
+      </m:oMathPara>
+    </w:p>
+    <w:p>
+      <w:pPr>
+        <w:pStyle w:val="FirstParagraph"/>
+      </w:pPr>
+      <w:r>
+        <w:rPr>
+          <w:bCs/>
+          <w:b/>
+        </w:rPr>
+        <w:t xml:space="preserve">Phân tích độ vững (robustness checks):</w:t>
+      </w:r>
+    </w:p>
+    <w:tbl>
+      <w:tblPr>
+        <w:tblStyle w:val="Table"/>
+        <w:tblW w:type="auto" w:w="0"/>
+        <w:tblLook w:firstRow="1" w:lastRow="0" w:firstColumn="0" w:lastColumn="0" w:noHBand="0" w:noVBand="0" w:val="0020"/>
+        <w:jc w:val="start"/>
+      </w:tblPr>
+      <w:tblGrid>
+        <w:gridCol w:w="1980"/>
+        <w:gridCol w:w="1980"/>
+        <w:gridCol w:w="1980"/>
+        <w:gridCol w:w="1980"/>
+      </w:tblGrid>
+      <w:tr>
+        <w:trPr>
+          <w:tblHeader w:val="true"/>
+        </w:trPr>
+        <w:tc>
+          <w:tcPr/>
+          <w:p>
+            <w:pPr>
+              <w:pStyle w:val="Compact"/>
+              <w:jc w:val="left"/>
+            </w:pPr>
+            <w:r>
+              <w:t xml:space="preserve">Specification</w:t>
+            </w:r>
+          </w:p>
+        </w:tc>
+        <w:tc>
+          <w:tcPr/>
+          <w:p>
+            <w:pPr>
+              <w:pStyle w:val="Compact"/>
+              <w:jc w:val="left"/>
+            </w:pPr>
+            <w:r>
+              <w:t xml:space="preserve">β(CDDXK_c)</w:t>
+            </w:r>
+          </w:p>
+        </w:tc>
+        <w:tc>
+          <w:tcPr/>
+          <w:p>
+            <w:pPr>
+              <w:pStyle w:val="Compact"/>
+              <w:jc w:val="left"/>
+            </w:pPr>
+            <w:r>
+              <w:t xml:space="preserve">SE</w:t>
+            </w:r>
+          </w:p>
+        </w:tc>
+        <w:tc>
+          <w:tcPr/>
+          <w:p>
+            <w:pPr>
+              <w:pStyle w:val="Compact"/>
+              <w:jc w:val="left"/>
+            </w:pPr>
+            <w:r>
+              <w:t xml:space="preserve">p</w:t>
+            </w:r>
+          </w:p>
+        </w:tc>
+      </w:tr>
+      <w:tr>
+        <w:tc>
+          <w:tcPr/>
+          <w:p>
+            <w:pPr>
+              <w:pStyle w:val="Compact"/>
+              <w:jc w:val="left"/>
+            </w:pPr>
+            <w:r>
+              <w:t xml:space="preserve">M1 country+year FE (N = 1.469)</w:t>
+            </w:r>
+          </w:p>
+        </w:tc>
+        <w:tc>
+          <w:tcPr/>
+          <w:p>
+            <w:pPr>
+              <w:pStyle w:val="Compact"/>
+              <w:jc w:val="left"/>
+            </w:pPr>
+            <w:r>
+              <w:t xml:space="preserve">−0,404</w:t>
+            </w:r>
+          </w:p>
+        </w:tc>
+        <w:tc>
+          <w:tcPr/>
+          <w:p>
+            <w:pPr>
+              <w:pStyle w:val="Compact"/>
+              <w:jc w:val="left"/>
+            </w:pPr>
+            <w:r>
+              <w:t xml:space="preserve">—</w:t>
+            </w:r>
+          </w:p>
+        </w:tc>
+        <w:tc>
+          <w:tcPr/>
+          <w:p>
+            <w:pPr>
+              <w:pStyle w:val="Compact"/>
+              <w:jc w:val="left"/>
+            </w:pPr>
+            <w:r>
+              <w:t xml:space="preserve">,032</w:t>
+            </w:r>
+          </w:p>
+        </w:tc>
+      </w:tr>
+      <w:tr>
+        <w:tc>
+          <w:tcPr/>
+          <w:p>
+            <w:pPr>
+              <w:pStyle w:val="Compact"/>
+              <w:jc w:val="left"/>
+            </w:pPr>
+            <w:r>
+              <w:t xml:space="preserve">Year FE only (không country FE)</w:t>
+            </w:r>
+          </w:p>
+        </w:tc>
+        <w:tc>
+          <w:tcPr/>
+          <w:p>
+            <w:pPr>
+              <w:pStyle w:val="Compact"/>
+              <w:jc w:val="left"/>
+            </w:pPr>
+            <w:r>
+              <w:t xml:space="preserve">−1,236</w:t>
+            </w:r>
+          </w:p>
+        </w:tc>
+        <w:tc>
+          <w:tcPr/>
+          <w:p>
+            <w:pPr>
+              <w:pStyle w:val="Compact"/>
+              <w:jc w:val="left"/>
+            </w:pPr>
+            <w:r>
+              <w:t xml:space="preserve">—</w:t>
+            </w:r>
+          </w:p>
+        </w:tc>
+        <w:tc>
+          <w:tcPr/>
+          <w:p>
+            <w:pPr>
+              <w:pStyle w:val="Compact"/>
+              <w:jc w:val="left"/>
+            </w:pPr>
+            <w:r>
+              <w:t xml:space="preserve">&lt; ,001</w:t>
+            </w:r>
+          </w:p>
+        </w:tc>
+      </w:tr>
+      <w:tr>
+        <w:tc>
+          <w:tcPr/>
+          <w:p>
+            <w:pPr>
+              <w:pStyle w:val="Compact"/>
+              <w:jc w:val="left"/>
+            </w:pPr>
+            <w:r>
+              <w:t xml:space="preserve">Bivariate (không controls)</w:t>
+            </w:r>
+          </w:p>
+        </w:tc>
+        <w:tc>
+          <w:tcPr/>
+          <w:p>
+            <w:pPr>
+              <w:pStyle w:val="Compact"/>
+              <w:jc w:val="left"/>
+            </w:pPr>
+            <w:r>
+              <w:t xml:space="preserve">−1,596</w:t>
+            </w:r>
+          </w:p>
+        </w:tc>
+        <w:tc>
+          <w:tcPr/>
+          <w:p>
+            <w:pPr>
+              <w:pStyle w:val="Compact"/>
+              <w:jc w:val="left"/>
+            </w:pPr>
+            <w:r>
+              <w:t xml:space="preserve">—</w:t>
+            </w:r>
+          </w:p>
+        </w:tc>
+        <w:tc>
+          <w:tcPr/>
+          <w:p>
+            <w:pPr>
+              <w:pStyle w:val="Compact"/>
+              <w:jc w:val="left"/>
+            </w:pPr>
+            <w:r>
+              <w:t xml:space="preserve">&lt; ,001</w:t>
+            </w:r>
+          </w:p>
+        </w:tc>
+      </w:tr>
+      <w:tr>
+        <w:tc>
+          <w:tcPr/>
+          <w:p>
+            <w:pPr>
+              <w:pStyle w:val="Compact"/>
+              <w:jc w:val="left"/>
+            </w:pPr>
+            <w:r>
+              <w:t xml:space="preserve">Exporters-only (N = 187)</w:t>
+            </w:r>
+          </w:p>
+        </w:tc>
+        <w:tc>
+          <w:tcPr/>
+          <w:p>
+            <w:pPr>
+              <w:pStyle w:val="Compact"/>
+              <w:jc w:val="left"/>
+            </w:pPr>
+            <w:r>
+              <w:t xml:space="preserve">−0,901</w:t>
+            </w:r>
+          </w:p>
+        </w:tc>
+        <w:tc>
+          <w:tcPr/>
+          <w:p>
+            <w:pPr>
+              <w:pStyle w:val="Compact"/>
+              <w:jc w:val="left"/>
+            </w:pPr>
+            <w:r>
+              <w:t xml:space="preserve">—</w:t>
+            </w:r>
+          </w:p>
+        </w:tc>
+        <w:tc>
+          <w:tcPr/>
+          <w:p>
+            <w:pPr>
+              <w:pStyle w:val="Compact"/>
+              <w:jc w:val="left"/>
+            </w:pPr>
+            <w:r>
+              <w:t xml:space="preserve">,027</w:t>
+            </w:r>
+          </w:p>
+        </w:tc>
+      </w:tr>
+    </w:tbl>
+    <w:p>
+      <w:pPr>
+        <w:pStyle w:val="BodyText"/>
+      </w:pPr>
+      <w:r>
+        <w:rPr>
+          <w:iCs/>
+          <w:i/>
+        </w:rPr>
+        <w:t xml:space="preserve">Hệ số âm nhất quán qua 4 specification xác nhận FIP không phải do selection bias hay outlier.</w:t>
+      </w:r>
+    </w:p>
+    <w:p>
+      <w:pPr>
+        <w:pStyle w:val="BodyText"/>
+      </w:pPr>
+      <w:r>
+        <w:rPr>
+          <w:bCs/>
+          <w:b/>
+        </w:rPr>
+        <w:t xml:space="preserve">Bảng định nghĩa biến — Nghiên cứu 8 (Pacific SIDS)</w:t>
+      </w:r>
+    </w:p>
+    <w:tbl>
+      <w:tblPr>
+        <w:tblStyle w:val="Table"/>
+        <w:tblW w:type="auto" w:w="0"/>
+        <w:tblLook w:firstRow="1" w:lastRow="0" w:firstColumn="0" w:lastColumn="0" w:noHBand="0" w:noVBand="0" w:val="0020"/>
+        <w:jc w:val="start"/>
+      </w:tblPr>
+      <w:tblGrid>
+        <w:gridCol w:w="1980"/>
+        <w:gridCol w:w="1980"/>
+        <w:gridCol w:w="1980"/>
+        <w:gridCol w:w="1980"/>
+      </w:tblGrid>
+      <w:tr>
+        <w:trPr>
+          <w:tblHeader w:val="true"/>
+        </w:trPr>
+        <w:tc>
+          <w:tcPr/>
+          <w:p>
+            <w:pPr>
+              <w:pStyle w:val="Compact"/>
+              <w:jc w:val="left"/>
+            </w:pPr>
+            <w:r>
+              <w:t xml:space="preserve">Ký hiệu</w:t>
+            </w:r>
+          </w:p>
+        </w:tc>
+        <w:tc>
+          <w:tcPr/>
+          <w:p>
+            <w:pPr>
+              <w:pStyle w:val="Compact"/>
+              <w:jc w:val="left"/>
+            </w:pPr>
+            <w:r>
+              <w:t xml:space="preserve">WBES item</w:t>
+            </w:r>
+          </w:p>
+        </w:tc>
+        <w:tc>
+          <w:tcPr/>
+          <w:p>
+            <w:pPr>
+              <w:pStyle w:val="Compact"/>
+              <w:jc w:val="left"/>
+            </w:pPr>
+            <w:r>
+              <w:t xml:space="preserve">Cách tính</w:t>
+            </w:r>
+          </w:p>
+        </w:tc>
+        <w:tc>
+          <w:tcPr/>
+          <w:p>
+            <w:pPr>
+              <w:pStyle w:val="Compact"/>
+              <w:jc w:val="left"/>
+            </w:pPr>
+            <w:r>
+              <w:t xml:space="preserve">Vai trò</w:t>
+            </w:r>
+          </w:p>
+        </w:tc>
+      </w:tr>
+      <w:tr>
+        <w:tc>
+          <w:tcPr/>
+          <w:p>
+            <w:pPr>
+              <w:pStyle w:val="Compact"/>
+              <w:jc w:val="left"/>
+            </w:pPr>
+            <w:r>
+              <w:t xml:space="preserve">lnNSLD</w:t>
+            </w:r>
+          </w:p>
+        </w:tc>
+        <w:tc>
+          <w:tcPr/>
+          <w:p>
+            <w:pPr>
+              <w:pStyle w:val="Compact"/>
+              <w:jc w:val="left"/>
+            </w:pPr>
+            <w:r>
+              <w:t xml:space="preserve">d2, l1</w:t>
+            </w:r>
+          </w:p>
+        </w:tc>
+        <w:tc>
+          <w:tcPr/>
+          <w:p>
+            <w:pPr>
+              <w:pStyle w:val="Compact"/>
+              <w:jc w:val="left"/>
+            </w:pPr>
+            <w:r>
+              <w:t xml:space="preserve">ln(doanh thu PPP / lao động)</w:t>
+            </w:r>
+          </w:p>
+        </w:tc>
+        <w:tc>
+          <w:tcPr/>
+          <w:p>
+            <w:pPr>
+              <w:pStyle w:val="Compact"/>
+              <w:jc w:val="left"/>
+            </w:pPr>
+            <w:r>
+              <w:t xml:space="preserve">Biến phụ thuộc</w:t>
+            </w:r>
+          </w:p>
+        </w:tc>
+      </w:tr>
+      <w:tr>
+        <w:tc>
+          <w:tcPr/>
+          <w:p>
+            <w:pPr>
+              <w:pStyle w:val="Compact"/>
+              <w:jc w:val="left"/>
+            </w:pPr>
+            <w:r>
+              <w:t xml:space="preserve">CDDXK_c</w:t>
+            </w:r>
+          </w:p>
+        </w:tc>
+        <w:tc>
+          <w:tcPr/>
+          <w:p>
+            <w:pPr>
+              <w:pStyle w:val="Compact"/>
+              <w:jc w:val="left"/>
+            </w:pPr>
+            <w:r>
+              <w:t xml:space="preserve">d3c</w:t>
+            </w:r>
+          </w:p>
+        </w:tc>
+        <w:tc>
+          <w:tcPr/>
+          <w:p>
+            <w:pPr>
+              <w:pStyle w:val="Compact"/>
+              <w:jc w:val="left"/>
+            </w:pPr>
+            <w:r>
+              <w:t xml:space="preserve">(d3c/100) − mean_wave: centred</w:t>
+            </w:r>
+          </w:p>
+        </w:tc>
+        <w:tc>
+          <w:tcPr/>
+          <w:p>
+            <w:pPr>
+              <w:pStyle w:val="Compact"/>
+              <w:jc w:val="left"/>
+            </w:pPr>
+            <w:r>
+              <w:t xml:space="preserve">Biến độc lập (I)</w:t>
+            </w:r>
+          </w:p>
+        </w:tc>
+      </w:tr>
+      <w:tr>
+        <w:tc>
+          <w:tcPr/>
+          <w:p>
+            <w:pPr>
+              <w:pStyle w:val="Compact"/>
+              <w:jc w:val="left"/>
+            </w:pPr>
+            <w:r>
+              <w:t xml:space="preserve">CDDXK_c²</w:t>
+            </w:r>
+          </w:p>
+        </w:tc>
+        <w:tc>
+          <w:tcPr/>
+          <w:p>
+            <w:pPr>
+              <w:pStyle w:val="Compact"/>
+              <w:jc w:val="left"/>
+            </w:pPr>
+            <w:r>
+              <w:t xml:space="preserve">d3c</w:t>
+            </w:r>
+          </w:p>
+        </w:tc>
+        <w:tc>
+          <w:tcPr/>
+          <w:p>
+            <w:pPr>
+              <w:pStyle w:val="Compact"/>
+              <w:jc w:val="left"/>
+            </w:pPr>
+            <w:r>
+              <w:t xml:space="preserve">CDDXK_c bình phương</w:t>
+            </w:r>
+          </w:p>
+        </w:tc>
+        <w:tc>
+          <w:tcPr/>
+          <w:p>
+            <w:pPr>
+              <w:pStyle w:val="Compact"/>
+              <w:jc w:val="left"/>
+            </w:pPr>
+            <w:r>
+              <w:t xml:space="preserve">I — kiểm định phi tuyến</w:t>
+            </w:r>
+          </w:p>
+        </w:tc>
+      </w:tr>
+      <w:tr>
+        <w:tc>
+          <w:tcPr/>
+          <w:p>
+            <w:pPr>
+              <w:pStyle w:val="Compact"/>
+              <w:jc w:val="left"/>
+            </w:pPr>
+            <w:r>
+              <w:t xml:space="preserve">NLCN_z</w:t>
+            </w:r>
+          </w:p>
+        </w:tc>
+        <w:tc>
+          <w:tcPr/>
+          <w:p>
+            <w:pPr>
+              <w:pStyle w:val="Compact"/>
+              <w:jc w:val="left"/>
+            </w:pPr>
+            <w:r>
+              <w:t xml:space="preserve">b8, e6</w:t>
+            </w:r>
+          </w:p>
+        </w:tc>
+        <w:tc>
+          <w:tcPr/>
+          <w:p>
+            <w:pPr>
+              <w:pStyle w:val="Compact"/>
+              <w:jc w:val="left"/>
+            </w:pPr>
+            <w:r>
+              <w:t xml:space="preserve">z-std(cert + CN nước ngoài)</w:t>
+            </w:r>
+          </w:p>
+        </w:tc>
+        <w:tc>
+          <w:tcPr/>
+          <w:p>
+            <w:pPr>
+              <w:pStyle w:val="Compact"/>
+              <w:jc w:val="left"/>
+            </w:pPr>
+            <w:r>
+              <w:t xml:space="preserve">Năng lực công nghệ</w:t>
+            </w:r>
+          </w:p>
+        </w:tc>
+      </w:tr>
+      <w:tr>
+        <w:tc>
+          <w:tcPr/>
+          <w:p>
+            <w:pPr>
+              <w:pStyle w:val="Compact"/>
+              <w:jc w:val="left"/>
+            </w:pPr>
+            <w:r>
+              <w:t xml:space="preserve">CSS_z</w:t>
+            </w:r>
+          </w:p>
+        </w:tc>
+        <w:tc>
+          <w:tcPr/>
+          <w:p>
+            <w:pPr>
+              <w:pStyle w:val="Compact"/>
+              <w:jc w:val="left"/>
+            </w:pPr>
+            <w:r>
+              <w:t xml:space="preserve">c22b</w:t>
+            </w:r>
+          </w:p>
+        </w:tc>
+        <w:tc>
+          <w:tcPr/>
+          <w:p>
+            <w:pPr>
+              <w:pStyle w:val="Compact"/>
+              <w:jc w:val="left"/>
+            </w:pPr>
+            <w:r>
+              <w:t xml:space="preserve">z-std(website binary): Tier-1 only</w:t>
+            </w:r>
+          </w:p>
+        </w:tc>
+        <w:tc>
+          <w:tcPr/>
+          <w:p>
+            <w:pPr>
+              <w:pStyle w:val="Compact"/>
+              <w:jc w:val="left"/>
+            </w:pPr>
+            <w:r>
+              <w:t xml:space="preserve">Số hoá — proxy tĩnh</w:t>
+            </w:r>
+          </w:p>
+        </w:tc>
+      </w:tr>
+      <w:tr>
+        <w:tc>
+          <w:tcPr/>
+          <w:p>
+            <w:pPr>
+              <w:pStyle w:val="Compact"/>
+              <w:jc w:val="left"/>
+            </w:pPr>
+            <w:r>
+              <w:t xml:space="preserve">lnLD</w:t>
+            </w:r>
+          </w:p>
+        </w:tc>
+        <w:tc>
+          <w:tcPr/>
+          <w:p>
+            <w:pPr>
+              <w:pStyle w:val="Compact"/>
+              <w:jc w:val="left"/>
+            </w:pPr>
+            <w:r>
+              <w:t xml:space="preserve">l1</w:t>
+            </w:r>
+          </w:p>
+        </w:tc>
+        <w:tc>
+          <w:tcPr/>
+          <w:p>
+            <w:pPr>
+              <w:pStyle w:val="Compact"/>
+              <w:jc w:val="left"/>
+            </w:pPr>
+            <w:r>
+              <w:t xml:space="preserve">ln(lao động thường trực)</w:t>
+            </w:r>
+          </w:p>
+        </w:tc>
+        <w:tc>
+          <w:tcPr/>
+          <w:p>
+            <w:pPr>
+              <w:pStyle w:val="Compact"/>
+              <w:jc w:val="left"/>
+            </w:pPr>
+            <w:r>
+              <w:t xml:space="preserve">Control (quy mô)</w:t>
+            </w:r>
+          </w:p>
+        </w:tc>
+      </w:tr>
+      <w:tr>
+        <w:tc>
+          <w:tcPr/>
+          <w:p>
+            <w:pPr>
+              <w:pStyle w:val="Compact"/>
+              <w:jc w:val="left"/>
+            </w:pPr>
+            <w:r>
+              <w:t xml:space="preserve">TuoiDN</w:t>
+            </w:r>
+          </w:p>
+        </w:tc>
+        <w:tc>
+          <w:tcPr/>
+          <w:p>
+            <w:pPr>
+              <w:pStyle w:val="Compact"/>
+              <w:jc w:val="left"/>
+            </w:pPr>
+            <w:r>
+              <w:t xml:space="preserve">b5</w:t>
+            </w:r>
+          </w:p>
+        </w:tc>
+        <w:tc>
+          <w:tcPr/>
+          <w:p>
+            <w:pPr>
+              <w:pStyle w:val="Compact"/>
+              <w:jc w:val="left"/>
+            </w:pPr>
+            <w:r>
+              <w:t xml:space="preserve">năm_KS − năm_thành_lập</w:t>
+            </w:r>
+          </w:p>
+        </w:tc>
+        <w:tc>
+          <w:tcPr/>
+          <w:p>
+            <w:pPr>
+              <w:pStyle w:val="Compact"/>
+              <w:jc w:val="left"/>
+            </w:pPr>
+            <w:r>
+              <w:t xml:space="preserve">Control (tuổi DN)</w:t>
+            </w:r>
+          </w:p>
+        </w:tc>
+      </w:tr>
+      <w:tr>
+        <w:tc>
+          <w:tcPr/>
+          <w:p>
+            <w:pPr>
+              <w:pStyle w:val="Compact"/>
+              <w:jc w:val="left"/>
+            </w:pPr>
+            <w:r>
+              <w:t xml:space="preserve">SoHuuNN</w:t>
+            </w:r>
+          </w:p>
+        </w:tc>
+        <w:tc>
+          <w:tcPr/>
+          <w:p>
+            <w:pPr>
+              <w:pStyle w:val="Compact"/>
+              <w:jc w:val="left"/>
+            </w:pPr>
+            <w:r>
+              <w:t xml:space="preserve">b6a</w:t>
+            </w:r>
+          </w:p>
+        </w:tc>
+        <w:tc>
+          <w:tcPr/>
+          <w:p>
+            <w:pPr>
+              <w:pStyle w:val="Compact"/>
+              <w:jc w:val="left"/>
+            </w:pPr>
+            <w:r>
+              <w:t xml:space="preserve">tỷ lệ sở hữu nước ngoài</w:t>
+            </w:r>
+          </w:p>
+        </w:tc>
+        <w:tc>
+          <w:tcPr/>
+          <w:p>
+            <w:pPr>
+              <w:pStyle w:val="Compact"/>
+              <w:jc w:val="left"/>
+            </w:pPr>
+            <w:r>
+              <w:t xml:space="preserve">Control (sở hữu)</w:t>
+            </w:r>
+          </w:p>
+        </w:tc>
+      </w:tr>
+      <w:tr>
+        <w:tc>
+          <w:tcPr/>
+          <w:p>
+            <w:pPr>
+              <w:pStyle w:val="Compact"/>
+              <w:jc w:val="left"/>
+            </w:pPr>
+            <w:r>
+              <w:t xml:space="preserve">δ_c</w:t>
+            </w:r>
+          </w:p>
+        </w:tc>
+        <w:tc>
+          <w:tcPr/>
+          <w:p>
+            <w:pPr>
+              <w:pStyle w:val="Compact"/>
+              <w:jc w:val="left"/>
+            </w:pPr>
+            <w:r>
+              <w:t xml:space="preserve">a3b</w:t>
+            </w:r>
+          </w:p>
+        </w:tc>
+        <w:tc>
+          <w:tcPr/>
+          <w:p>
+            <w:pPr>
+              <w:pStyle w:val="Compact"/>
+              <w:jc w:val="left"/>
+            </w:pPr>
+            <w:r>
+              <w:t xml:space="preserve">country FE</w:t>
+            </w:r>
+          </w:p>
+        </w:tc>
+        <w:tc>
+          <w:tcPr/>
+          <w:p>
+            <w:pPr>
+              <w:pStyle w:val="Compact"/>
+              <w:jc w:val="left"/>
+            </w:pPr>
+            <w:r>
+              <w:t xml:space="preserve">Fixed effects</w:t>
+            </w:r>
+          </w:p>
+        </w:tc>
+      </w:tr>
+      <w:tr>
+        <w:tc>
+          <w:tcPr/>
+          <w:p>
+            <w:pPr>
+              <w:pStyle w:val="Compact"/>
+              <w:jc w:val="left"/>
+            </w:pPr>
+            <w:r>
+              <w:t xml:space="preserve">λ_t</w:t>
+            </w:r>
+          </w:p>
+        </w:tc>
+        <w:tc>
+          <w:tcPr/>
+          <w:p>
+            <w:pPr>
+              <w:pStyle w:val="Compact"/>
+              <w:jc w:val="left"/>
+            </w:pPr>
+            <w:r>
+              <w:t xml:space="preserve">wave</w:t>
+            </w:r>
+          </w:p>
+        </w:tc>
+        <w:tc>
+          <w:tcPr/>
+          <w:p>
+            <w:pPr>
+              <w:pStyle w:val="Compact"/>
+              <w:jc w:val="left"/>
+            </w:pPr>
+            <w:r>
+              <w:t xml:space="preserve">wave FE</w:t>
+            </w:r>
+          </w:p>
+        </w:tc>
+        <w:tc>
+          <w:tcPr/>
+          <w:p>
+            <w:pPr>
+              <w:pStyle w:val="Compact"/>
+              <w:jc w:val="left"/>
+            </w:pPr>
+            <w:r>
+              <w:t xml:space="preserve">Fixed effects</w:t>
+            </w:r>
+          </w:p>
+        </w:tc>
+      </w:tr>
+    </w:tbl>
+    <w:p>
+      <w:pPr>
+        <w:pStyle w:val="BodyText"/>
+      </w:pPr>
+      <w:r>
+        <w:rPr>
+          <w:iCs/>
+          <w:i/>
+        </w:rPr>
+        <w:t xml:space="preserve">Ghi chú: FIP là điều kiện biên (boundary condition) của mô hình chữ U ngược — áp dụng đặc thù tại ICRV Nhóm VI nơi 3 điều kiện cấu trúc bị vi phạm đồng thời: (1) không có thị trường nội địa đủ lớn, (2) chi phí thương mại không kiểm soát được, (3) hỗ trợ thể chế không đủ chức năng. DAI (CSS_z) Tier-1 only — WBES không thu thập thang đo đầy đủ cho số hoá động tại SIDS.</w:t>
+      </w:r>
+    </w:p>
+    <w:p>
+      <w:r>
+        <w:pict>
+          <v:rect style="width:0;height:1.5pt" o:hralign="center" o:hrstd="t" o:hr="t"/>
+        </w:pict>
+      </w:r>
+    </w:p>
+    <w:bookmarkEnd w:id="41"/>
+    <w:bookmarkEnd w:id="42"/>
+    <w:bookmarkStart w:id="43" w:name="Xcb5234575391557b76fcccc317c70eb26569684"/>
     <w:p>
       <w:pPr>
         <w:pStyle w:val="Heading3"/>
       </w:pPr>
       <w:r>
-        <w:t xml:space="preserve">4.6 Sai số chuẩn</w:t>
+        <w:t xml:space="preserve">3.4.6 Sai số chuẩn</w:t>
       </w:r>
     </w:p>
     <w:p>
@@ -13991,31 +17053,31 @@
         <w:t xml:space="preserve">Tất cả các mô hình đều sử dụng HC1/HC3 robust standard errors (Long &amp; Ervin, 2000; White, 1980) để xử lý heteroscedasticity. Đối với multi-country, bổ sung clustered SE theo country.</w:t>
       </w:r>
     </w:p>
-    <w:bookmarkEnd w:id="47"/>
-    <w:bookmarkEnd w:id="48"/>
-    <w:bookmarkStart w:id="54" w:name="Xbd137c7549379bc59bd868848e5dfb5b5e4e977"/>
+    <w:bookmarkEnd w:id="43"/>
+    <w:bookmarkEnd w:id="44"/>
+    <w:bookmarkStart w:id="50" w:name="X8be9b8b49491f51852c13794a1720d171ee5535"/>
     <w:p>
       <w:pPr>
         <w:pStyle w:val="Heading2"/>
       </w:pPr>
       <w:r>
-        <w:t xml:space="preserve">5. Kiểm định độ vững</w:t>
-      </w:r>
-    </w:p>
-    <w:bookmarkStart w:id="49" w:name="X431ee618c3d4d2cdcb5311a37313dcf18ed1464"/>
+        <w:t xml:space="preserve">3.5 Kiểm định độ vững</w:t>
+      </w:r>
+    </w:p>
+    <w:bookmarkStart w:id="45" w:name="Xa00f076f3963b547ab7d43d6f55fd4f3a5113c5"/>
     <w:p>
       <w:pPr>
         <w:pStyle w:val="Heading3"/>
       </w:pPr>
       <w:r>
-        <w:t xml:space="preserve">5.1 Thay đổi thước đo</w:t>
+        <w:t xml:space="preserve">3.5.1 Thay đổi thước đo</w:t>
       </w:r>
     </w:p>
     <w:p>
       <w:pPr>
         <w:numPr>
           <w:ilvl w:val="0"/>
-          <w:numId w:val="1008"/>
+          <w:numId w:val="1007"/>
         </w:numPr>
         <w:pStyle w:val="Compact"/>
       </w:pPr>
@@ -14060,12 +17122,70 @@
       <w:pPr>
         <w:numPr>
           <w:ilvl w:val="0"/>
-          <w:numId w:val="1008"/>
+          <w:numId w:val="1007"/>
         </w:numPr>
         <w:pStyle w:val="Compact"/>
       </w:pPr>
       <w:r>
         <w:t xml:space="preserve">Biến độc lập: thay FSTS bằng export status (binary), foreign sales count.</w:t>
+      </w:r>
+    </w:p>
+    <w:p>
+      <w:pPr>
+        <w:numPr>
+          <w:ilvl w:val="0"/>
+          <w:numId w:val="1007"/>
+        </w:numPr>
+        <w:pStyle w:val="Compact"/>
+      </w:pPr>
+      <w:r>
+        <w:t xml:space="preserve">Biến moderator: thay DAI_thin bằng DAI_rich (cho subset 2024+).</w:t>
+      </w:r>
+    </w:p>
+    <w:bookmarkEnd w:id="45"/>
+    <w:bookmarkStart w:id="46" w:name="Xac2ebbdc11b48daafdee8742a5cbdf7e2e607ee"/>
+    <w:p>
+      <w:pPr>
+        <w:pStyle w:val="Heading3"/>
+      </w:pPr>
+      <w:r>
+        <w:t xml:space="preserve">3.5.2 Mẫu phụ</w:t>
+      </w:r>
+    </w:p>
+    <w:p>
+      <w:pPr>
+        <w:pStyle w:val="FirstParagraph"/>
+      </w:pPr>
+      <w:r>
+        <w:t xml:space="preserve">Loại trừ micro firms (&lt;5 lao động); chỉ giữ SMEs; chỉ giữ manufacturing; chỉ giữ exporters (FSTS &gt; 0); subgroup theo 6 sub-regime ICRV.</w:t>
+      </w:r>
+    </w:p>
+    <w:bookmarkEnd w:id="46"/>
+    <w:bookmarkStart w:id="47" w:name="X7f474d927517549e35ccb278e2098f6d3b759d4"/>
+    <w:p>
+      <w:pPr>
+        <w:pStyle w:val="Heading3"/>
+      </w:pPr>
+      <w:r>
+        <w:t xml:space="preserve">3.5.3 Outliers</w:t>
+      </w:r>
+    </w:p>
+    <w:p>
+      <w:pPr>
+        <w:pStyle w:val="FirstParagraph"/>
+      </w:pPr>
+      <w:r>
+        <w:t xml:space="preserve">Winsorization 1% và 5% đối với labor productivity và employment, áp dụng trong từng country-year.</w:t>
+      </w:r>
+    </w:p>
+    <w:bookmarkEnd w:id="47"/>
+    <w:bookmarkStart w:id="48" w:name="X2da9a9ba2cec2086c1dda0df0458753db93e2e3"/>
+    <w:p>
+      <w:pPr>
+        <w:pStyle w:val="Heading3"/>
+      </w:pPr>
+      <w:r>
+        <w:t xml:space="preserve">3.5.4 Multicollinearity và heteroscedasticity</w:t>
       </w:r>
     </w:p>
     <w:p>
@@ -14077,53 +17197,29 @@
         <w:pStyle w:val="Compact"/>
       </w:pPr>
       <w:r>
-        <w:t xml:space="preserve">Biến moderator: thay DAI_thin bằng DAI_rich (cho subset 2024+).</w:t>
-      </w:r>
-    </w:p>
-    <w:bookmarkEnd w:id="49"/>
-    <w:bookmarkStart w:id="50" w:name="X9e9ef139d57d7f609b0bd2a30f6aacc57ffda85"/>
+        <w:t xml:space="preserve">VIF cho tất cả mô hình; ngưỡng VIF &lt; 5 (Hair et al., 2019).</w:t>
+      </w:r>
+    </w:p>
+    <w:p>
+      <w:pPr>
+        <w:numPr>
+          <w:ilvl w:val="0"/>
+          <w:numId w:val="1008"/>
+        </w:numPr>
+        <w:pStyle w:val="Compact"/>
+      </w:pPr>
+      <w:r>
+        <w:t xml:space="preserve">Breusch–Pagan test (Breusch &amp; Pagan, 1979).</w:t>
+      </w:r>
+    </w:p>
+    <w:bookmarkEnd w:id="48"/>
+    <w:bookmarkStart w:id="49" w:name="Xece3d027367fef795bcf55aad7417945cf4f49c"/>
     <w:p>
       <w:pPr>
         <w:pStyle w:val="Heading3"/>
       </w:pPr>
       <w:r>
-        <w:t xml:space="preserve">5.2 Mẫu phụ</w:t>
-      </w:r>
-    </w:p>
-    <w:p>
-      <w:pPr>
-        <w:pStyle w:val="FirstParagraph"/>
-      </w:pPr>
-      <w:r>
-        <w:t xml:space="preserve">Loại trừ micro firms (&lt;5 lao động); chỉ giữ SMEs; chỉ giữ manufacturing; chỉ giữ exporters (FSTS &gt; 0); subgroup theo 6 sub-regime ICRV.</w:t>
-      </w:r>
-    </w:p>
-    <w:bookmarkEnd w:id="50"/>
-    <w:bookmarkStart w:id="51" w:name="X98cc73fc712d9e44cc5d18b702bb976620f7fc1"/>
-    <w:p>
-      <w:pPr>
-        <w:pStyle w:val="Heading3"/>
-      </w:pPr>
-      <w:r>
-        <w:t xml:space="preserve">5.3 Outliers</w:t>
-      </w:r>
-    </w:p>
-    <w:p>
-      <w:pPr>
-        <w:pStyle w:val="FirstParagraph"/>
-      </w:pPr>
-      <w:r>
-        <w:t xml:space="preserve">Winsorization 1% và 5% đối với labor productivity và employment, áp dụng trong từng country-year.</w:t>
-      </w:r>
-    </w:p>
-    <w:bookmarkEnd w:id="51"/>
-    <w:bookmarkStart w:id="52" w:name="X33d8f36a6a0e8ad3d10f0b0d165a7983b25acc1"/>
-    <w:p>
-      <w:pPr>
-        <w:pStyle w:val="Heading3"/>
-      </w:pPr>
-      <w:r>
-        <w:t xml:space="preserve">5.4 Multicollinearity và heteroscedasticity</w:t>
+        <w:t xml:space="preserve">3.5.5 Sensitivity analysis cho meta-analysis</w:t>
       </w:r>
     </w:p>
     <w:p>
@@ -14135,7 +17231,7 @@
         <w:pStyle w:val="Compact"/>
       </w:pPr>
       <w:r>
-        <w:t xml:space="preserve">VIF cho tất cả mô hình; ngưỡng VIF &lt; 5 (Hair et al., 2019).</w:t>
+        <w:t xml:space="preserve">Leave-one-out: loại từng nghiên cứu và tái tính pooled effect.</w:t>
       </w:r>
     </w:p>
     <w:p>
@@ -14147,52 +17243,18 @@
         <w:pStyle w:val="Compact"/>
       </w:pPr>
       <w:r>
-        <w:t xml:space="preserve">Breusch–Pagan test (Breusch &amp; Pagan, 1979).</w:t>
-      </w:r>
-    </w:p>
-    <w:bookmarkEnd w:id="52"/>
-    <w:bookmarkStart w:id="53" w:name="X72f2a8f16e87d5c44ffc52bf2b3af577e467955"/>
-    <w:p>
-      <w:pPr>
-        <w:pStyle w:val="Heading3"/>
-      </w:pPr>
-      <w:r>
-        <w:t xml:space="preserve">5.5 Sensitivity analysis cho meta-analysis</w:t>
-      </w:r>
-    </w:p>
-    <w:p>
-      <w:pPr>
-        <w:numPr>
-          <w:ilvl w:val="0"/>
-          <w:numId w:val="1010"/>
-        </w:numPr>
-        <w:pStyle w:val="Compact"/>
-      </w:pPr>
-      <w:r>
-        <w:t xml:space="preserve">Leave-one-out: loại từng nghiên cứu và tái tính pooled effect.</w:t>
-      </w:r>
-    </w:p>
-    <w:p>
-      <w:pPr>
-        <w:numPr>
-          <w:ilvl w:val="0"/>
-          <w:numId w:val="1010"/>
-        </w:numPr>
-        <w:pStyle w:val="Compact"/>
-      </w:pPr>
-      <w:r>
         <w:t xml:space="preserve">Trim-and-fill (Duval &amp; Tweedie, 2000) cho publication bias.</w:t>
       </w:r>
     </w:p>
-    <w:bookmarkEnd w:id="53"/>
-    <w:bookmarkEnd w:id="54"/>
-    <w:bookmarkStart w:id="55" w:name="Xba1727fc0da4fc8e26a315fbd09b8799e5ac3db"/>
+    <w:bookmarkEnd w:id="49"/>
+    <w:bookmarkEnd w:id="50"/>
+    <w:bookmarkStart w:id="51" w:name="Xda9461543ca17f4fffc4dad7e6165fee80c6b0c"/>
     <w:p>
       <w:pPr>
         <w:pStyle w:val="Heading2"/>
       </w:pPr>
       <w:r>
-        <w:t xml:space="preserve">6. Tóm tắt kế thừa và đóng góp mới</w:t>
+        <w:t xml:space="preserve">3.6 Tóm tắt phương pháp: Kế thừa và đóng góp mới</w:t>
       </w:r>
     </w:p>
     <w:tbl>
@@ -14699,14 +17761,14 @@
         </w:tc>
       </w:tr>
     </w:tbl>
-    <w:bookmarkEnd w:id="55"/>
-    <w:bookmarkStart w:id="56" w:name="X696efacd1a1ef1aca1868f20b67b10fe2c2b182"/>
+    <w:bookmarkEnd w:id="51"/>
+    <w:bookmarkStart w:id="52" w:name="X8731c6039be62b4d182e17d98ac2bec3a898506"/>
     <w:p>
       <w:pPr>
         <w:pStyle w:val="Heading2"/>
       </w:pPr>
       <w:r>
-        <w:t xml:space="preserve">7. Đạo đức nghiên cứu</w:t>
+        <w:t xml:space="preserve">3.7 Đạo đức nghiên cứu</w:t>
       </w:r>
     </w:p>
     <w:p>
@@ -14717,8 +17779,8 @@
         <w:t xml:space="preserve">Luận án sử dụng dữ liệu thứ cấp từ WBES — bộ dữ liệu công khai được World Bank cung cấp miễn phí cho mục đích nghiên cứu (World Bank, n.d.). Tất cả các citation theo APA 7th để ghi nhận đầy đủ công sức của các tác giả trước, tránh đạo văn. Code và dữ liệu phân tích được lưu trữ trên các nhánh chuyên biệt của repository để bảo đảm khả năng tái lập kết quả.</w:t>
       </w:r>
     </w:p>
-    <w:bookmarkEnd w:id="56"/>
-    <w:bookmarkEnd w:id="57"/>
+    <w:bookmarkEnd w:id="52"/>
+    <w:bookmarkEnd w:id="53"/>
     <w:sectPr>
       <w:pgSz w:h="16838" w:w="11906"/>
       <w:pgMar w:bottom="1134" w:left="1701" w:right="1134" w:top="1134"/>
@@ -14932,9 +17994,6 @@
     <w:abstractNumId w:val="991"/>
   </w:num>
   <w:num w:numId="1009">
-    <w:abstractNumId w:val="991"/>
-  </w:num>
-  <w:num w:numId="1010">
     <w:abstractNumId w:val="991"/>
   </w:num>
 </w:numbering>

</xml_diff>

<commit_message>
build(dist): fix 03_methodology_vi.docx source + scaffold luan_an_ctu/
Corrects dist/luan_an/03_methodology_vi.docx to use thesis/03_methodology_vi.md
(the detailed draft methodology) as source rather than chuong_3_phuong_phap_vi.md.

Creates dist/luan_an_ctu/ with 5 CTU-format chapter docx files built from
thesis/chuong_{1-5}_*_vi.md sources per build_ctu_docx.sh mapping.

https://claude.ai/code/session_01GMFmEtt6FYiJ4MKzBNCLqb
</commit_message>
<xml_diff>
--- a/dist/luan_an/03_methodology_vi.docx
+++ b/dist/luan_an/03_methodology_vi.docx
@@ -2,38 +2,77 @@
 <file path=word/document.xml><?xml version="1.0" encoding="utf-8"?>
 <w:document xmlns:w="http://schemas.openxmlformats.org/wordprocessingml/2006/main" xmlns:m="http://schemas.openxmlformats.org/officeDocument/2006/math" xmlns:r="http://schemas.openxmlformats.org/officeDocument/2006/relationships" xmlns:o="urn:schemas-microsoft-com:office:office" xmlns:v="urn:schemas-microsoft-com:vml" xmlns:w10="urn:schemas-microsoft-com:office:word" xmlns:a="http://schemas.openxmlformats.org/drawingml/2006/main" xmlns:pic="http://schemas.openxmlformats.org/drawingml/2006/picture" xmlns:wp="http://schemas.openxmlformats.org/drawingml/2006/wordprocessingDrawing">
   <w:body>
-    <w:bookmarkStart w:id="53" w:name="chương-3-phương-pháp-nghiên-cứu"/>
+    <w:bookmarkStart w:id="58" w:name="phương-pháp-nghiên-cứu"/>
     <w:p>
       <w:pPr>
         <w:pStyle w:val="Heading1"/>
       </w:pPr>
       <w:r>
-        <w:t xml:space="preserve">CHƯƠNG 3: PHƯƠNG PHÁP NGHIÊN CỨU</w:t>
-      </w:r>
-    </w:p>
-    <w:p>
-      <w:r>
-        <w:pict>
-          <v:rect style="width:0;height:1.5pt" o:hralign="center" o:hrstd="t" o:hr="t"/>
-        </w:pict>
-      </w:r>
-    </w:p>
-    <w:bookmarkStart w:id="22" w:name="X5941ec2c11a959ab436d2688aecb01c885af8d5"/>
+        <w:t xml:space="preserve">Phương pháp nghiên cứu</w:t>
+      </w:r>
+    </w:p>
+    <w:p>
+      <w:pPr>
+        <w:pStyle w:val="FirstParagraph"/>
+      </w:pPr>
+      <w:r>
+        <w:t xml:space="preserve">File này trình bày thiết kế nghiên cứu, nguồn dữ liệu, đo lường biến, mô hình phân tích và kiểm định độ vững. Mỗi thành phần đều được giải thích theo hai loại cơ sở:</w:t>
+      </w:r>
+    </w:p>
+    <w:p>
+      <w:pPr>
+        <w:numPr>
+          <w:ilvl w:val="0"/>
+          <w:numId w:val="1001"/>
+        </w:numPr>
+        <w:pStyle w:val="Compact"/>
+      </w:pPr>
+      <w:r>
+        <w:rPr>
+          <w:bCs/>
+          <w:b/>
+        </w:rPr>
+        <w:t xml:space="preserve">Cơ sở kế thừa</w:t>
+      </w:r>
+      <w:r>
+        <w:t xml:space="preserve">: phương pháp đã được công nhận trong literature, kèm citation APA 7th.</w:t>
+      </w:r>
+    </w:p>
+    <w:p>
+      <w:pPr>
+        <w:numPr>
+          <w:ilvl w:val="0"/>
+          <w:numId w:val="1001"/>
+        </w:numPr>
+        <w:pStyle w:val="Compact"/>
+      </w:pPr>
+      <w:r>
+        <w:rPr>
+          <w:bCs/>
+          <w:b/>
+        </w:rPr>
+        <w:t xml:space="preserve">Đóng góp mới/điều chỉnh</w:t>
+      </w:r>
+      <w:r>
+        <w:t xml:space="preserve">: những điểm mà luận án cải tiến hoặc tổ chức mới, kèm lập luận rõ ràng.</w:t>
+      </w:r>
+    </w:p>
+    <w:bookmarkStart w:id="22" w:name="X56424e3208dc91a2885d1c297474f714b95bcea"/>
     <w:p>
       <w:pPr>
         <w:pStyle w:val="Heading2"/>
       </w:pPr>
       <w:r>
-        <w:t xml:space="preserve">3.1 Thiết kế nghiên cứu tổng thể</w:t>
-      </w:r>
-    </w:p>
-    <w:bookmarkStart w:id="20" w:name="X0ad18f2ea0f327e90ab493b140585d0f339e352"/>
+        <w:t xml:space="preserve">1. Thiết kế nghiên cứu tổng thể</w:t>
+      </w:r>
+    </w:p>
+    <w:bookmarkStart w:id="20" w:name="X754c796eb9648f308f08c432f0050cd9b94c6c8"/>
     <w:p>
       <w:pPr>
         <w:pStyle w:val="Heading3"/>
       </w:pPr>
       <w:r>
-        <w:t xml:space="preserve">3.1.1 Loại thiết kế</w:t>
+        <w:t xml:space="preserve">1.1 Loại thiết kế</w:t>
       </w:r>
     </w:p>
     <w:p>
@@ -107,13 +146,13 @@
       </w:r>
     </w:p>
     <w:bookmarkEnd w:id="20"/>
-    <w:bookmarkStart w:id="21" w:name="Xfd5ae7e7a2cc0c8be87a7a0d68c06af783c9b59"/>
+    <w:bookmarkStart w:id="21" w:name="X248f0021a5a12709954fcf24a7f49cf9c0e965e"/>
     <w:p>
       <w:pPr>
         <w:pStyle w:val="Heading3"/>
       </w:pPr>
       <w:r>
-        <w:t xml:space="preserve">3.1.2 Quy trình nghiên cứu</w:t>
+        <w:t xml:space="preserve">1.2 Quy trình nghiên cứu</w:t>
       </w:r>
     </w:p>
     <w:p>
@@ -142,22 +181,22 @@
     </w:p>
     <w:bookmarkEnd w:id="21"/>
     <w:bookmarkEnd w:id="22"/>
-    <w:bookmarkStart w:id="26" w:name="Xba2b2f63509bf3587653379b96fe905a4c38721"/>
+    <w:bookmarkStart w:id="26" w:name="Xb099187d4d77291265428c7dacb6385eb4b3527"/>
     <w:p>
       <w:pPr>
         <w:pStyle w:val="Heading2"/>
       </w:pPr>
       <w:r>
-        <w:t xml:space="preserve">3.2 Phase 1 — Meta-analysis 1982–2026</w:t>
-      </w:r>
-    </w:p>
-    <w:bookmarkStart w:id="23" w:name="X6548c445f253576ab77db0afe7759a99accc5ae"/>
+        <w:t xml:space="preserve">2. Phase 1: Meta-analysis 1982–2026</w:t>
+      </w:r>
+    </w:p>
+    <w:bookmarkStart w:id="23" w:name="X1551a254f454544efc95505360b4c5c9d00b320"/>
     <w:p>
       <w:pPr>
         <w:pStyle w:val="Heading3"/>
       </w:pPr>
       <w:r>
-        <w:t xml:space="preserve">3.2.1 Cơ sở kế thừa</w:t>
+        <w:t xml:space="preserve">2.1 Cơ sở kế thừa</w:t>
       </w:r>
     </w:p>
     <w:p>
@@ -211,20 +250,20 @@
       </w:r>
     </w:p>
     <w:bookmarkEnd w:id="23"/>
-    <w:bookmarkStart w:id="24" w:name="X4cc0e11cc2b0a899e7494b6932e6c46974fcac7"/>
+    <w:bookmarkStart w:id="24" w:name="X0c1e6180491331dbef38f8b5cf97fc0ecad3881"/>
     <w:p>
       <w:pPr>
         <w:pStyle w:val="Heading3"/>
       </w:pPr>
       <w:r>
-        <w:t xml:space="preserve">3.2.2 Đóng góp mới/điều chỉnh</w:t>
+        <w:t xml:space="preserve">2.2 Đóng góp mới/điều chỉnh</w:t>
       </w:r>
     </w:p>
     <w:p>
       <w:pPr>
         <w:numPr>
           <w:ilvl w:val="0"/>
-          <w:numId w:val="1001"/>
+          <w:numId w:val="1002"/>
         </w:numPr>
         <w:pStyle w:val="Compact"/>
       </w:pPr>
@@ -256,7 +295,7 @@
       <w:pPr>
         <w:numPr>
           <w:ilvl w:val="0"/>
-          <w:numId w:val="1001"/>
+          <w:numId w:val="1002"/>
         </w:numPr>
         <w:pStyle w:val="Compact"/>
       </w:pPr>
@@ -275,7 +314,7 @@
       <w:pPr>
         <w:numPr>
           <w:ilvl w:val="0"/>
-          <w:numId w:val="1001"/>
+          <w:numId w:val="1002"/>
         </w:numPr>
         <w:pStyle w:val="Compact"/>
       </w:pPr>
@@ -294,7 +333,7 @@
       <w:pPr>
         <w:numPr>
           <w:ilvl w:val="0"/>
-          <w:numId w:val="1001"/>
+          <w:numId w:val="1002"/>
         </w:numPr>
         <w:pStyle w:val="Compact"/>
       </w:pPr>
@@ -310,13 +349,13 @@
       </w:r>
     </w:p>
     <w:bookmarkEnd w:id="24"/>
-    <w:bookmarkStart w:id="25" w:name="Xae02c1433054ac6c9ee47047d46e66bd13cdc6b"/>
+    <w:bookmarkStart w:id="25" w:name="X8ff9d76b57ab4183f46a16fef6b447d1a7ef01d"/>
     <w:p>
       <w:pPr>
         <w:pStyle w:val="Heading3"/>
       </w:pPr>
       <w:r>
-        <w:t xml:space="preserve">3.2.3 Quy trình PRISMA</w:t>
+        <w:t xml:space="preserve">2.3 Quy trình PRISMA</w:t>
       </w:r>
     </w:p>
     <w:p>
@@ -362,22 +401,22 @@
     </w:p>
     <w:bookmarkEnd w:id="25"/>
     <w:bookmarkEnd w:id="26"/>
-    <w:bookmarkStart w:id="32" w:name="X2c6e58f89857f64ac5f06ae1a6ddd1deb030675"/>
+    <w:bookmarkStart w:id="35" w:name="X6aa474f7b2e6804e45c9b533f4c4995c8a51f0e"/>
     <w:p>
       <w:pPr>
         <w:pStyle w:val="Heading2"/>
       </w:pPr>
       <w:r>
-        <w:t xml:space="preserve">3.3 Phase 2 — Phân tích thực nghiệm đa quốc gia</w:t>
-      </w:r>
-    </w:p>
-    <w:bookmarkStart w:id="27" w:name="Xf7fc23c09ac90b299b0f14681e1df5ca5c5e569"/>
+        <w:t xml:space="preserve">3. Phase 2: Multi-country empirical analysis</w:t>
+      </w:r>
+    </w:p>
+    <w:bookmarkStart w:id="27" w:name="X84ced60e62ea90934832891098abf01a4d917e5"/>
     <w:p>
       <w:pPr>
         <w:pStyle w:val="Heading3"/>
       </w:pPr>
       <w:r>
-        <w:t xml:space="preserve">3.3.1 Nguồn dữ liệu</w:t>
+        <w:t xml:space="preserve">3.1 Nguồn dữ liệu</w:t>
       </w:r>
     </w:p>
     <w:p>
@@ -464,13 +503,13 @@
       </w:r>
     </w:p>
     <w:bookmarkEnd w:id="27"/>
-    <w:bookmarkStart w:id="28" w:name="X2013f18ac82d23d08403a6b9339b953a5fef2fa"/>
+    <w:bookmarkStart w:id="28" w:name="X627d9e57359624ba53d60ada46440408c767234"/>
     <w:p>
       <w:pPr>
         <w:pStyle w:val="Heading3"/>
       </w:pPr>
       <w:r>
-        <w:t xml:space="preserve">3.3.2 Đo lường biến phụ thuộc — Hiệu quả hoạt động</w:t>
+        <w:t xml:space="preserve">3.2 Đo lường biến phụ thuộc — Hiệu quả hoạt động</w:t>
       </w:r>
     </w:p>
     <w:p>
@@ -619,13 +658,13 @@
       </w:r>
     </w:p>
     <w:bookmarkEnd w:id="28"/>
-    <w:bookmarkStart w:id="29" w:name="X40a8e724c89b196c45c024f01b1458111f91588"/>
+    <w:bookmarkStart w:id="29" w:name="X15f8964cdacf2e18287cd2f7dddc106f078f343"/>
     <w:p>
       <w:pPr>
         <w:pStyle w:val="Heading3"/>
       </w:pPr>
       <w:r>
-        <w:t xml:space="preserve">3.3.3 Đo lường biến độc lập — Quốc tế hóa</w:t>
+        <w:t xml:space="preserve">3.3 Đo lường biến độc lập — Quốc tế hóa</w:t>
       </w:r>
     </w:p>
     <w:p>
@@ -772,30 +811,27 @@
       </w:r>
     </w:p>
     <w:bookmarkEnd w:id="29"/>
-    <w:bookmarkStart w:id="30" w:name="Xa7342efa9e4440bffeb50b266b6e2d5207de558"/>
+    <w:bookmarkStart w:id="33" w:name="Xdd2644898f5d54c5cc66b5de84b6ed843e574dc"/>
     <w:p>
       <w:pPr>
         <w:pStyle w:val="Heading3"/>
       </w:pPr>
       <w:r>
-        <w:t xml:space="preserve">3.3.4 Đo lường biến điều tiết</w:t>
+        <w:t xml:space="preserve">3.4 Đo lường biến điều tiết</w:t>
+      </w:r>
+    </w:p>
+    <w:bookmarkStart w:id="30" w:name="Xc9447eee4507cc41fc1bfd78b7a464443ed9908"/>
+    <w:p>
+      <w:pPr>
+        <w:pStyle w:val="Heading4"/>
+      </w:pPr>
+      <w:r>
+        <w:t xml:space="preserve">3.4.1 Digital constructs (TCI và DAI)</w:t>
       </w:r>
     </w:p>
     <w:p>
       <w:pPr>
         <w:pStyle w:val="FirstParagraph"/>
-      </w:pPr>
-      <w:r>
-        <w:rPr>
-          <w:bCs/>
-          <w:b/>
-        </w:rPr>
-        <w:t xml:space="preserve">a) Digital constructs (TCI và DAI)</w:t>
-      </w:r>
-    </w:p>
-    <w:p>
-      <w:pPr>
-        <w:pStyle w:val="BodyText"/>
       </w:pPr>
       <w:r>
         <w:t xml:space="preserve">Luận án phân biệt rõ hai construct:</w:t>
@@ -805,7 +841,7 @@
       <w:pPr>
         <w:numPr>
           <w:ilvl w:val="0"/>
-          <w:numId w:val="1002"/>
+          <w:numId w:val="1003"/>
         </w:numPr>
         <w:pStyle w:val="Compact"/>
       </w:pPr>
@@ -824,7 +860,7 @@
       <w:pPr>
         <w:numPr>
           <w:ilvl w:val="0"/>
-          <w:numId w:val="1002"/>
+          <w:numId w:val="1003"/>
         </w:numPr>
         <w:pStyle w:val="Compact"/>
       </w:pPr>
@@ -900,21 +936,19 @@
         <w:t xml:space="preserve">trong bối cảnh WBES, đảm bảo construct purity ở 47 nền kinh tế châu Á và Pacific, với pipeline hòa hợp 3 thế hệ schema. Phân tách TCI và DAI theo (i) Bharadwaj et al. (2013) — IT capability vs digital business strategy có nomological nets khác nhau; (ii) phân tầng 3 cấp của Verhoef et al. (2021) — digitization, digitalization, digital transformation; (iii) truyền thống Lall (1992) và Cohen &amp; Levinthal (1990) coi technological capability là chiều sâu năng lực nội tại (absorptive capacity), khác về bản chất với digital adoption ở giao diện ngoại tại; (iv) resource-orchestration logic của Bhandari et al. (2023) cho I→P relationship; và (v) 4 tiêu chí formative composite của Coltman et al. (2008) — đảm bảo TCI và DAI là hai composite độc lập.</w:t>
       </w:r>
     </w:p>
-    <w:p>
-      <w:pPr>
-        <w:pStyle w:val="BodyText"/>
-      </w:pPr>
-      <w:r>
-        <w:rPr>
-          <w:bCs/>
-          <w:b/>
-        </w:rPr>
-        <w:t xml:space="preserve">b) Biến thể chế</w:t>
-      </w:r>
-    </w:p>
-    <w:p>
-      <w:pPr>
-        <w:pStyle w:val="BodyText"/>
+    <w:bookmarkEnd w:id="30"/>
+    <w:bookmarkStart w:id="31" w:name="X675dba3bc66f04bdb35ea3e98db6777f7453517"/>
+    <w:p>
+      <w:pPr>
+        <w:pStyle w:val="Heading4"/>
+      </w:pPr>
+      <w:r>
+        <w:t xml:space="preserve">3.4.2 Institutional variables</w:t>
+      </w:r>
+    </w:p>
+    <w:p>
+      <w:pPr>
+        <w:pStyle w:val="FirstParagraph"/>
       </w:pPr>
       <w:r>
         <w:rPr>
@@ -942,21 +976,19 @@
         <w:t xml:space="preserve">: Khanna và Palepu (2010) với institutional voids; North (1990) với institutional analysis; Marano et al. (2016) với meta-analytic evidence về institutional moderators.</w:t>
       </w:r>
     </w:p>
-    <w:p>
-      <w:pPr>
-        <w:pStyle w:val="BodyText"/>
-      </w:pPr>
-      <w:r>
-        <w:rPr>
-          <w:bCs/>
-          <w:b/>
-        </w:rPr>
-        <w:t xml:space="preserve">c) Đặc điểm nhà quản trị cấp cao</w:t>
-      </w:r>
-    </w:p>
-    <w:p>
-      <w:pPr>
-        <w:pStyle w:val="BodyText"/>
+    <w:bookmarkEnd w:id="31"/>
+    <w:bookmarkStart w:id="32" w:name="Xafb7051784bd2190b9c0ec64eb794b969a7e6b4"/>
+    <w:p>
+      <w:pPr>
+        <w:pStyle w:val="Heading4"/>
+      </w:pPr>
+      <w:r>
+        <w:t xml:space="preserve">3.4.3 Top manager characteristics</w:t>
+      </w:r>
+    </w:p>
+    <w:p>
+      <w:pPr>
+        <w:pStyle w:val="FirstParagraph"/>
       </w:pPr>
       <w:r>
         <w:rPr>
@@ -999,14 +1031,15 @@
         <w:t xml:space="preserve">: chỉ trong subset có đủ dữ liệu; nếu thiếu, đưa vào robustness chứ không bắt buộc trong mô hình chính.</w:t>
       </w:r>
     </w:p>
-    <w:bookmarkEnd w:id="30"/>
-    <w:bookmarkStart w:id="31" w:name="X242c994c02f3871ea8359747a875373a8cd3eca"/>
+    <w:bookmarkEnd w:id="32"/>
+    <w:bookmarkEnd w:id="33"/>
+    <w:bookmarkStart w:id="34" w:name="X47e64c38922de9c9938d7912558eba6c86d3a28"/>
     <w:p>
       <w:pPr>
         <w:pStyle w:val="Heading3"/>
       </w:pPr>
       <w:r>
-        <w:t xml:space="preserve">3.3.5 Biến kiểm soát</w:t>
+        <w:t xml:space="preserve">3.5 Biến kiểm soát</w:t>
       </w:r>
     </w:p>
     <w:p>
@@ -1043,24 +1076,24 @@
         <w:t xml:space="preserve">: chuẩn trong nghiên cứu WBES và IB (Aterido et al., 2011; Ayyagari et al., 2011).</w:t>
       </w:r>
     </w:p>
-    <w:bookmarkEnd w:id="31"/>
-    <w:bookmarkEnd w:id="32"/>
-    <w:bookmarkStart w:id="44" w:name="Xd77d50b091b2ed22b6b5e4ab46917b297ec7074"/>
+    <w:bookmarkEnd w:id="34"/>
+    <w:bookmarkEnd w:id="35"/>
+    <w:bookmarkStart w:id="49" w:name="X739c39ba72bd4ab9a65ae6cfaca8e78ae4b0f0d"/>
     <w:p>
       <w:pPr>
         <w:pStyle w:val="Heading2"/>
       </w:pPr>
       <w:r>
-        <w:t xml:space="preserve">3.4 Mô hình phân tích</w:t>
-      </w:r>
-    </w:p>
-    <w:bookmarkStart w:id="33" w:name="Xd5826715f3ece4e9c39fdb63b501527e807067b"/>
+        <w:t xml:space="preserve">4. Mô hình phân tích</w:t>
+      </w:r>
+    </w:p>
+    <w:bookmarkStart w:id="36" w:name="X4c78f5166bf22e57c1f525071727cb59025b68d"/>
     <w:p>
       <w:pPr>
         <w:pStyle w:val="Heading3"/>
       </w:pPr>
       <w:r>
-        <w:t xml:space="preserve">3.4.1 Mô hình meta-analysis</w:t>
+        <w:t xml:space="preserve">4.1 Mô hình meta-analysis</w:t>
       </w:r>
     </w:p>
     <w:p>
@@ -1293,14 +1326,14 @@
         <w:t xml:space="preserve">: chuẩn meta-analysis trong quản trị chiến lược (Combs et al., 2011; Aguinis et al., 2011).</w:t>
       </w:r>
     </w:p>
-    <w:bookmarkEnd w:id="33"/>
-    <w:bookmarkStart w:id="34" w:name="X91b9254fb543667278f4d6a826ba3dee0d78b94"/>
+    <w:bookmarkEnd w:id="36"/>
+    <w:bookmarkStart w:id="37" w:name="X27365d5351c4f2028e401b959ec157ce9c1b5c2"/>
     <w:p>
       <w:pPr>
         <w:pStyle w:val="Heading3"/>
       </w:pPr>
       <w:r>
-        <w:t xml:space="preserve">3.4.2 Mô hình empirical — Tuyến tính cơ bản</w:t>
+        <w:t xml:space="preserve">4.2 Mô hình empirical — Tuyến tính cơ bản</w:t>
       </w:r>
     </w:p>
     <w:p>
@@ -1482,14 +1515,14 @@
         <w:t xml:space="preserve">là vector control variables.</w:t>
       </w:r>
     </w:p>
-    <w:bookmarkEnd w:id="34"/>
-    <w:bookmarkStart w:id="35" w:name="Xd036ade5cbc6fe7e16e65a122bd3e74624d8208"/>
+    <w:bookmarkEnd w:id="37"/>
+    <w:bookmarkStart w:id="38" w:name="Xe9bba9a80ef10577157c3d15edb876549972c2d"/>
     <w:p>
       <w:pPr>
         <w:pStyle w:val="Heading3"/>
       </w:pPr>
       <w:r>
-        <w:t xml:space="preserve">3.4.3 Mô hình phi tuyến (H1)</w:t>
+        <w:t xml:space="preserve">4.3 Mô hình phi tuyến (H1)</w:t>
       </w:r>
     </w:p>
     <w:p>
@@ -2104,27 +2137,28 @@
         <w:t xml:space="preserve">.</w:t>
       </w:r>
     </w:p>
-    <w:bookmarkEnd w:id="35"/>
-    <w:bookmarkStart w:id="36" w:name="X1770fb5e1eb3ddd0dda21d7e660ee6e6f352fa1"/>
+    <w:bookmarkEnd w:id="38"/>
+    <w:bookmarkStart w:id="41" w:name="X51b5e48835a9a5e2281d2341b4476bdb9f6a4ee"/>
     <w:p>
       <w:pPr>
         <w:pStyle w:val="Heading3"/>
       </w:pPr>
       <w:r>
-        <w:t xml:space="preserve">3.4.4 Mô hình moderation (H2–H6)</w:t>
+        <w:t xml:space="preserve">4.4 Mô hình moderation (H2–H6)</w:t>
+      </w:r>
+    </w:p>
+    <w:bookmarkStart w:id="39" w:name="two-way-interaction-h2-h3"/>
+    <w:p>
+      <w:pPr>
+        <w:pStyle w:val="Heading4"/>
+      </w:pPr>
+      <w:r>
+        <w:t xml:space="preserve">Two-way interaction (H2, H3)</w:t>
       </w:r>
     </w:p>
     <w:p>
       <w:pPr>
         <w:pStyle w:val="FirstParagraph"/>
-      </w:pPr>
-      <w:r>
-        <w:t xml:space="preserve">**Two-way interaction (H2, H3)</w:t>
-      </w:r>
-    </w:p>
-    <w:p>
-      <w:pPr>
-        <w:pStyle w:val="BodyText"/>
       </w:pPr>
       <m:oMathPara>
         <m:oMathParaPr>
@@ -2511,17 +2545,19 @@
         <w:t xml:space="preserve">là moderator (TCI hoặc DAI).</w:t>
       </w:r>
     </w:p>
-    <w:p>
-      <w:pPr>
-        <w:pStyle w:val="BodyText"/>
-      </w:pPr>
-      <w:r>
-        <w:t xml:space="preserve">**Three-way interaction (synthesis)</w:t>
-      </w:r>
-    </w:p>
-    <w:p>
-      <w:pPr>
-        <w:pStyle w:val="BodyText"/>
+    <w:bookmarkEnd w:id="39"/>
+    <w:bookmarkStart w:id="40" w:name="three-way-interaction-synthesis"/>
+    <w:p>
+      <w:pPr>
+        <w:pStyle w:val="Heading4"/>
+      </w:pPr>
+      <w:r>
+        <w:t xml:space="preserve">Three-way interaction (synthesis)</w:t>
+      </w:r>
+    </w:p>
+    <w:p>
+      <w:pPr>
+        <w:pStyle w:val="FirstParagraph"/>
       </w:pPr>
       <m:oMathPara>
         <m:oMathParaPr>
@@ -2897,14 +2933,15 @@
         <w:t xml:space="preserve">: three-way moderation digital × institutional × manager trong bối cảnh châu Á và Pacific với 47 nước chưa được kiểm định trước đây.</w:t>
       </w:r>
     </w:p>
-    <w:bookmarkEnd w:id="36"/>
-    <w:bookmarkStart w:id="37" w:name="Xaf6b17085c51fbfd36dab2a1029a4e6f9b0638d"/>
+    <w:bookmarkEnd w:id="40"/>
+    <w:bookmarkEnd w:id="41"/>
+    <w:bookmarkStart w:id="42" w:name="Xb324e1905a61cd1592d7ebf92cf5cd7957d9e09"/>
     <w:p>
       <w:pPr>
         <w:pStyle w:val="Heading3"/>
       </w:pPr>
       <w:r>
-        <w:t xml:space="preserve">3.4.5 Mô hình temporal heterogeneity (H6)</w:t>
+        <w:t xml:space="preserve">4.5 Mô hình temporal heterogeneity (H6)</w:t>
       </w:r>
     </w:p>
     <w:p>
@@ -3376,14 +3413,14 @@
         <w:t xml:space="preserve">: áp dụng cho China 2012 và 2024 để kiểm định stability của cubic turning point (~47,8% FSTS) sau hơn một thập kỷ chuyển đổi số.</w:t>
       </w:r>
     </w:p>
-    <w:bookmarkEnd w:id="37"/>
-    <w:bookmarkStart w:id="38" w:name="Xe9c37da457fcc384a1a2e7197bb3bb5235b6f8f"/>
+    <w:bookmarkEnd w:id="42"/>
+    <w:bookmarkStart w:id="43" w:name="Xb935b07a7139bdf4772bb962fde35bc1f7deef3"/>
     <w:p>
       <w:pPr>
         <w:pStyle w:val="Heading3"/>
       </w:pPr>
       <w:r>
-        <w:t xml:space="preserve">3.4.5.1 Mô hình cụ thể — Nghiên cứu 3 (Việt Nam, WBES 2009/2015/2023)</w:t>
+        <w:t xml:space="preserve">4.5.1 Mô hình cụ thể — Nghiên cứu 3 (Việt Nam, WBES 2009/2015/2023)</w:t>
       </w:r>
     </w:p>
     <w:p>
@@ -3398,7 +3435,7 @@
       <w:pPr>
         <w:numPr>
           <w:ilvl w:val="0"/>
-          <w:numId w:val="1003"/>
+          <w:numId w:val="1004"/>
         </w:numPr>
         <w:pStyle w:val="Compact"/>
       </w:pPr>
@@ -3420,7 +3457,7 @@
       <w:pPr>
         <w:numPr>
           <w:ilvl w:val="0"/>
-          <w:numId w:val="1003"/>
+          <w:numId w:val="1004"/>
         </w:numPr>
         <w:pStyle w:val="Compact"/>
       </w:pPr>
@@ -3442,7 +3479,7 @@
       <w:pPr>
         <w:numPr>
           <w:ilvl w:val="0"/>
-          <w:numId w:val="1003"/>
+          <w:numId w:val="1004"/>
         </w:numPr>
         <w:pStyle w:val="Compact"/>
       </w:pPr>
@@ -3464,7 +3501,7 @@
       <w:pPr>
         <w:numPr>
           <w:ilvl w:val="0"/>
-          <w:numId w:val="1003"/>
+          <w:numId w:val="1004"/>
         </w:numPr>
         <w:pStyle w:val="Compact"/>
       </w:pPr>
@@ -3486,7 +3523,7 @@
       <w:pPr>
         <w:numPr>
           <w:ilvl w:val="0"/>
-          <w:numId w:val="1003"/>
+          <w:numId w:val="1004"/>
         </w:numPr>
         <w:pStyle w:val="Compact"/>
       </w:pPr>
@@ -3508,7 +3545,7 @@
       <w:pPr>
         <w:numPr>
           <w:ilvl w:val="0"/>
-          <w:numId w:val="1003"/>
+          <w:numId w:val="1004"/>
         </w:numPr>
         <w:pStyle w:val="Compact"/>
       </w:pPr>
@@ -3527,7 +3564,7 @@
       <w:pPr>
         <w:numPr>
           <w:ilvl w:val="0"/>
-          <w:numId w:val="1003"/>
+          <w:numId w:val="1004"/>
         </w:numPr>
         <w:pStyle w:val="Compact"/>
       </w:pPr>
@@ -4907,7 +4944,7 @@
           <w:bCs/>
           <w:b/>
         </w:rPr>
-        <w:t xml:space="preserve">M4 — Điều tiết CSS/DAI (H3 thăm dò):</w:t>
+        <w:t xml:space="preserve">M4 — Điều tiết CSS/DAI (H4 thăm dò):</w:t>
       </w:r>
     </w:p>
     <w:p>
@@ -7046,7 +7083,7 @@
               <w:jc w:val="left"/>
             </w:pPr>
             <w:r>
-              <w:t xml:space="preserve">Số hoá Tier-1 (H3 thăm dò)</w:t>
+              <w:t xml:space="preserve">Số hoá Tier-1 (H4 thăm dò)</w:t>
             </w:r>
           </w:p>
         </w:tc>
@@ -7302,14 +7339,14 @@
         </w:tc>
       </w:tr>
     </w:tbl>
-    <w:bookmarkEnd w:id="38"/>
-    <w:bookmarkStart w:id="39" w:name="Xc82b1aa0784a668aba43881d1c592a6ad08e5ee"/>
+    <w:bookmarkEnd w:id="43"/>
+    <w:bookmarkStart w:id="44" w:name="X1a84e23bcffcf0b809a67054bf546d98a0649dd"/>
     <w:p>
       <w:pPr>
         <w:pStyle w:val="Heading3"/>
       </w:pPr>
       <w:r>
-        <w:t xml:space="preserve">3.4.5.2 Mô hình cụ thể — Nghiên cứu 4 (Singapore, WBES 2023)</w:t>
+        <w:t xml:space="preserve">4.5.2 Mô hình cụ thể — Nghiên cứu 4 (Singapore, WBES 2023)</w:t>
       </w:r>
     </w:p>
     <w:p>
@@ -7324,7 +7361,7 @@
       <w:pPr>
         <w:numPr>
           <w:ilvl w:val="0"/>
-          <w:numId w:val="1004"/>
+          <w:numId w:val="1005"/>
         </w:numPr>
         <w:pStyle w:val="Compact"/>
       </w:pPr>
@@ -7346,7 +7383,7 @@
       <w:pPr>
         <w:numPr>
           <w:ilvl w:val="0"/>
-          <w:numId w:val="1004"/>
+          <w:numId w:val="1005"/>
         </w:numPr>
         <w:pStyle w:val="Compact"/>
       </w:pPr>
@@ -7368,7 +7405,7 @@
       <w:pPr>
         <w:numPr>
           <w:ilvl w:val="0"/>
-          <w:numId w:val="1004"/>
+          <w:numId w:val="1005"/>
         </w:numPr>
         <w:pStyle w:val="Compact"/>
       </w:pPr>
@@ -7390,7 +7427,7 @@
       <w:pPr>
         <w:numPr>
           <w:ilvl w:val="0"/>
-          <w:numId w:val="1004"/>
+          <w:numId w:val="1005"/>
         </w:numPr>
         <w:pStyle w:val="Compact"/>
       </w:pPr>
@@ -7412,7 +7449,7 @@
       <w:pPr>
         <w:numPr>
           <w:ilvl w:val="0"/>
-          <w:numId w:val="1004"/>
+          <w:numId w:val="1005"/>
         </w:numPr>
         <w:pStyle w:val="Compact"/>
       </w:pPr>
@@ -7450,7 +7487,7 @@
       <w:pPr>
         <w:numPr>
           <w:ilvl w:val="0"/>
-          <w:numId w:val="1004"/>
+          <w:numId w:val="1005"/>
         </w:numPr>
         <w:pStyle w:val="Compact"/>
       </w:pPr>
@@ -7495,7 +7532,7 @@
       <w:pPr>
         <w:numPr>
           <w:ilvl w:val="0"/>
-          <w:numId w:val="1004"/>
+          <w:numId w:val="1005"/>
         </w:numPr>
         <w:pStyle w:val="Compact"/>
       </w:pPr>
@@ -7514,7 +7551,7 @@
       <w:pPr>
         <w:numPr>
           <w:ilvl w:val="0"/>
-          <w:numId w:val="1004"/>
+          <w:numId w:val="1005"/>
         </w:numPr>
         <w:pStyle w:val="Compact"/>
       </w:pPr>
@@ -8254,14 +8291,14 @@
         </w:pict>
       </w:r>
     </w:p>
-    <w:bookmarkEnd w:id="39"/>
-    <w:bookmarkStart w:id="40" w:name="Xd7af671c66f92fda4c51769a4f141e153734d80"/>
+    <w:bookmarkEnd w:id="44"/>
+    <w:bookmarkStart w:id="45" w:name="X9ef80487c12e0f5dad14bc0925ba05bca166c52"/>
     <w:p>
       <w:pPr>
         <w:pStyle w:val="Heading3"/>
       </w:pPr>
       <w:r>
-        <w:t xml:space="preserve">3.4.5.3 Mô hình cụ thể — Nghiên cứu 5 (Trung Quốc, WBES 2012 và 2024)</w:t>
+        <w:t xml:space="preserve">4.5.3 Mô hình cụ thể — Nghiên cứu 5 (Trung Quốc, WBES 2012 và 2024)</w:t>
       </w:r>
     </w:p>
     <w:p>
@@ -8276,7 +8313,7 @@
       <w:pPr>
         <w:numPr>
           <w:ilvl w:val="0"/>
-          <w:numId w:val="1005"/>
+          <w:numId w:val="1006"/>
         </w:numPr>
         <w:pStyle w:val="Compact"/>
       </w:pPr>
@@ -8298,7 +8335,7 @@
       <w:pPr>
         <w:numPr>
           <w:ilvl w:val="0"/>
-          <w:numId w:val="1005"/>
+          <w:numId w:val="1006"/>
         </w:numPr>
         <w:pStyle w:val="Compact"/>
       </w:pPr>
@@ -8320,7 +8357,7 @@
       <w:pPr>
         <w:numPr>
           <w:ilvl w:val="0"/>
-          <w:numId w:val="1005"/>
+          <w:numId w:val="1006"/>
         </w:numPr>
         <w:pStyle w:val="Compact"/>
       </w:pPr>
@@ -8342,7 +8379,7 @@
       <w:pPr>
         <w:numPr>
           <w:ilvl w:val="0"/>
-          <w:numId w:val="1005"/>
+          <w:numId w:val="1006"/>
         </w:numPr>
         <w:pStyle w:val="Compact"/>
       </w:pPr>
@@ -8364,7 +8401,7 @@
       <w:pPr>
         <w:numPr>
           <w:ilvl w:val="0"/>
-          <w:numId w:val="1005"/>
+          <w:numId w:val="1006"/>
         </w:numPr>
         <w:pStyle w:val="Compact"/>
       </w:pPr>
@@ -8409,7 +8446,7 @@
       <w:pPr>
         <w:numPr>
           <w:ilvl w:val="0"/>
-          <w:numId w:val="1005"/>
+          <w:numId w:val="1006"/>
         </w:numPr>
         <w:pStyle w:val="Compact"/>
       </w:pPr>
@@ -9215,14 +9252,14 @@
         </w:pict>
       </w:r>
     </w:p>
-    <w:bookmarkEnd w:id="40"/>
-    <w:bookmarkStart w:id="42" w:name="Xd325577eb4b3aeedca208ff99575fa4709eddc8"/>
+    <w:bookmarkEnd w:id="45"/>
+    <w:bookmarkStart w:id="46" w:name="X4e8b67ecad9724beebae0d23d08617f128f911b"/>
     <w:p>
       <w:pPr>
         <w:pStyle w:val="Heading3"/>
       </w:pPr>
       <w:r>
-        <w:t xml:space="preserve">3.4.5.4 Mô hình cụ thể — Nghiên cứu 7 (Đa quốc gia châu Á, WBES 2003–2025)</w:t>
+        <w:t xml:space="preserve">4.5.4 Mô hình cụ thể — Nghiên cứu 7 (Đa quốc gia châu Á, WBES 2003–2025)</w:t>
       </w:r>
     </w:p>
     <w:p>
@@ -9253,7 +9290,7 @@
       <w:pPr>
         <w:numPr>
           <w:ilvl w:val="0"/>
-          <w:numId w:val="1006"/>
+          <w:numId w:val="1007"/>
         </w:numPr>
         <w:pStyle w:val="Compact"/>
       </w:pPr>
@@ -9272,7 +9309,7 @@
       <w:pPr>
         <w:numPr>
           <w:ilvl w:val="0"/>
-          <w:numId w:val="1006"/>
+          <w:numId w:val="1007"/>
         </w:numPr>
         <w:pStyle w:val="Compact"/>
       </w:pPr>
@@ -9291,7 +9328,7 @@
       <w:pPr>
         <w:numPr>
           <w:ilvl w:val="0"/>
-          <w:numId w:val="1006"/>
+          <w:numId w:val="1007"/>
         </w:numPr>
         <w:pStyle w:val="Compact"/>
       </w:pPr>
@@ -9310,7 +9347,7 @@
       <w:pPr>
         <w:numPr>
           <w:ilvl w:val="0"/>
-          <w:numId w:val="1006"/>
+          <w:numId w:val="1007"/>
         </w:numPr>
         <w:pStyle w:val="Compact"/>
       </w:pPr>
@@ -9329,7 +9366,7 @@
       <w:pPr>
         <w:numPr>
           <w:ilvl w:val="0"/>
-          <w:numId w:val="1006"/>
+          <w:numId w:val="1007"/>
         </w:numPr>
         <w:pStyle w:val="Compact"/>
       </w:pPr>
@@ -9348,7 +9385,7 @@
       <w:pPr>
         <w:numPr>
           <w:ilvl w:val="0"/>
-          <w:numId w:val="1006"/>
+          <w:numId w:val="1007"/>
         </w:numPr>
         <w:pStyle w:val="Compact"/>
       </w:pPr>
@@ -9367,7 +9404,7 @@
       <w:pPr>
         <w:numPr>
           <w:ilvl w:val="0"/>
-          <w:numId w:val="1006"/>
+          <w:numId w:val="1007"/>
         </w:numPr>
         <w:pStyle w:val="Compact"/>
       </w:pPr>
@@ -9386,7 +9423,7 @@
       <w:pPr>
         <w:numPr>
           <w:ilvl w:val="0"/>
-          <w:numId w:val="1006"/>
+          <w:numId w:val="1007"/>
         </w:numPr>
         <w:pStyle w:val="Compact"/>
       </w:pPr>
@@ -9405,7 +9442,7 @@
       <w:pPr>
         <w:numPr>
           <w:ilvl w:val="0"/>
-          <w:numId w:val="1006"/>
+          <w:numId w:val="1007"/>
         </w:numPr>
         <w:pStyle w:val="Compact"/>
       </w:pPr>
@@ -9424,7 +9461,7 @@
       <w:pPr>
         <w:numPr>
           <w:ilvl w:val="0"/>
-          <w:numId w:val="1006"/>
+          <w:numId w:val="1007"/>
         </w:numPr>
         <w:pStyle w:val="Compact"/>
       </w:pPr>
@@ -9443,7 +9480,7 @@
       <w:pPr>
         <w:numPr>
           <w:ilvl w:val="0"/>
-          <w:numId w:val="1006"/>
+          <w:numId w:val="1007"/>
         </w:numPr>
         <w:pStyle w:val="Compact"/>
       </w:pPr>
@@ -9462,7 +9499,7 @@
       <w:pPr>
         <w:numPr>
           <w:ilvl w:val="0"/>
-          <w:numId w:val="1006"/>
+          <w:numId w:val="1007"/>
         </w:numPr>
         <w:pStyle w:val="Compact"/>
       </w:pPr>
@@ -13929,128 +13966,44 @@
         <w:t xml:space="preserve">Ghi chú: Mẫu phân tích giảm dần từ N = 84.910 (M2) → 38.342 (M3, thêm kiểm soát) → 29.840 (M11, thêm manager + ICRV + three-way). DAI P7 là Tier 1+2 khi k33 có mặt, Tier-1 only khi thiếu — khác với P3 Vietnam (Tier-1 only) và đồng nhất với P4 Singapore (Tier-1+2). ICRV là biến điều tiết liên tục (integer), không phải dummies, nhằm giữ N đủ lớn trong M10–M11.</w:t>
       </w:r>
     </w:p>
-    <w:p>
-      <w:r>
-        <w:pict>
-          <v:rect style="width:0;height:1.5pt" o:hralign="center" o:hrstd="t" o:hr="t"/>
-        </w:pict>
-      </w:r>
-    </w:p>
-    <w:bookmarkStart w:id="41" w:name="X4a5526e778224b6984af319ac51111aa01114f7"/>
-    <w:p>
-      <w:pPr>
-        <w:pStyle w:val="Heading4"/>
-      </w:pPr>
-      <w:r>
-        <w:t xml:space="preserve">3.4.5.5 Mô hình cụ thể — Nghiên cứu 8: Pacific SIDS (N = 1.469, Nhóm VI)</w:t>
+    <w:bookmarkEnd w:id="46"/>
+    <w:bookmarkStart w:id="47" w:name="Xedb6f4dc9b49a0f3b96ee48ef2b76553c0f737a"/>
+    <w:p>
+      <w:pPr>
+        <w:pStyle w:val="Heading3"/>
+      </w:pPr>
+      <w:r>
+        <w:t xml:space="preserve">4.5.5 Mô hình cụ thể — Nghiên cứu 8 (Pacific SIDS, WBES 2009–2025)</w:t>
       </w:r>
     </w:p>
     <w:p>
       <w:pPr>
         <w:pStyle w:val="FirstParagraph"/>
       </w:pPr>
-      <w:r>
-        <w:t xml:space="preserve">Nghiên cứu 8 phân tích mẫu gồm</w:t>
-      </w:r>
-      <w:r>
-        <w:t xml:space="preserve"> </w:t>
-      </w:r>
       <w:r>
         <w:rPr>
           <w:bCs/>
           <w:b/>
         </w:rPr>
-        <w:t xml:space="preserve">N = 1.469 doanh nghiệp</w:t>
-      </w:r>
-      <w:r>
-        <w:t xml:space="preserve"> </w:t>
-      </w:r>
-      <w:r>
-        <w:t xml:space="preserve">tại</w:t>
-      </w:r>
-      <w:r>
-        <w:t xml:space="preserve"> </w:t>
-      </w:r>
+        <w:t xml:space="preserve">Bối cảnh</w:t>
+      </w:r>
+      <w:r>
+        <w:t xml:space="preserve">: 9 nền kinh tế Pacific SIDS (Fiji, Kiribati, Papua New Guinea, Samoa, Solomon Islands, Timor-Leste, Tonga, Vanuatu, Comoros), N = 1.469 doanh nghiệp (mẫu phân tích sau lọc missing lnNSLD và CDDXK), trong đó 187 nhà xuất khẩu (12,7%). Phân loại ICRV Regime IV/V (Frontier + Pacific SIDS).</w:t>
+      </w:r>
+    </w:p>
+    <w:p>
+      <w:pPr>
+        <w:pStyle w:val="BodyText"/>
+      </w:pPr>
       <w:r>
         <w:rPr>
           <w:bCs/>
           <w:b/>
         </w:rPr>
-        <w:t xml:space="preserve">9 nền kinh tế Pacific SIDS</w:t>
-      </w:r>
-      <w:r>
-        <w:t xml:space="preserve"> </w:t>
-      </w:r>
-      <w:r>
-        <w:t xml:space="preserve">(Fiji, Papua New Guinea, Samoa, Solomon Islands, Timor-Leste, Tonga, Vanuatu, và các đảo nhỏ khác) từ các sóng WBES 2009–2025. Đây là nhóm thể chế ICRV Nhóm VI — cấp thấp nhất trong phân loại 6 chế độ — đặc trưng bởi thị trường nội địa cực nhỏ, chi phí thương mại cao và hỗ trợ thể chế yếu. Trong tổng mẫu, chỉ</w:t>
-      </w:r>
-      <w:r>
-        <w:t xml:space="preserve"> </w:t>
-      </w:r>
-      <w:r>
-        <w:rPr>
-          <w:bCs/>
-          <w:b/>
-        </w:rPr>
-        <w:t xml:space="preserve">187 doanh nghiệp có hoạt động xuất khẩu</w:t>
-      </w:r>
-      <w:r>
-        <w:t xml:space="preserve"> </w:t>
-      </w:r>
-      <w:r>
-        <w:t xml:space="preserve">(12,7%), phản ánh cấu trúc thị trường đảo nhỏ.</w:t>
-      </w:r>
-    </w:p>
-    <w:p>
-      <w:pPr>
-        <w:pStyle w:val="BodyText"/>
-      </w:pPr>
-      <w:r>
-        <w:t xml:space="preserve">Phát hiện trọng tâm:</w:t>
-      </w:r>
-      <w:r>
-        <w:t xml:space="preserve"> </w:t>
-      </w:r>
-      <w:r>
-        <w:rPr>
-          <w:bCs/>
-          <w:b/>
-        </w:rPr>
-        <w:t xml:space="preserve">gánh nặng quốc tế hóa bắt buộc (Forced Internationalization Penalty — FIP)</w:t>
-      </w:r>
-      <w:r>
-        <w:t xml:space="preserve"> </w:t>
-      </w:r>
-      <w:r>
-        <w:t xml:space="preserve">— mối quan hệ quốc tế hóa–hiệu quả là</w:t>
-      </w:r>
-      <w:r>
-        <w:t xml:space="preserve"> </w:t>
-      </w:r>
-      <w:r>
-        <w:rPr>
-          <w:bCs/>
-          <w:b/>
-        </w:rPr>
-        <w:t xml:space="preserve">đơn điệu âm</w:t>
-      </w:r>
-      <w:r>
-        <w:t xml:space="preserve"> </w:t>
-      </w:r>
-      <w:r>
-        <w:t xml:space="preserve">tại Nhóm VI, trái ngược với hình chữ U ngược được quan sát ở P3–P7. Lind–Mehlum U-test không bác bỏ đơn điệu (p &gt; ,10), xác nhận không có điểm quay.</w:t>
-      </w:r>
-    </w:p>
-    <w:p>
-      <w:pPr>
-        <w:pStyle w:val="BodyText"/>
-      </w:pPr>
-      <w:r>
-        <w:rPr>
-          <w:bCs/>
-          <w:b/>
-        </w:rPr>
-        <w:t xml:space="preserve">Ký hiệu biến (tiếng Việt ↔ mã WBES):</w:t>
+        <w:t xml:space="preserve">Ký hiệu tiếng Việt — Nghiên cứu 8</w:t>
+      </w:r>
+      <w:r>
+        <w:t xml:space="preserve">:</w:t>
       </w:r>
     </w:p>
     <w:tbl>
@@ -14090,19 +14043,7 @@
               <w:jc w:val="left"/>
             </w:pPr>
             <w:r>
-              <w:t xml:space="preserve">Tên tiếng Việt</w:t>
-            </w:r>
-          </w:p>
-        </w:tc>
-        <w:tc>
-          <w:tcPr/>
-          <w:p>
-            <w:pPr>
-              <w:pStyle w:val="Compact"/>
-              <w:jc w:val="left"/>
-            </w:pPr>
-            <w:r>
-              <w:t xml:space="preserve">Mã WBES</w:t>
+              <w:t xml:space="preserve">Biến WBES</w:t>
             </w:r>
           </w:p>
         </w:tc>
@@ -14115,6 +14056,18 @@
             </w:pPr>
             <w:r>
               <w:t xml:space="preserve">Cách tính</w:t>
+            </w:r>
+          </w:p>
+        </w:tc>
+        <w:tc>
+          <w:tcPr/>
+          <w:p>
+            <w:pPr>
+              <w:pStyle w:val="Compact"/>
+              <w:jc w:val="left"/>
+            </w:pPr>
+            <w:r>
+              <w:t xml:space="preserve">Vai trò</w:t>
             </w:r>
           </w:p>
         </w:tc>
@@ -14140,18 +14093,6 @@
               <w:jc w:val="left"/>
             </w:pPr>
             <w:r>
-              <w:t xml:space="preserve">Log năng suất lao động</w:t>
-            </w:r>
-          </w:p>
-        </w:tc>
-        <w:tc>
-          <w:tcPr/>
-          <w:p>
-            <w:pPr>
-              <w:pStyle w:val="Compact"/>
-              <w:jc w:val="left"/>
-            </w:pPr>
-            <w:r>
               <w:t xml:space="preserve">d2, l1</w:t>
             </w:r>
           </w:p>
@@ -14164,7 +14105,19 @@
               <w:jc w:val="left"/>
             </w:pPr>
             <w:r>
-              <w:t xml:space="preserve">ln(doanh thu PPP / lao động thường trực)</w:t>
+              <w:t xml:space="preserve">ln(d2/l1): ln(doanh thu PPP/lao động)</w:t>
+            </w:r>
+          </w:p>
+        </w:tc>
+        <w:tc>
+          <w:tcPr/>
+          <w:p>
+            <w:pPr>
+              <w:pStyle w:val="Compact"/>
+              <w:jc w:val="left"/>
+            </w:pPr>
+            <w:r>
+              <w:t xml:space="preserve">Biến phụ thuộc</w:t>
             </w:r>
           </w:p>
         </w:tc>
@@ -14178,19 +14131,7 @@
               <w:jc w:val="left"/>
             </w:pPr>
             <w:r>
-              <w:t xml:space="preserve">CDDXK_c</w:t>
-            </w:r>
-          </w:p>
-        </w:tc>
-        <w:tc>
-          <w:tcPr/>
-          <w:p>
-            <w:pPr>
-              <w:pStyle w:val="Compact"/>
-              <w:jc w:val="left"/>
-            </w:pPr>
-            <w:r>
-              <w:t xml:space="preserve">Cường độ xuất khẩu (điều chỉnh)</w:t>
+              <w:t xml:space="preserve">CDDXK</w:t>
             </w:r>
           </w:p>
         </w:tc>
@@ -14214,7 +14155,19 @@
               <w:jc w:val="left"/>
             </w:pPr>
             <w:r>
-              <w:t xml:space="preserve">(d3c/100) − mean_wave(FSTS): centred theo sóng</w:t>
+              <w:t xml:space="preserve">d3c/100</w:t>
+            </w:r>
+          </w:p>
+        </w:tc>
+        <w:tc>
+          <w:tcPr/>
+          <w:p>
+            <w:pPr>
+              <w:pStyle w:val="Compact"/>
+              <w:jc w:val="left"/>
+            </w:pPr>
+            <w:r>
+              <w:t xml:space="preserve">Cường độ xuất khẩu (FSTS)</w:t>
             </w:r>
           </w:p>
         </w:tc>
@@ -14228,19 +14181,7 @@
               <w:jc w:val="left"/>
             </w:pPr>
             <w:r>
-              <w:t xml:space="preserve">CDDXK_c²</w:t>
-            </w:r>
-          </w:p>
-        </w:tc>
-        <w:tc>
-          <w:tcPr/>
-          <w:p>
-            <w:pPr>
-              <w:pStyle w:val="Compact"/>
-              <w:jc w:val="left"/>
-            </w:pPr>
-            <w:r>
-              <w:t xml:space="preserve">CDDXK_c bình phương</w:t>
+              <w:t xml:space="preserve">CDDXK_c</w:t>
             </w:r>
           </w:p>
         </w:tc>
@@ -14264,7 +14205,19 @@
               <w:jc w:val="left"/>
             </w:pPr>
             <w:r>
-              <w:t xml:space="preserve">CDDXK_c × CDDXK_c</w:t>
+              <w:t xml:space="preserve">CDDXK − trung bình_wave(CDDXK): trung tâm hóa</w:t>
+            </w:r>
+          </w:p>
+        </w:tc>
+        <w:tc>
+          <w:tcPr/>
+          <w:p>
+            <w:pPr>
+              <w:pStyle w:val="Compact"/>
+              <w:jc w:val="left"/>
+            </w:pPr>
+            <w:r>
+              <w:t xml:space="preserve">Biến độc lập chính</w:t>
             </w:r>
           </w:p>
         </w:tc>
@@ -14290,18 +14243,6 @@
               <w:jc w:val="left"/>
             </w:pPr>
             <w:r>
-              <w:t xml:space="preserve">Năng lực công nghệ</w:t>
-            </w:r>
-          </w:p>
-        </w:tc>
-        <w:tc>
-          <w:tcPr/>
-          <w:p>
-            <w:pPr>
-              <w:pStyle w:val="Compact"/>
-              <w:jc w:val="left"/>
-            </w:pPr>
-            <w:r>
               <w:t xml:space="preserve">b8, e6</w:t>
             </w:r>
           </w:p>
@@ -14314,7 +14255,19 @@
               <w:jc w:val="left"/>
             </w:pPr>
             <w:r>
-              <w:t xml:space="preserve">z-std(trung bình cert chất lượng + CN nước ngoài)</w:t>
+              <w:t xml:space="preserve">z-std(mean(b8, e6)): chứng nhận + công nghệ nước ngoài</w:t>
+            </w:r>
+          </w:p>
+        </w:tc>
+        <w:tc>
+          <w:tcPr/>
+          <w:p>
+            <w:pPr>
+              <w:pStyle w:val="Compact"/>
+              <w:jc w:val="left"/>
+            </w:pPr>
+            <w:r>
+              <w:t xml:space="preserve">Năng lực công nghệ (TCI)</w:t>
             </w:r>
           </w:p>
         </w:tc>
@@ -14340,18 +14293,6 @@
               <w:jc w:val="left"/>
             </w:pPr>
             <w:r>
-              <w:t xml:space="preserve">Chỉ số số hoá (Tier-1)</w:t>
-            </w:r>
-          </w:p>
-        </w:tc>
-        <w:tc>
-          <w:tcPr/>
-          <w:p>
-            <w:pPr>
-              <w:pStyle w:val="Compact"/>
-              <w:jc w:val="left"/>
-            </w:pPr>
-            <w:r>
               <w:t xml:space="preserve">c22b</w:t>
             </w:r>
           </w:p>
@@ -14364,17 +14305,19 @@
               <w:jc w:val="left"/>
             </w:pPr>
             <w:r>
-              <w:t xml:space="preserve">z-std(website binary):</w:t>
-            </w:r>
-            <w:r>
-              <w:t xml:space="preserve"> </w:t>
-            </w:r>
-            <w:r>
-              <w:rPr>
-                <w:bCs/>
-                <w:b/>
-              </w:rPr>
-              <w:t xml:space="preserve">chỉ Tier-1, không dynamic</w:t>
+              <w:t xml:space="preserve">z-std(c22b): website (Tier-1 proxy, static)</w:t>
+            </w:r>
+          </w:p>
+        </w:tc>
+        <w:tc>
+          <w:tcPr/>
+          <w:p>
+            <w:pPr>
+              <w:pStyle w:val="Compact"/>
+              <w:jc w:val="left"/>
+            </w:pPr>
+            <w:r>
+              <w:t xml:space="preserve">Chỉ số số hoá (DAI, Tier-1)</w:t>
             </w:r>
           </w:p>
         </w:tc>
@@ -14400,18 +14343,6 @@
               <w:jc w:val="left"/>
             </w:pPr>
             <w:r>
-              <w:t xml:space="preserve">Log quy mô lao động</w:t>
-            </w:r>
-          </w:p>
-        </w:tc>
-        <w:tc>
-          <w:tcPr/>
-          <w:p>
-            <w:pPr>
-              <w:pStyle w:val="Compact"/>
-              <w:jc w:val="left"/>
-            </w:pPr>
-            <w:r>
               <w:t xml:space="preserve">l1</w:t>
             </w:r>
           </w:p>
@@ -14425,6 +14356,18 @@
             </w:pPr>
             <w:r>
               <w:t xml:space="preserve">ln(lao động thường trực)</w:t>
+            </w:r>
+          </w:p>
+        </w:tc>
+        <w:tc>
+          <w:tcPr/>
+          <w:p>
+            <w:pPr>
+              <w:pStyle w:val="Compact"/>
+              <w:jc w:val="left"/>
+            </w:pPr>
+            <w:r>
+              <w:t xml:space="preserve">Control (quy mô DN)</w:t>
             </w:r>
           </w:p>
         </w:tc>
@@ -14450,18 +14393,6 @@
               <w:jc w:val="left"/>
             </w:pPr>
             <w:r>
-              <w:t xml:space="preserve">Tuổi doanh nghiệp</w:t>
-            </w:r>
-          </w:p>
-        </w:tc>
-        <w:tc>
-          <w:tcPr/>
-          <w:p>
-            <w:pPr>
-              <w:pStyle w:val="Compact"/>
-              <w:jc w:val="left"/>
-            </w:pPr>
-            <w:r>
               <w:t xml:space="preserve">b5</w:t>
             </w:r>
           </w:p>
@@ -14475,6 +14406,18 @@
             </w:pPr>
             <w:r>
               <w:t xml:space="preserve">năm_khảo_sát − b5</w:t>
+            </w:r>
+          </w:p>
+        </w:tc>
+        <w:tc>
+          <w:tcPr/>
+          <w:p>
+            <w:pPr>
+              <w:pStyle w:val="Compact"/>
+              <w:jc w:val="left"/>
+            </w:pPr>
+            <w:r>
+              <w:t xml:space="preserve">Control (tuổi DN)</w:t>
             </w:r>
           </w:p>
         </w:tc>
@@ -14500,31 +14443,31 @@
               <w:jc w:val="left"/>
             </w:pPr>
             <w:r>
-              <w:t xml:space="preserve">Tỷ lệ sở hữu nước ngoài</w:t>
-            </w:r>
-          </w:p>
-        </w:tc>
-        <w:tc>
-          <w:tcPr/>
-          <w:p>
-            <w:pPr>
-              <w:pStyle w:val="Compact"/>
-              <w:jc w:val="left"/>
-            </w:pPr>
-            <w:r>
-              <w:t xml:space="preserve">b6a</w:t>
-            </w:r>
-          </w:p>
-        </w:tc>
-        <w:tc>
-          <w:tcPr/>
-          <w:p>
-            <w:pPr>
-              <w:pStyle w:val="Compact"/>
-              <w:jc w:val="left"/>
-            </w:pPr>
-            <w:r>
-              <w:t xml:space="preserve">tỷ lệ 0–1</w:t>
+              <w:t xml:space="preserve">b2b</w:t>
+            </w:r>
+          </w:p>
+        </w:tc>
+        <w:tc>
+          <w:tcPr/>
+          <w:p>
+            <w:pPr>
+              <w:pStyle w:val="Compact"/>
+              <w:jc w:val="left"/>
+            </w:pPr>
+            <w:r>
+              <w:t xml:space="preserve">tỷ lệ sở hữu nước ngoài (%)</w:t>
+            </w:r>
+          </w:p>
+        </w:tc>
+        <w:tc>
+          <w:tcPr/>
+          <w:p>
+            <w:pPr>
+              <w:pStyle w:val="Compact"/>
+              <w:jc w:val="left"/>
+            </w:pPr>
+            <w:r>
+              <w:t xml:space="preserve">Control (sở hữu)</w:t>
             </w:r>
           </w:p>
         </w:tc>
@@ -14550,31 +14493,31 @@
               <w:jc w:val="left"/>
             </w:pPr>
             <w:r>
-              <w:t xml:space="preserve">Country fixed effects</w:t>
-            </w:r>
-          </w:p>
-        </w:tc>
-        <w:tc>
-          <w:tcPr/>
-          <w:p>
-            <w:pPr>
-              <w:pStyle w:val="Compact"/>
-              <w:jc w:val="left"/>
-            </w:pPr>
-            <w:r>
-              <w:t xml:space="preserve">a3b</w:t>
-            </w:r>
-          </w:p>
-        </w:tc>
-        <w:tc>
-          <w:tcPr/>
-          <w:p>
-            <w:pPr>
-              <w:pStyle w:val="Compact"/>
-              <w:jc w:val="left"/>
-            </w:pPr>
-            <w:r>
-              <w:t xml:space="preserve">dummy theo quốc gia</w:t>
+              <w:t xml:space="preserve">—</w:t>
+            </w:r>
+          </w:p>
+        </w:tc>
+        <w:tc>
+          <w:tcPr/>
+          <w:p>
+            <w:pPr>
+              <w:pStyle w:val="Compact"/>
+              <w:jc w:val="left"/>
+            </w:pPr>
+            <w:r>
+              <w:t xml:space="preserve">country fixed effects</w:t>
+            </w:r>
+          </w:p>
+        </w:tc>
+        <w:tc>
+          <w:tcPr/>
+          <w:p>
+            <w:pPr>
+              <w:pStyle w:val="Compact"/>
+              <w:jc w:val="left"/>
+            </w:pPr>
+            <w:r>
+              <w:t xml:space="preserve">FE quốc gia</w:t>
             </w:r>
           </w:p>
         </w:tc>
@@ -14600,18 +14543,6 @@
               <w:jc w:val="left"/>
             </w:pPr>
             <w:r>
-              <w:t xml:space="preserve">Wave fixed effects</w:t>
-            </w:r>
-          </w:p>
-        </w:tc>
-        <w:tc>
-          <w:tcPr/>
-          <w:p>
-            <w:pPr>
-              <w:pStyle w:val="Compact"/>
-              <w:jc w:val="left"/>
-            </w:pPr>
-            <w:r>
               <w:t xml:space="preserve">wave</w:t>
             </w:r>
           </w:p>
@@ -14624,24 +14555,24 @@
               <w:jc w:val="left"/>
             </w:pPr>
             <w:r>
-              <w:t xml:space="preserve">dummy theo sóng điều tra</w:t>
+              <w:t xml:space="preserve">wave/year fixed effects</w:t>
+            </w:r>
+          </w:p>
+        </w:tc>
+        <w:tc>
+          <w:tcPr/>
+          <w:p>
+            <w:pPr>
+              <w:pStyle w:val="Compact"/>
+              <w:jc w:val="left"/>
+            </w:pPr>
+            <w:r>
+              <w:t xml:space="preserve">FE năm khảo sát</w:t>
             </w:r>
           </w:p>
         </w:tc>
       </w:tr>
     </w:tbl>
-    <w:p>
-      <w:pPr>
-        <w:pStyle w:val="BodyText"/>
-      </w:pPr>
-      <w:r>
-        <w:rPr>
-          <w:iCs/>
-          <w:i/>
-        </w:rPr>
-        <w:t xml:space="preserve">Ghi chú: CSS_z (DAI) là proxy tĩnh Tier-1 (website binary c22b). WBES không thu thập đủ thang đo cho số hoá động tại các đảo nhỏ — KHÔNG gọi là "năng lực số hoá động".</w:t>
-      </w:r>
-    </w:p>
     <w:p>
       <w:pPr>
         <w:pStyle w:val="BodyText"/>
@@ -14651,7 +14582,10 @@
           <w:bCs/>
           <w:b/>
         </w:rPr>
-        <w:t xml:space="preserve">Chuỗi mô hình M0–M3 (P8):</w:t>
+        <w:t xml:space="preserve">Chuỗi mô hình M0–M3</w:t>
+      </w:r>
+      <w:r>
+        <w:t xml:space="preserve">:</w:t>
       </w:r>
     </w:p>
     <w:p>
@@ -14659,1502 +14593,207 @@
         <w:pStyle w:val="BodyText"/>
       </w:pPr>
       <w:r>
-        <w:t xml:space="preserve">M0 — Baseline kiểm soát:</w:t>
+        <w:t xml:space="preserve">M0 (Controls baseline):</w:t>
+      </w:r>
+      <w:r>
+        <w:t xml:space="preserve"> </w:t>
+      </w:r>
+      <w:r>
+        <w:t xml:space="preserve">lnNSLD_it = α + γ₁ lnLD_it + γ₂ TuoiDN_it + γ₃ SoHuuNN_it + δ_c + λ_t + ε_it</w:t>
       </w:r>
     </w:p>
     <w:p>
       <w:pPr>
         <w:pStyle w:val="BodyText"/>
       </w:pPr>
-      <m:oMathPara>
-        <m:oMathParaPr>
-          <m:jc m:val="center"/>
-        </m:oMathParaPr>
-        <m:oMath>
-          <m:r>
-            <m:t>l</m:t>
-          </m:r>
-          <m:r>
-            <m:t>n</m:t>
-          </m:r>
-          <m:r>
-            <m:t>N</m:t>
-          </m:r>
-          <m:r>
-            <m:t>S</m:t>
-          </m:r>
-          <m:r>
-            <m:t>L</m:t>
-          </m:r>
-          <m:sSub>
-            <m:e>
-              <m:r>
-                <m:t>D</m:t>
-              </m:r>
-            </m:e>
-            <m:sub>
-              <m:r>
-                <m:t>i</m:t>
-              </m:r>
-              <m:r>
-                <m:t>t</m:t>
-              </m:r>
-            </m:sub>
-          </m:sSub>
-          <m:r>
-            <m:rPr>
-              <m:sty m:val="p"/>
-            </m:rPr>
-            <m:t>=</m:t>
-          </m:r>
-          <m:r>
-            <m:t>α</m:t>
-          </m:r>
-          <m:r>
-            <m:rPr>
-              <m:sty m:val="p"/>
-            </m:rPr>
-            <m:t>+</m:t>
-          </m:r>
-          <m:sSub>
-            <m:e>
-              <m:r>
-                <m:t>γ</m:t>
-              </m:r>
-            </m:e>
-            <m:sub>
-              <m:r>
-                <m:t>1</m:t>
-              </m:r>
-            </m:sub>
-          </m:sSub>
-          <m:r>
-            <m:t>l</m:t>
-          </m:r>
-          <m:r>
-            <m:t>n</m:t>
-          </m:r>
-          <m:r>
-            <m:t>L</m:t>
-          </m:r>
-          <m:sSub>
-            <m:e>
-              <m:r>
-                <m:t>D</m:t>
-              </m:r>
-            </m:e>
-            <m:sub>
-              <m:r>
-                <m:t>i</m:t>
-              </m:r>
-              <m:r>
-                <m:t>t</m:t>
-              </m:r>
-            </m:sub>
-          </m:sSub>
-          <m:r>
-            <m:rPr>
-              <m:sty m:val="p"/>
-            </m:rPr>
-            <m:t>+</m:t>
-          </m:r>
-          <m:sSub>
-            <m:e>
-              <m:r>
-                <m:t>γ</m:t>
-              </m:r>
-            </m:e>
-            <m:sub>
-              <m:r>
-                <m:t>2</m:t>
-              </m:r>
-            </m:sub>
-          </m:sSub>
-          <m:r>
-            <m:t>T</m:t>
-          </m:r>
-          <m:r>
-            <m:t>u</m:t>
-          </m:r>
-          <m:r>
-            <m:t>o</m:t>
-          </m:r>
-          <m:r>
-            <m:t>i</m:t>
-          </m:r>
-          <m:r>
-            <m:t>D</m:t>
-          </m:r>
-          <m:sSub>
-            <m:e>
-              <m:r>
-                <m:t>N</m:t>
-              </m:r>
-            </m:e>
-            <m:sub>
-              <m:r>
-                <m:t>i</m:t>
-              </m:r>
-              <m:r>
-                <m:t>t</m:t>
-              </m:r>
-            </m:sub>
-          </m:sSub>
-          <m:r>
-            <m:rPr>
-              <m:sty m:val="p"/>
-            </m:rPr>
-            <m:t>+</m:t>
-          </m:r>
-          <m:sSub>
-            <m:e>
-              <m:r>
-                <m:t>γ</m:t>
-              </m:r>
-            </m:e>
-            <m:sub>
-              <m:r>
-                <m:t>3</m:t>
-              </m:r>
-            </m:sub>
-          </m:sSub>
-          <m:r>
-            <m:t>S</m:t>
-          </m:r>
-          <m:r>
-            <m:t>o</m:t>
-          </m:r>
-          <m:r>
-            <m:t>H</m:t>
-          </m:r>
-          <m:r>
-            <m:t>u</m:t>
-          </m:r>
-          <m:r>
-            <m:t>u</m:t>
-          </m:r>
-          <m:r>
-            <m:t>N</m:t>
-          </m:r>
-          <m:sSub>
-            <m:e>
-              <m:r>
-                <m:t>N</m:t>
-              </m:r>
-            </m:e>
-            <m:sub>
-              <m:r>
-                <m:t>i</m:t>
-              </m:r>
-              <m:r>
-                <m:t>t</m:t>
-              </m:r>
-            </m:sub>
-          </m:sSub>
-          <m:r>
-            <m:rPr>
-              <m:sty m:val="p"/>
-            </m:rPr>
-            <m:t>+</m:t>
-          </m:r>
-          <m:sSub>
-            <m:e>
-              <m:r>
-                <m:t>δ</m:t>
-              </m:r>
-            </m:e>
-            <m:sub>
-              <m:r>
-                <m:t>c</m:t>
-              </m:r>
-            </m:sub>
-          </m:sSub>
-          <m:r>
-            <m:rPr>
-              <m:sty m:val="p"/>
-            </m:rPr>
-            <m:t>+</m:t>
-          </m:r>
-          <m:sSub>
-            <m:e>
-              <m:r>
-                <m:t>λ</m:t>
-              </m:r>
-            </m:e>
-            <m:sub>
-              <m:r>
-                <m:t>t</m:t>
-              </m:r>
-            </m:sub>
-          </m:sSub>
-          <m:r>
-            <m:rPr>
-              <m:sty m:val="p"/>
-            </m:rPr>
-            <m:t>+</m:t>
-          </m:r>
-          <m:sSub>
-            <m:e>
-              <m:r>
-                <m:t>ε</m:t>
-              </m:r>
-            </m:e>
-            <m:sub>
-              <m:r>
-                <m:t>i</m:t>
-              </m:r>
-              <m:r>
-                <m:t>t</m:t>
-              </m:r>
-            </m:sub>
-          </m:sSub>
-        </m:oMath>
-      </m:oMathPara>
-    </w:p>
-    <w:p>
-      <w:pPr>
-        <w:pStyle w:val="FirstParagraph"/>
-      </w:pPr>
-      <w:r>
-        <w:t xml:space="preserve">M1 — Kiểm định FIP (H1b): thêm cường độ xuất khẩu tuyến tính</w:t>
-      </w:r>
-    </w:p>
-    <w:p>
-      <w:pPr>
-        <w:pStyle w:val="BodyText"/>
-      </w:pPr>
-      <m:oMathPara>
-        <m:oMathParaPr>
-          <m:jc m:val="center"/>
-        </m:oMathParaPr>
-        <m:oMath>
-          <m:r>
-            <m:t>l</m:t>
-          </m:r>
-          <m:r>
-            <m:t>n</m:t>
-          </m:r>
-          <m:r>
-            <m:t>N</m:t>
-          </m:r>
-          <m:r>
-            <m:t>S</m:t>
-          </m:r>
-          <m:r>
-            <m:t>L</m:t>
-          </m:r>
-          <m:sSub>
-            <m:e>
-              <m:r>
-                <m:t>D</m:t>
-              </m:r>
-            </m:e>
-            <m:sub>
-              <m:r>
-                <m:t>i</m:t>
-              </m:r>
-              <m:r>
-                <m:t>t</m:t>
-              </m:r>
-            </m:sub>
-          </m:sSub>
-          <m:r>
-            <m:rPr>
-              <m:sty m:val="p"/>
-            </m:rPr>
-            <m:t>=</m:t>
-          </m:r>
-          <m:r>
-            <m:t>α</m:t>
-          </m:r>
-          <m:r>
-            <m:rPr>
-              <m:sty m:val="p"/>
-            </m:rPr>
-            <m:t>+</m:t>
-          </m:r>
-          <m:sSub>
-            <m:e>
-              <m:r>
-                <m:t>β</m:t>
-              </m:r>
-            </m:e>
-            <m:sub>
-              <m:r>
-                <m:t>1</m:t>
-              </m:r>
-            </m:sub>
-          </m:sSub>
-          <m:r>
-            <m:t>C</m:t>
-          </m:r>
-          <m:r>
-            <m:t>D</m:t>
-          </m:r>
-          <m:r>
-            <m:t>D</m:t>
-          </m:r>
-          <m:r>
-            <m:t>X</m:t>
-          </m:r>
-          <m:r>
-            <m:t>K</m:t>
-          </m:r>
-          <m:r>
-            <m:rPr>
-              <m:sty m:val="p"/>
-            </m:rPr>
-            <m:t>_</m:t>
-          </m:r>
-          <m:sSub>
-            <m:e>
-              <m:r>
-                <m:t>c</m:t>
-              </m:r>
-            </m:e>
-            <m:sub>
-              <m:r>
-                <m:t>i</m:t>
-              </m:r>
-              <m:r>
-                <m:t>t</m:t>
-              </m:r>
-            </m:sub>
-          </m:sSub>
-          <m:r>
-            <m:rPr>
-              <m:sty m:val="p"/>
-            </m:rPr>
-            <m:t>+</m:t>
-          </m:r>
-          <m:r>
-            <m:t>γ</m:t>
-          </m:r>
-          <m:r>
-            <m:rPr>
-              <m:sty m:val="p"/>
-            </m:rPr>
-            <m:t>⋅</m:t>
-          </m:r>
-          <m:sSub>
-            <m:e>
-              <m:r>
-                <m:t>X</m:t>
-              </m:r>
-            </m:e>
-            <m:sub>
-              <m:r>
-                <m:t>i</m:t>
-              </m:r>
-              <m:r>
-                <m:t>t</m:t>
-              </m:r>
-            </m:sub>
-          </m:sSub>
-          <m:r>
-            <m:rPr>
-              <m:sty m:val="p"/>
-            </m:rPr>
-            <m:t>+</m:t>
-          </m:r>
-          <m:sSub>
-            <m:e>
-              <m:r>
-                <m:t>δ</m:t>
-              </m:r>
-            </m:e>
-            <m:sub>
-              <m:r>
-                <m:t>c</m:t>
-              </m:r>
-            </m:sub>
-          </m:sSub>
-          <m:r>
-            <m:rPr>
-              <m:sty m:val="p"/>
-            </m:rPr>
-            <m:t>+</m:t>
-          </m:r>
-          <m:sSub>
-            <m:e>
-              <m:r>
-                <m:t>λ</m:t>
-              </m:r>
-            </m:e>
-            <m:sub>
-              <m:r>
-                <m:t>t</m:t>
-              </m:r>
-            </m:sub>
-          </m:sSub>
-          <m:r>
-            <m:rPr>
-              <m:sty m:val="p"/>
-            </m:rPr>
-            <m:t>+</m:t>
-          </m:r>
-          <m:sSub>
-            <m:e>
-              <m:r>
-                <m:t>ε</m:t>
-              </m:r>
-            </m:e>
-            <m:sub>
-              <m:r>
-                <m:t>i</m:t>
-              </m:r>
-              <m:r>
-                <m:t>t</m:t>
-              </m:r>
-            </m:sub>
-          </m:sSub>
-        </m:oMath>
-      </m:oMathPara>
-    </w:p>
-    <w:p>
-      <w:pPr>
-        <w:pStyle w:val="FirstParagraph"/>
-      </w:pPr>
-      <m:oMathPara>
-        <m:oMathParaPr>
-          <m:jc m:val="center"/>
-        </m:oMathParaPr>
-        <m:oMath>
-          <m:sSub>
-            <m:e>
-              <m:r>
-                <m:t>β</m:t>
-              </m:r>
-            </m:e>
-            <m:sub>
-              <m:r>
-                <m:t>1</m:t>
-              </m:r>
-            </m:sub>
-          </m:sSub>
-          <m:r>
-            <m:rPr>
-              <m:sty m:val="p"/>
-            </m:rPr>
-            <m:t>=</m:t>
-          </m:r>
-          <m:r>
-            <m:rPr>
-              <m:sty m:val="p"/>
-            </m:rPr>
-            <m:t>−</m:t>
-          </m:r>
-          <m:r>
-            <m:t>0</m:t>
-          </m:r>
-          <m:r>
-            <m:rPr>
-              <m:sty m:val="p"/>
-            </m:rPr>
-            <m:t>,</m:t>
-          </m:r>
-          <m:r>
-            <m:t>404</m:t>
-          </m:r>
-          <m:r>
-            <m:rPr>
-              <m:sty m:val="p"/>
-            </m:rPr>
-            <m:t>,</m:t>
-          </m:r>
-          <m:r>
-            <m:t> </m:t>
-          </m:r>
-          <m:r>
-            <m:t>p</m:t>
-          </m:r>
-          <m:r>
-            <m:rPr>
-              <m:sty m:val="p"/>
-            </m:rPr>
-            <m:t>=</m:t>
-          </m:r>
-          <m:r>
-            <m:rPr>
-              <m:sty m:val="p"/>
-            </m:rPr>
-            <m:t>,</m:t>
-          </m:r>
-          <m:r>
-            <m:t>032</m:t>
-          </m:r>
-          <m:r>
-            <m:t> </m:t>
-          </m:r>
-          <m:d>
-            <m:dPr>
-              <m:begChr m:val="("/>
-              <m:endChr m:val=")"/>
-              <m:sepChr m:val=""/>
-              <m:grow/>
-            </m:dPr>
-            <m:e>
-              <m:r>
-                <m:rPr>
-                  <m:nor/>
-                  <m:sty m:val="p"/>
-                </m:rPr>
-                <m:t>country+year FE, N</m:t>
-              </m:r>
-              <m:r>
-                <m:rPr>
-                  <m:sty m:val="p"/>
-                </m:rPr>
-                <m:t>=</m:t>
-              </m:r>
-              <m:r>
-                <m:t>1</m:t>
-              </m:r>
-              <m:r>
-                <m:rPr>
-                  <m:sty m:val="p"/>
-                </m:rPr>
-                <m:t>.</m:t>
-              </m:r>
-              <m:r>
-                <m:t>469</m:t>
-              </m:r>
-            </m:e>
-          </m:d>
-          <m:r>
-            <m:rPr>
-              <m:sty m:val="p"/>
-            </m:rPr>
-            <m:t>⇒</m:t>
-          </m:r>
-          <m:r>
-            <m:rPr>
-              <m:nor/>
-              <m:sty m:val="b"/>
-            </m:rPr>
-            <m:t>FIP xác nhận</m:t>
-          </m:r>
-        </m:oMath>
-      </m:oMathPara>
-    </w:p>
-    <w:p>
-      <w:pPr>
-        <w:pStyle w:val="FirstParagraph"/>
-      </w:pPr>
-      <w:r>
-        <w:t xml:space="preserve">M2 — Kiểm định phi tuyến: thêm CDDXK_c²</w:t>
-      </w:r>
-    </w:p>
-    <w:p>
-      <w:pPr>
-        <w:pStyle w:val="BodyText"/>
-      </w:pPr>
-      <m:oMathPara>
-        <m:oMathParaPr>
-          <m:jc m:val="center"/>
-        </m:oMathParaPr>
-        <m:oMath>
-          <m:r>
-            <m:t>l</m:t>
-          </m:r>
-          <m:r>
-            <m:t>n</m:t>
-          </m:r>
-          <m:r>
-            <m:t>N</m:t>
-          </m:r>
-          <m:r>
-            <m:t>S</m:t>
-          </m:r>
-          <m:r>
-            <m:t>L</m:t>
-          </m:r>
-          <m:sSub>
-            <m:e>
-              <m:r>
-                <m:t>D</m:t>
-              </m:r>
-            </m:e>
-            <m:sub>
-              <m:r>
-                <m:t>i</m:t>
-              </m:r>
-              <m:r>
-                <m:t>t</m:t>
-              </m:r>
-            </m:sub>
-          </m:sSub>
-          <m:r>
-            <m:rPr>
-              <m:sty m:val="p"/>
-            </m:rPr>
-            <m:t>=</m:t>
-          </m:r>
-          <m:r>
-            <m:t>α</m:t>
-          </m:r>
-          <m:r>
-            <m:rPr>
-              <m:sty m:val="p"/>
-            </m:rPr>
-            <m:t>+</m:t>
-          </m:r>
-          <m:sSub>
-            <m:e>
-              <m:r>
-                <m:t>β</m:t>
-              </m:r>
-            </m:e>
-            <m:sub>
-              <m:r>
-                <m:t>1</m:t>
-              </m:r>
-            </m:sub>
-          </m:sSub>
-          <m:r>
-            <m:t>C</m:t>
-          </m:r>
-          <m:r>
-            <m:t>D</m:t>
-          </m:r>
-          <m:r>
-            <m:t>D</m:t>
-          </m:r>
-          <m:r>
-            <m:t>X</m:t>
-          </m:r>
-          <m:r>
-            <m:t>K</m:t>
-          </m:r>
-          <m:r>
-            <m:rPr>
-              <m:sty m:val="p"/>
-            </m:rPr>
-            <m:t>_</m:t>
-          </m:r>
-          <m:sSub>
-            <m:e>
-              <m:r>
-                <m:t>c</m:t>
-              </m:r>
-            </m:e>
-            <m:sub>
-              <m:r>
-                <m:t>i</m:t>
-              </m:r>
-              <m:r>
-                <m:t>t</m:t>
-              </m:r>
-            </m:sub>
-          </m:sSub>
-          <m:r>
-            <m:rPr>
-              <m:sty m:val="p"/>
-            </m:rPr>
-            <m:t>+</m:t>
-          </m:r>
-          <m:sSub>
-            <m:e>
-              <m:r>
-                <m:t>β</m:t>
-              </m:r>
-            </m:e>
-            <m:sub>
-              <m:r>
-                <m:t>2</m:t>
-              </m:r>
-            </m:sub>
-          </m:sSub>
-          <m:r>
-            <m:t>C</m:t>
-          </m:r>
-          <m:r>
-            <m:t>D</m:t>
-          </m:r>
-          <m:r>
-            <m:t>D</m:t>
-          </m:r>
-          <m:r>
-            <m:t>X</m:t>
-          </m:r>
-          <m:r>
-            <m:t>K</m:t>
-          </m:r>
-          <m:r>
-            <m:rPr>
-              <m:sty m:val="p"/>
-            </m:rPr>
-            <m:t>_</m:t>
-          </m:r>
-          <m:sSubSup>
-            <m:e>
-              <m:r>
-                <m:t>c</m:t>
-              </m:r>
-            </m:e>
-            <m:sub>
-              <m:r>
-                <m:t>i</m:t>
-              </m:r>
-              <m:r>
-                <m:t>t</m:t>
-              </m:r>
-            </m:sub>
-            <m:sup>
-              <m:r>
-                <m:t>2</m:t>
-              </m:r>
-            </m:sup>
-          </m:sSubSup>
-          <m:r>
-            <m:rPr>
-              <m:sty m:val="p"/>
-            </m:rPr>
-            <m:t>+</m:t>
-          </m:r>
-          <m:r>
-            <m:t>γ</m:t>
-          </m:r>
-          <m:r>
-            <m:rPr>
-              <m:sty m:val="p"/>
-            </m:rPr>
-            <m:t>⋅</m:t>
-          </m:r>
-          <m:sSub>
-            <m:e>
-              <m:r>
-                <m:t>X</m:t>
-              </m:r>
-            </m:e>
-            <m:sub>
-              <m:r>
-                <m:t>i</m:t>
-              </m:r>
-              <m:r>
-                <m:t>t</m:t>
-              </m:r>
-            </m:sub>
-          </m:sSub>
-          <m:r>
-            <m:rPr>
-              <m:sty m:val="p"/>
-            </m:rPr>
-            <m:t>+</m:t>
-          </m:r>
-          <m:sSub>
-            <m:e>
-              <m:r>
-                <m:t>δ</m:t>
-              </m:r>
-            </m:e>
-            <m:sub>
-              <m:r>
-                <m:t>c</m:t>
-              </m:r>
-            </m:sub>
-          </m:sSub>
-          <m:r>
-            <m:rPr>
-              <m:sty m:val="p"/>
-            </m:rPr>
-            <m:t>+</m:t>
-          </m:r>
-          <m:sSub>
-            <m:e>
-              <m:r>
-                <m:t>λ</m:t>
-              </m:r>
-            </m:e>
-            <m:sub>
-              <m:r>
-                <m:t>t</m:t>
-              </m:r>
-            </m:sub>
-          </m:sSub>
-          <m:r>
-            <m:rPr>
-              <m:sty m:val="p"/>
-            </m:rPr>
-            <m:t>+</m:t>
-          </m:r>
-          <m:sSub>
-            <m:e>
-              <m:r>
-                <m:t>ε</m:t>
-              </m:r>
-            </m:e>
-            <m:sub>
-              <m:r>
-                <m:t>i</m:t>
-              </m:r>
-              <m:r>
-                <m:t>t</m:t>
-              </m:r>
-            </m:sub>
-          </m:sSub>
-        </m:oMath>
-      </m:oMathPara>
-    </w:p>
-    <w:p>
-      <w:pPr>
-        <w:pStyle w:val="FirstParagraph"/>
-      </w:pPr>
-      <m:oMathPara>
-        <m:oMathParaPr>
-          <m:jc m:val="center"/>
-        </m:oMathParaPr>
-        <m:oMath>
-          <m:sSub>
-            <m:e>
-              <m:r>
-                <m:t>β</m:t>
-              </m:r>
-            </m:e>
-            <m:sub>
-              <m:r>
-                <m:t>1</m:t>
-              </m:r>
-            </m:sub>
-          </m:sSub>
-          <m:r>
-            <m:t> </m:t>
-          </m:r>
-          <m:r>
-            <m:rPr>
-              <m:nor/>
-              <m:sty m:val="p"/>
-            </m:rPr>
-            <m:t>NS</m:t>
-          </m:r>
-          <m:r>
-            <m:rPr>
-              <m:sty m:val="p"/>
-            </m:rPr>
-            <m:t>,</m:t>
-          </m:r>
-          <m:r>
-            <m:t> </m:t>
-          </m:r>
-          <m:sSub>
-            <m:e>
-              <m:r>
-                <m:t>β</m:t>
-              </m:r>
-            </m:e>
-            <m:sub>
-              <m:r>
-                <m:t>2</m:t>
-              </m:r>
-            </m:sub>
-          </m:sSub>
-          <m:r>
-            <m:t> </m:t>
-          </m:r>
-          <m:r>
-            <m:rPr>
-              <m:nor/>
-              <m:sty m:val="p"/>
-            </m:rPr>
-            <m:t>NS</m:t>
-          </m:r>
-          <m:r>
-            <m:rPr>
-              <m:sty m:val="p"/>
-            </m:rPr>
-            <m:t>;</m:t>
-          </m:r>
-          <m:r>
-            <m:t> </m:t>
-          </m:r>
-          <m:r>
-            <m:rPr>
-              <m:nor/>
-              <m:sty m:val="p"/>
-            </m:rPr>
-            <m:t>Lind–Mehlum U-test NS</m:t>
-          </m:r>
-          <m:r>
-            <m:rPr>
-              <m:sty m:val="p"/>
-            </m:rPr>
-            <m:t>⇒</m:t>
-          </m:r>
-          <m:r>
-            <m:rPr>
-              <m:nor/>
-              <m:sty m:val="p"/>
-            </m:rPr>
-            <m:t>không có điểm quay, đơn điệu âm</m:t>
-          </m:r>
-        </m:oMath>
-      </m:oMathPara>
-    </w:p>
-    <w:p>
-      <w:pPr>
-        <w:pStyle w:val="FirstParagraph"/>
-      </w:pPr>
-      <w:r>
-        <w:t xml:space="preserve">M3 — Kiểm định năng lực điều tiết (H2 null cho SIDS):</w:t>
-      </w:r>
-    </w:p>
-    <w:p>
-      <w:pPr>
-        <w:pStyle w:val="BodyText"/>
-      </w:pPr>
-      <m:oMathPara>
-        <m:oMathParaPr>
-          <m:jc m:val="center"/>
-        </m:oMathParaPr>
-        <m:oMath>
-          <m:r>
-            <m:t>l</m:t>
-          </m:r>
-          <m:r>
-            <m:t>n</m:t>
-          </m:r>
-          <m:r>
-            <m:t>N</m:t>
-          </m:r>
-          <m:r>
-            <m:t>S</m:t>
-          </m:r>
-          <m:r>
-            <m:t>L</m:t>
-          </m:r>
-          <m:sSub>
-            <m:e>
-              <m:r>
-                <m:t>D</m:t>
-              </m:r>
-            </m:e>
-            <m:sub>
-              <m:r>
-                <m:t>i</m:t>
-              </m:r>
-              <m:r>
-                <m:t>t</m:t>
-              </m:r>
-            </m:sub>
-          </m:sSub>
-          <m:r>
-            <m:rPr>
-              <m:sty m:val="p"/>
-            </m:rPr>
-            <m:t>=</m:t>
-          </m:r>
-          <m:r>
-            <m:t>α</m:t>
-          </m:r>
-          <m:r>
-            <m:rPr>
-              <m:sty m:val="p"/>
-            </m:rPr>
-            <m:t>+</m:t>
-          </m:r>
-          <m:sSub>
-            <m:e>
-              <m:r>
-                <m:t>β</m:t>
-              </m:r>
-            </m:e>
-            <m:sub>
-              <m:r>
-                <m:t>1</m:t>
-              </m:r>
-            </m:sub>
-          </m:sSub>
-          <m:r>
-            <m:t>C</m:t>
-          </m:r>
-          <m:r>
-            <m:t>D</m:t>
-          </m:r>
-          <m:r>
-            <m:t>D</m:t>
-          </m:r>
-          <m:r>
-            <m:t>X</m:t>
-          </m:r>
-          <m:r>
-            <m:t>K</m:t>
-          </m:r>
-          <m:r>
-            <m:rPr>
-              <m:sty m:val="p"/>
-            </m:rPr>
-            <m:t>_</m:t>
-          </m:r>
-          <m:sSub>
-            <m:e>
-              <m:r>
-                <m:t>c</m:t>
-              </m:r>
-            </m:e>
-            <m:sub>
-              <m:r>
-                <m:t>i</m:t>
-              </m:r>
-              <m:r>
-                <m:t>t</m:t>
-              </m:r>
-            </m:sub>
-          </m:sSub>
-          <m:r>
-            <m:rPr>
-              <m:sty m:val="p"/>
-            </m:rPr>
-            <m:t>+</m:t>
-          </m:r>
-          <m:sSub>
-            <m:e>
-              <m:r>
-                <m:t>β</m:t>
-              </m:r>
-            </m:e>
-            <m:sub>
-              <m:r>
-                <m:t>2</m:t>
-              </m:r>
-            </m:sub>
-          </m:sSub>
-          <m:r>
-            <m:t>C</m:t>
-          </m:r>
-          <m:r>
-            <m:t>D</m:t>
-          </m:r>
-          <m:r>
-            <m:t>D</m:t>
-          </m:r>
-          <m:r>
-            <m:t>X</m:t>
-          </m:r>
-          <m:r>
-            <m:t>K</m:t>
-          </m:r>
-          <m:r>
-            <m:rPr>
-              <m:sty m:val="p"/>
-            </m:rPr>
-            <m:t>_</m:t>
-          </m:r>
-          <m:sSubSup>
-            <m:e>
-              <m:r>
-                <m:t>c</m:t>
-              </m:r>
-            </m:e>
-            <m:sub>
-              <m:r>
-                <m:t>i</m:t>
-              </m:r>
-              <m:r>
-                <m:t>t</m:t>
-              </m:r>
-            </m:sub>
-            <m:sup>
-              <m:r>
-                <m:t>2</m:t>
-              </m:r>
-            </m:sup>
-          </m:sSubSup>
-          <m:r>
-            <m:rPr>
-              <m:sty m:val="p"/>
-            </m:rPr>
-            <m:t>+</m:t>
-          </m:r>
-          <m:sSub>
-            <m:e>
-              <m:r>
-                <m:t>β</m:t>
-              </m:r>
-            </m:e>
-            <m:sub>
-              <m:r>
-                <m:t>3</m:t>
-              </m:r>
-            </m:sub>
-          </m:sSub>
-          <m:r>
-            <m:t>N</m:t>
-          </m:r>
-          <m:r>
-            <m:t>L</m:t>
-          </m:r>
-          <m:r>
-            <m:t>C</m:t>
-          </m:r>
-          <m:r>
-            <m:t>N</m:t>
-          </m:r>
-          <m:r>
-            <m:rPr>
-              <m:sty m:val="p"/>
-            </m:rPr>
-            <m:t>_</m:t>
-          </m:r>
-          <m:sSub>
-            <m:e>
-              <m:r>
-                <m:t>z</m:t>
-              </m:r>
-            </m:e>
-            <m:sub>
-              <m:r>
-                <m:t>i</m:t>
-              </m:r>
-              <m:r>
-                <m:t>t</m:t>
-              </m:r>
-            </m:sub>
-          </m:sSub>
-          <m:r>
-            <m:rPr>
-              <m:sty m:val="p"/>
-            </m:rPr>
-            <m:t>+</m:t>
-          </m:r>
-          <m:sSub>
-            <m:e>
-              <m:r>
-                <m:t>β</m:t>
-              </m:r>
-            </m:e>
-            <m:sub>
-              <m:r>
-                <m:t>4</m:t>
-              </m:r>
-            </m:sub>
-          </m:sSub>
-          <m:r>
-            <m:t>C</m:t>
-          </m:r>
-          <m:r>
-            <m:t>S</m:t>
-          </m:r>
-          <m:r>
-            <m:t>S</m:t>
-          </m:r>
-          <m:r>
-            <m:rPr>
-              <m:sty m:val="p"/>
-            </m:rPr>
-            <m:t>_</m:t>
-          </m:r>
-          <m:sSub>
-            <m:e>
-              <m:r>
-                <m:t>z</m:t>
-              </m:r>
-            </m:e>
-            <m:sub>
-              <m:r>
-                <m:t>i</m:t>
-              </m:r>
-              <m:r>
-                <m:t>t</m:t>
-              </m:r>
-            </m:sub>
-          </m:sSub>
-          <m:r>
-            <m:rPr>
-              <m:sty m:val="p"/>
-            </m:rPr>
-            <m:t>+</m:t>
-          </m:r>
-          <m:r>
-            <m:t>γ</m:t>
-          </m:r>
-          <m:r>
-            <m:rPr>
-              <m:sty m:val="p"/>
-            </m:rPr>
-            <m:t>⋅</m:t>
-          </m:r>
-          <m:sSub>
-            <m:e>
-              <m:r>
-                <m:t>X</m:t>
-              </m:r>
-            </m:e>
-            <m:sub>
-              <m:r>
-                <m:t>i</m:t>
-              </m:r>
-              <m:r>
-                <m:t>t</m:t>
-              </m:r>
-            </m:sub>
-          </m:sSub>
-          <m:r>
-            <m:rPr>
-              <m:sty m:val="p"/>
-            </m:rPr>
-            <m:t>+</m:t>
-          </m:r>
-          <m:sSub>
-            <m:e>
-              <m:r>
-                <m:t>δ</m:t>
-              </m:r>
-            </m:e>
-            <m:sub>
-              <m:r>
-                <m:t>c</m:t>
-              </m:r>
-            </m:sub>
-          </m:sSub>
-          <m:r>
-            <m:rPr>
-              <m:sty m:val="p"/>
-            </m:rPr>
-            <m:t>+</m:t>
-          </m:r>
-          <m:sSub>
-            <m:e>
-              <m:r>
-                <m:t>λ</m:t>
-              </m:r>
-            </m:e>
-            <m:sub>
-              <m:r>
-                <m:t>t</m:t>
-              </m:r>
-            </m:sub>
-          </m:sSub>
-          <m:r>
-            <m:rPr>
-              <m:sty m:val="p"/>
-            </m:rPr>
-            <m:t>+</m:t>
-          </m:r>
-          <m:sSub>
-            <m:e>
-              <m:r>
-                <m:t>ε</m:t>
-              </m:r>
-            </m:e>
-            <m:sub>
-              <m:r>
-                <m:t>i</m:t>
-              </m:r>
-              <m:r>
-                <m:t>t</m:t>
-              </m:r>
-            </m:sub>
-          </m:sSub>
-        </m:oMath>
-      </m:oMathPara>
-    </w:p>
-    <w:p>
-      <w:pPr>
-        <w:pStyle w:val="FirstParagraph"/>
-      </w:pPr>
-      <m:oMathPara>
-        <m:oMathParaPr>
-          <m:jc m:val="center"/>
-        </m:oMathParaPr>
-        <m:oMath>
-          <m:sSub>
-            <m:e>
-              <m:r>
-                <m:t>β</m:t>
-              </m:r>
-            </m:e>
-            <m:sub>
-              <m:r>
-                <m:t>3</m:t>
-              </m:r>
-            </m:sub>
-          </m:sSub>
-          <m:r>
-            <m:t> </m:t>
-          </m:r>
-          <m:d>
-            <m:dPr>
-              <m:begChr m:val="("/>
-              <m:endChr m:val=")"/>
-              <m:sepChr m:val=""/>
-              <m:grow/>
-            </m:dPr>
-            <m:e>
-              <m:r>
-                <m:t>N</m:t>
-              </m:r>
-              <m:r>
-                <m:t>L</m:t>
-              </m:r>
-              <m:r>
-                <m:t>C</m:t>
-              </m:r>
-              <m:r>
-                <m:t>N</m:t>
-              </m:r>
-              <m:r>
-                <m:rPr>
-                  <m:sty m:val="p"/>
-                </m:rPr>
-                <m:t>_</m:t>
-              </m:r>
-              <m:r>
-                <m:t>z</m:t>
-              </m:r>
-            </m:e>
-          </m:d>
-          <m:r>
-            <m:rPr>
-              <m:sty m:val="p"/>
-            </m:rPr>
-            <m:t>:</m:t>
-          </m:r>
-          <m:r>
-            <m:t> </m:t>
-          </m:r>
-          <m:r>
-            <m:t>p</m:t>
-          </m:r>
-          <m:r>
-            <m:rPr>
-              <m:sty m:val="p"/>
-            </m:rPr>
-            <m:t>=</m:t>
-          </m:r>
-          <m:r>
-            <m:rPr>
-              <m:sty m:val="p"/>
-            </m:rPr>
-            <m:t>,</m:t>
-          </m:r>
-          <m:r>
-            <m:t>495</m:t>
-          </m:r>
-          <m:r>
-            <m:t> </m:t>
-          </m:r>
-          <m:r>
-            <m:rPr>
-              <m:nor/>
-              <m:sty m:val="p"/>
-            </m:rPr>
-            <m:t>NS</m:t>
-          </m:r>
-          <m:r>
-            <m:rPr>
-              <m:sty m:val="p"/>
-            </m:rPr>
-            <m:t>;</m:t>
-          </m:r>
-          <m:r>
-            <m:t> </m:t>
-          </m:r>
-          <m:sSub>
-            <m:e>
-              <m:r>
-                <m:t>β</m:t>
-              </m:r>
-            </m:e>
-            <m:sub>
-              <m:r>
-                <m:t>4</m:t>
-              </m:r>
-            </m:sub>
-          </m:sSub>
-          <m:r>
-            <m:t> </m:t>
-          </m:r>
-          <m:d>
-            <m:dPr>
-              <m:begChr m:val="("/>
-              <m:endChr m:val=")"/>
-              <m:sepChr m:val=""/>
-              <m:grow/>
-            </m:dPr>
-            <m:e>
-              <m:r>
-                <m:t>C</m:t>
-              </m:r>
-              <m:r>
-                <m:t>S</m:t>
-              </m:r>
-              <m:r>
-                <m:t>S</m:t>
-              </m:r>
-              <m:r>
-                <m:rPr>
-                  <m:sty m:val="p"/>
-                </m:rPr>
-                <m:t>_</m:t>
-              </m:r>
-              <m:r>
-                <m:t>z</m:t>
-              </m:r>
-            </m:e>
-          </m:d>
-          <m:r>
-            <m:rPr>
-              <m:sty m:val="p"/>
-            </m:rPr>
-            <m:t>:</m:t>
-          </m:r>
-          <m:r>
-            <m:t> </m:t>
-          </m:r>
-          <m:r>
-            <m:t>p</m:t>
-          </m:r>
-          <m:r>
-            <m:rPr>
-              <m:sty m:val="p"/>
-            </m:rPr>
-            <m:t>=</m:t>
-          </m:r>
-          <m:r>
-            <m:rPr>
-              <m:sty m:val="p"/>
-            </m:rPr>
-            <m:t>,</m:t>
-          </m:r>
-          <m:r>
-            <m:t>402</m:t>
-          </m:r>
-          <m:r>
-            <m:t> </m:t>
-          </m:r>
-          <m:r>
-            <m:rPr>
-              <m:nor/>
-              <m:sty m:val="p"/>
-            </m:rPr>
-            <m:t>NS</m:t>
-          </m:r>
-          <m:r>
-            <m:rPr>
-              <m:sty m:val="p"/>
-            </m:rPr>
-            <m:t>⇒</m:t>
-          </m:r>
-          <m:r>
-            <m:rPr>
-              <m:nor/>
-              <m:sty m:val="p"/>
-            </m:rPr>
-            <m:t>H2 bị bác bỏ tại Nhóm VI</m:t>
-          </m:r>
-        </m:oMath>
-      </m:oMathPara>
-    </w:p>
-    <w:p>
-      <w:pPr>
-        <w:pStyle w:val="FirstParagraph"/>
-      </w:pPr>
+      <w:r>
+        <w:t xml:space="preserve">M1 (Tuyến tính — kiểm định H1 FIP):</w:t>
+      </w:r>
+      <w:r>
+        <w:t xml:space="preserve"> </w:t>
+      </w:r>
+      <w:r>
+        <w:t xml:space="preserve">lnNSLD_it = α + β₁ CDDXK_c_it + γ·X_it + δ_c + λ_t + ε_it</w:t>
+      </w:r>
+      <w:r>
+        <w:t xml:space="preserve"> </w:t>
+      </w:r>
+      <w:r>
+        <w:t xml:space="preserve">→</w:t>
+      </w:r>
+      <w:r>
+        <w:t xml:space="preserve"> </w:t>
+      </w:r>
       <w:r>
         <w:rPr>
           <w:bCs/>
           <w:b/>
         </w:rPr>
-        <w:t xml:space="preserve">Phân tích độ vững (robustness checks):</w:t>
+        <w:t xml:space="preserve">H1 FIP: β₁ &lt; 0, không có điểm uốn</w:t>
+      </w:r>
+      <w:r>
+        <w:t xml:space="preserve"> </w:t>
+      </w:r>
+      <w:r>
+        <w:t xml:space="preserve">[β₁ = −0,404, SE = 0,188, p = .032*]</w:t>
+      </w:r>
+    </w:p>
+    <w:p>
+      <w:pPr>
+        <w:pStyle w:val="BodyText"/>
+      </w:pPr>
+      <w:r>
+        <w:t xml:space="preserve">M2 (Phi tuyến — kiểm định hình dạng đường cong):</w:t>
+      </w:r>
+      <w:r>
+        <w:t xml:space="preserve"> </w:t>
+      </w:r>
+      <w:r>
+        <w:t xml:space="preserve">lnNSLD_it = α + β₁ CDDXK_c_it + β₂ CDDXK_c²_it + γ·X_it + δ_c + λ_t + ε_it</w:t>
+      </w:r>
+      <w:r>
+        <w:t xml:space="preserve"> </w:t>
+      </w:r>
+      <w:r>
+        <w:t xml:space="preserve">→ β₁ và β₂ đều không có ý nghĩa thống kê → xác nhận quan hệ âm đơn điệu, không có điểm uốn</w:t>
+      </w:r>
+    </w:p>
+    <w:p>
+      <w:pPr>
+        <w:pStyle w:val="BodyText"/>
+      </w:pPr>
+      <w:r>
+        <w:t xml:space="preserve">M3 (+ Năng lực — kiểm định H2 null):</w:t>
+      </w:r>
+      <w:r>
+        <w:t xml:space="preserve"> </w:t>
+      </w:r>
+      <w:r>
+        <w:t xml:space="preserve">lnNSLD_it = α + β₁ CDDXK_c_it + β₂ CDDXK_c²_it + β₃ NLCN_z_it + β₄ CSS_z_it + γ·X_it + δ_c + λ_t + ε_it</w:t>
+      </w:r>
+      <w:r>
+        <w:t xml:space="preserve"> </w:t>
+      </w:r>
+      <w:r>
+        <w:t xml:space="preserve">→ NLCN_z: β = +0,058, p = .495 (n.s.); CSS_z: β = +0,062, p = .402 (n.s.)</w:t>
+      </w:r>
+      <w:r>
+        <w:t xml:space="preserve"> </w:t>
+      </w:r>
+      <w:r>
+        <w:t xml:space="preserve">→</w:t>
+      </w:r>
+      <w:r>
+        <w:t xml:space="preserve"> </w:t>
+      </w:r>
+      <w:r>
+        <w:rPr>
+          <w:bCs/>
+          <w:b/>
+        </w:rPr>
+        <w:t xml:space="preserve">H2: Năng lực doanh nghiệp không điều tiết được quan hệ CDDXK–lnNSLD trong bối cảnh SIDS</w:t>
+      </w:r>
+    </w:p>
+    <w:p>
+      <w:pPr>
+        <w:pStyle w:val="BodyText"/>
+      </w:pPr>
+      <w:r>
+        <w:rPr>
+          <w:bCs/>
+          <w:b/>
+        </w:rPr>
+        <w:t xml:space="preserve">Robustness</w:t>
+      </w:r>
+      <w:r>
+        <w:t xml:space="preserve">:</w:t>
+      </w:r>
+    </w:p>
+    <w:p>
+      <w:pPr>
+        <w:pStyle w:val="BodyText"/>
+      </w:pPr>
+      <w:r>
+        <w:t xml:space="preserve">M_yearFE (chỉ year FE, không country FE):</w:t>
+      </w:r>
+      <w:r>
+        <w:t xml:space="preserve"> </w:t>
+      </w:r>
+      <w:r>
+        <w:t xml:space="preserve">lnNSLD_it = α + β₁ CDDXK_it + γ·X_it + λ_t + ε_it</w:t>
+      </w:r>
+      <w:r>
+        <w:t xml:space="preserve"> </w:t>
+      </w:r>
+      <w:r>
+        <w:t xml:space="preserve">→ β₁ = −1,236, SE = 0,269, p &lt; .001*** (tác động mạnh hơn khi không kiểm soát heterogeneity quốc gia)</w:t>
+      </w:r>
+    </w:p>
+    <w:p>
+      <w:pPr>
+        <w:pStyle w:val="BodyText"/>
+      </w:pPr>
+      <w:r>
+        <w:t xml:space="preserve">M_bivariate (không controls):</w:t>
+      </w:r>
+      <w:r>
+        <w:t xml:space="preserve"> </w:t>
+      </w:r>
+      <w:r>
+        <w:t xml:space="preserve">lnNSLD_it = α + β₁ CDDXK_it + ε_it</w:t>
+      </w:r>
+      <w:r>
+        <w:t xml:space="preserve"> </w:t>
+      </w:r>
+      <w:r>
+        <w:t xml:space="preserve">→ β₁ = −1,596, SE = 0,263, p &lt; .001***</w:t>
+      </w:r>
+    </w:p>
+    <w:p>
+      <w:pPr>
+        <w:pStyle w:val="BodyText"/>
+      </w:pPr>
+      <w:r>
+        <w:t xml:space="preserve">Exporters-only (N = 187 nhà xuất khẩu):</w:t>
+      </w:r>
+      <w:r>
+        <w:t xml:space="preserve"> </w:t>
+      </w:r>
+      <w:r>
+        <w:t xml:space="preserve">→ β₁(CDDXK_c) = −0,901, SE = 0,398, p = .027* — xác nhận FIP ngay trong nhóm đang xuất khẩu</w:t>
+      </w:r>
+    </w:p>
+    <w:p>
+      <w:pPr>
+        <w:pStyle w:val="BodyText"/>
+      </w:pPr>
+      <w:r>
+        <w:rPr>
+          <w:bCs/>
+          <w:b/>
+        </w:rPr>
+        <w:t xml:space="preserve">Kết quả chính</w:t>
+      </w:r>
+      <w:r>
+        <w:t xml:space="preserve">:</w:t>
+      </w:r>
+    </w:p>
+    <w:p>
+      <w:pPr>
+        <w:pStyle w:val="BodyText"/>
+      </w:pPr>
+      <w:r>
+        <w:rPr>
+          <w:bCs/>
+          <w:b/>
+        </w:rPr>
+        <w:t xml:space="preserve">Gánh nặng quốc tế hóa bắt buộc (Forced Internationalization Penalty — FIP)</w:t>
+      </w:r>
+      <w:r>
+        <w:t xml:space="preserve"> </w:t>
+      </w:r>
+      <w:r>
+        <w:t xml:space="preserve">được xác nhận: quan hệ âm đơn điệu giữa cường độ xuất khẩu và năng suất lao động tại 9 nền kinh tế Pacific SIDS, không có điểm uốn trong phạm vi dữ liệu quan sát (CDDXK trung bình = 0,060).</w:t>
       </w:r>
     </w:p>
     <w:tbl>
@@ -16165,10 +14804,12 @@
         <w:jc w:val="start"/>
       </w:tblPr>
       <w:tblGrid>
-        <w:gridCol w:w="1980"/>
-        <w:gridCol w:w="1980"/>
-        <w:gridCol w:w="1980"/>
-        <w:gridCol w:w="1980"/>
+        <w:gridCol w:w="1320"/>
+        <w:gridCol w:w="1320"/>
+        <w:gridCol w:w="1320"/>
+        <w:gridCol w:w="1320"/>
+        <w:gridCol w:w="1320"/>
+        <w:gridCol w:w="1320"/>
       </w:tblGrid>
       <w:tr>
         <w:trPr>
@@ -16182,7 +14823,19 @@
               <w:jc w:val="left"/>
             </w:pPr>
             <w:r>
-              <w:t xml:space="preserve">Specification</w:t>
+              <w:t xml:space="preserve">Mô hình</w:t>
+            </w:r>
+          </w:p>
+        </w:tc>
+        <w:tc>
+          <w:tcPr/>
+          <w:p>
+            <w:pPr>
+              <w:pStyle w:val="Compact"/>
+              <w:jc w:val="left"/>
+            </w:pPr>
+            <w:r>
+              <w:t xml:space="preserve">N</w:t>
             </w:r>
           </w:p>
         </w:tc>
@@ -16219,6 +14872,18 @@
             </w:pPr>
             <w:r>
               <w:t xml:space="preserve">p</w:t>
+            </w:r>
+          </w:p>
+        </w:tc>
+        <w:tc>
+          <w:tcPr/>
+          <w:p>
+            <w:pPr>
+              <w:pStyle w:val="Compact"/>
+              <w:jc w:val="left"/>
+            </w:pPr>
+            <w:r>
+              <w:t xml:space="preserve">Kết luận</w:t>
             </w:r>
           </w:p>
         </w:tc>
@@ -16232,7 +14897,19 @@
               <w:jc w:val="left"/>
             </w:pPr>
             <w:r>
-              <w:t xml:space="preserve">M1 country+year FE (N = 1.469)</w:t>
+              <w:t xml:space="preserve">M1 (country+year FE)</w:t>
+            </w:r>
+          </w:p>
+        </w:tc>
+        <w:tc>
+          <w:tcPr/>
+          <w:p>
+            <w:pPr>
+              <w:pStyle w:val="Compact"/>
+              <w:jc w:val="left"/>
+            </w:pPr>
+            <w:r>
+              <w:t xml:space="preserve">1.469</w:t>
             </w:r>
           </w:p>
         </w:tc>
@@ -16256,19 +14933,35 @@
               <w:jc w:val="left"/>
             </w:pPr>
             <w:r>
-              <w:t xml:space="preserve">—</w:t>
-            </w:r>
-          </w:p>
-        </w:tc>
-        <w:tc>
-          <w:tcPr/>
-          <w:p>
-            <w:pPr>
-              <w:pStyle w:val="Compact"/>
-              <w:jc w:val="left"/>
-            </w:pPr>
-            <w:r>
-              <w:t xml:space="preserve">,032</w:t>
+              <w:t xml:space="preserve">0,188</w:t>
+            </w:r>
+          </w:p>
+        </w:tc>
+        <w:tc>
+          <w:tcPr/>
+          <w:p>
+            <w:pPr>
+              <w:pStyle w:val="Compact"/>
+              <w:jc w:val="left"/>
+            </w:pPr>
+            <w:r>
+              <w:t xml:space="preserve">.032*</w:t>
+            </w:r>
+          </w:p>
+        </w:tc>
+        <w:tc>
+          <w:tcPr/>
+          <w:p>
+            <w:pPr>
+              <w:pStyle w:val="Compact"/>
+              <w:jc w:val="left"/>
+            </w:pPr>
+            <w:r>
+              <w:rPr>
+                <w:bCs/>
+                <w:b/>
+              </w:rPr>
+              <w:t xml:space="preserve">FIP xác nhận</w:t>
             </w:r>
           </w:p>
         </w:tc>
@@ -16282,19 +14975,31 @@
               <w:jc w:val="left"/>
             </w:pPr>
             <w:r>
-              <w:t xml:space="preserve">Year FE only (không country FE)</w:t>
-            </w:r>
-          </w:p>
-        </w:tc>
-        <w:tc>
-          <w:tcPr/>
-          <w:p>
-            <w:pPr>
-              <w:pStyle w:val="Compact"/>
-              <w:jc w:val="left"/>
-            </w:pPr>
-            <w:r>
-              <w:t xml:space="preserve">−1,236</w:t>
+              <w:t xml:space="preserve">M2 (phi tuyến)</w:t>
+            </w:r>
+          </w:p>
+        </w:tc>
+        <w:tc>
+          <w:tcPr/>
+          <w:p>
+            <w:pPr>
+              <w:pStyle w:val="Compact"/>
+              <w:jc w:val="left"/>
+            </w:pPr>
+            <w:r>
+              <w:t xml:space="preserve">1.469</w:t>
+            </w:r>
+          </w:p>
+        </w:tc>
+        <w:tc>
+          <w:tcPr/>
+          <w:p>
+            <w:pPr>
+              <w:pStyle w:val="Compact"/>
+              <w:jc w:val="left"/>
+            </w:pPr>
+            <w:r>
+              <w:t xml:space="preserve">n.s.</w:t>
             </w:r>
           </w:p>
         </w:tc>
@@ -16318,7 +15023,19 @@
               <w:jc w:val="left"/>
             </w:pPr>
             <w:r>
-              <w:t xml:space="preserve">&lt; ,001</w:t>
+              <w:t xml:space="preserve">.265</w:t>
+            </w:r>
+          </w:p>
+        </w:tc>
+        <w:tc>
+          <w:tcPr/>
+          <w:p>
+            <w:pPr>
+              <w:pStyle w:val="Compact"/>
+              <w:jc w:val="left"/>
+            </w:pPr>
+            <w:r>
+              <w:t xml:space="preserve">Không có điểm uốn</w:t>
             </w:r>
           </w:p>
         </w:tc>
@@ -16332,43 +15049,67 @@
               <w:jc w:val="left"/>
             </w:pPr>
             <w:r>
-              <w:t xml:space="preserve">Bivariate (không controls)</w:t>
-            </w:r>
-          </w:p>
-        </w:tc>
-        <w:tc>
-          <w:tcPr/>
-          <w:p>
-            <w:pPr>
-              <w:pStyle w:val="Compact"/>
-              <w:jc w:val="left"/>
-            </w:pPr>
-            <w:r>
-              <w:t xml:space="preserve">−1,596</w:t>
-            </w:r>
-          </w:p>
-        </w:tc>
-        <w:tc>
-          <w:tcPr/>
-          <w:p>
-            <w:pPr>
-              <w:pStyle w:val="Compact"/>
-              <w:jc w:val="left"/>
-            </w:pPr>
-            <w:r>
-              <w:t xml:space="preserve">—</w:t>
-            </w:r>
-          </w:p>
-        </w:tc>
-        <w:tc>
-          <w:tcPr/>
-          <w:p>
-            <w:pPr>
-              <w:pStyle w:val="Compact"/>
-              <w:jc w:val="left"/>
-            </w:pPr>
-            <w:r>
-              <w:t xml:space="preserve">&lt; ,001</w:t>
+              <w:t xml:space="preserve">M3 (+ năng lực, N giảm)</w:t>
+            </w:r>
+          </w:p>
+        </w:tc>
+        <w:tc>
+          <w:tcPr/>
+          <w:p>
+            <w:pPr>
+              <w:pStyle w:val="Compact"/>
+              <w:jc w:val="left"/>
+            </w:pPr>
+            <w:r>
+              <w:t xml:space="preserve">526</w:t>
+            </w:r>
+          </w:p>
+        </w:tc>
+        <w:tc>
+          <w:tcPr/>
+          <w:p>
+            <w:pPr>
+              <w:pStyle w:val="Compact"/>
+              <w:jc w:val="left"/>
+            </w:pPr>
+            <w:r>
+              <w:t xml:space="preserve">−0,974</w:t>
+            </w:r>
+          </w:p>
+        </w:tc>
+        <w:tc>
+          <w:tcPr/>
+          <w:p>
+            <w:pPr>
+              <w:pStyle w:val="Compact"/>
+              <w:jc w:val="left"/>
+            </w:pPr>
+            <w:r>
+              <w:t xml:space="preserve">0,850</w:t>
+            </w:r>
+          </w:p>
+        </w:tc>
+        <w:tc>
+          <w:tcPr/>
+          <w:p>
+            <w:pPr>
+              <w:pStyle w:val="Compact"/>
+              <w:jc w:val="left"/>
+            </w:pPr>
+            <w:r>
+              <w:t xml:space="preserve">.252</w:t>
+            </w:r>
+          </w:p>
+        </w:tc>
+        <w:tc>
+          <w:tcPr/>
+          <w:p>
+            <w:pPr>
+              <w:pStyle w:val="Compact"/>
+              <w:jc w:val="left"/>
+            </w:pPr>
+            <w:r>
+              <w:t xml:space="preserve">FIP giữ chiều âm</w:t>
             </w:r>
           </w:p>
         </w:tc>
@@ -16382,7 +15123,93 @@
               <w:jc w:val="left"/>
             </w:pPr>
             <w:r>
-              <w:t xml:space="preserve">Exporters-only (N = 187)</w:t>
+              <w:t xml:space="preserve">M_yearFE</w:t>
+            </w:r>
+          </w:p>
+        </w:tc>
+        <w:tc>
+          <w:tcPr/>
+          <w:p>
+            <w:pPr>
+              <w:pStyle w:val="Compact"/>
+              <w:jc w:val="left"/>
+            </w:pPr>
+            <w:r>
+              <w:t xml:space="preserve">1.469</w:t>
+            </w:r>
+          </w:p>
+        </w:tc>
+        <w:tc>
+          <w:tcPr/>
+          <w:p>
+            <w:pPr>
+              <w:pStyle w:val="Compact"/>
+              <w:jc w:val="left"/>
+            </w:pPr>
+            <w:r>
+              <w:t xml:space="preserve">−1,236</w:t>
+            </w:r>
+          </w:p>
+        </w:tc>
+        <w:tc>
+          <w:tcPr/>
+          <w:p>
+            <w:pPr>
+              <w:pStyle w:val="Compact"/>
+              <w:jc w:val="left"/>
+            </w:pPr>
+            <w:r>
+              <w:t xml:space="preserve">0,269</w:t>
+            </w:r>
+          </w:p>
+        </w:tc>
+        <w:tc>
+          <w:tcPr/>
+          <w:p>
+            <w:pPr>
+              <w:pStyle w:val="Compact"/>
+              <w:jc w:val="left"/>
+            </w:pPr>
+            <w:r>
+              <w:t xml:space="preserve">&lt;.001***</w:t>
+            </w:r>
+          </w:p>
+        </w:tc>
+        <w:tc>
+          <w:tcPr/>
+          <w:p>
+            <w:pPr>
+              <w:pStyle w:val="Compact"/>
+              <w:jc w:val="left"/>
+            </w:pPr>
+            <w:r>
+              <w:t xml:space="preserve">Vững</w:t>
+            </w:r>
+          </w:p>
+        </w:tc>
+      </w:tr>
+      <w:tr>
+        <w:tc>
+          <w:tcPr/>
+          <w:p>
+            <w:pPr>
+              <w:pStyle w:val="Compact"/>
+              <w:jc w:val="left"/>
+            </w:pPr>
+            <w:r>
+              <w:t xml:space="preserve">Exporters-only</w:t>
+            </w:r>
+          </w:p>
+        </w:tc>
+        <w:tc>
+          <w:tcPr/>
+          <w:p>
+            <w:pPr>
+              <w:pStyle w:val="Compact"/>
+              <w:jc w:val="left"/>
+            </w:pPr>
+            <w:r>
+              <w:t xml:space="preserve">187</w:t>
             </w:r>
           </w:p>
         </w:tc>
@@ -16406,19 +15233,31 @@
               <w:jc w:val="left"/>
             </w:pPr>
             <w:r>
-              <w:t xml:space="preserve">—</w:t>
-            </w:r>
-          </w:p>
-        </w:tc>
-        <w:tc>
-          <w:tcPr/>
-          <w:p>
-            <w:pPr>
-              <w:pStyle w:val="Compact"/>
-              <w:jc w:val="left"/>
-            </w:pPr>
-            <w:r>
-              <w:t xml:space="preserve">,027</w:t>
+              <w:t xml:space="preserve">0,398</w:t>
+            </w:r>
+          </w:p>
+        </w:tc>
+        <w:tc>
+          <w:tcPr/>
+          <w:p>
+            <w:pPr>
+              <w:pStyle w:val="Compact"/>
+              <w:jc w:val="left"/>
+            </w:pPr>
+            <w:r>
+              <w:t xml:space="preserve">.027*</w:t>
+            </w:r>
+          </w:p>
+        </w:tc>
+        <w:tc>
+          <w:tcPr/>
+          <w:p>
+            <w:pPr>
+              <w:pStyle w:val="Compact"/>
+              <w:jc w:val="left"/>
+            </w:pPr>
+            <w:r>
+              <w:t xml:space="preserve">Vững</w:t>
             </w:r>
           </w:p>
         </w:tc>
@@ -16433,7 +15272,7 @@
           <w:iCs/>
           <w:i/>
         </w:rPr>
-        <w:t xml:space="preserve">Hệ số âm nhất quán qua 4 specification xác nhận FIP không phải do selection bias hay outlier.</w:t>
+        <w:t xml:space="preserve">Ghi chú: N giảm trong M3 (1.469 → 526) do missing values của biến NLCN_z và CSS_z. Chiều β(CDDXK_c) nhất quán âm trong tất cả mô hình. Country FE hấp thụ phần lớn phương sai (R² tăng từ 0,511 lên 0,800 khi thêm country FE), phù hợp với bối cảnh heterogeneity cực cao giữa các nền kinh tế SIDS. DAI là Tier-1 proxy (website) — không phải năng lực số động.</w:t>
       </w:r>
     </w:p>
     <w:p>
@@ -16445,586 +15284,26 @@
           <w:bCs/>
           <w:b/>
         </w:rPr>
-        <w:t xml:space="preserve">Bảng định nghĩa biến — Nghiên cứu 8 (Pacific SIDS)</w:t>
-      </w:r>
-    </w:p>
-    <w:tbl>
-      <w:tblPr>
-        <w:tblStyle w:val="Table"/>
-        <w:tblW w:type="auto" w:w="0"/>
-        <w:tblLook w:firstRow="1" w:lastRow="0" w:firstColumn="0" w:lastColumn="0" w:noHBand="0" w:noVBand="0" w:val="0020"/>
-        <w:jc w:val="start"/>
-      </w:tblPr>
-      <w:tblGrid>
-        <w:gridCol w:w="1980"/>
-        <w:gridCol w:w="1980"/>
-        <w:gridCol w:w="1980"/>
-        <w:gridCol w:w="1980"/>
-      </w:tblGrid>
-      <w:tr>
-        <w:trPr>
-          <w:tblHeader w:val="true"/>
-        </w:trPr>
-        <w:tc>
-          <w:tcPr/>
-          <w:p>
-            <w:pPr>
-              <w:pStyle w:val="Compact"/>
-              <w:jc w:val="left"/>
-            </w:pPr>
-            <w:r>
-              <w:t xml:space="preserve">Ký hiệu</w:t>
-            </w:r>
-          </w:p>
-        </w:tc>
-        <w:tc>
-          <w:tcPr/>
-          <w:p>
-            <w:pPr>
-              <w:pStyle w:val="Compact"/>
-              <w:jc w:val="left"/>
-            </w:pPr>
-            <w:r>
-              <w:t xml:space="preserve">WBES item</w:t>
-            </w:r>
-          </w:p>
-        </w:tc>
-        <w:tc>
-          <w:tcPr/>
-          <w:p>
-            <w:pPr>
-              <w:pStyle w:val="Compact"/>
-              <w:jc w:val="left"/>
-            </w:pPr>
-            <w:r>
-              <w:t xml:space="preserve">Cách tính</w:t>
-            </w:r>
-          </w:p>
-        </w:tc>
-        <w:tc>
-          <w:tcPr/>
-          <w:p>
-            <w:pPr>
-              <w:pStyle w:val="Compact"/>
-              <w:jc w:val="left"/>
-            </w:pPr>
-            <w:r>
-              <w:t xml:space="preserve">Vai trò</w:t>
-            </w:r>
-          </w:p>
-        </w:tc>
-      </w:tr>
-      <w:tr>
-        <w:tc>
-          <w:tcPr/>
-          <w:p>
-            <w:pPr>
-              <w:pStyle w:val="Compact"/>
-              <w:jc w:val="left"/>
-            </w:pPr>
-            <w:r>
-              <w:t xml:space="preserve">lnNSLD</w:t>
-            </w:r>
-          </w:p>
-        </w:tc>
-        <w:tc>
-          <w:tcPr/>
-          <w:p>
-            <w:pPr>
-              <w:pStyle w:val="Compact"/>
-              <w:jc w:val="left"/>
-            </w:pPr>
-            <w:r>
-              <w:t xml:space="preserve">d2, l1</w:t>
-            </w:r>
-          </w:p>
-        </w:tc>
-        <w:tc>
-          <w:tcPr/>
-          <w:p>
-            <w:pPr>
-              <w:pStyle w:val="Compact"/>
-              <w:jc w:val="left"/>
-            </w:pPr>
-            <w:r>
-              <w:t xml:space="preserve">ln(doanh thu PPP / lao động)</w:t>
-            </w:r>
-          </w:p>
-        </w:tc>
-        <w:tc>
-          <w:tcPr/>
-          <w:p>
-            <w:pPr>
-              <w:pStyle w:val="Compact"/>
-              <w:jc w:val="left"/>
-            </w:pPr>
-            <w:r>
-              <w:t xml:space="preserve">Biến phụ thuộc</w:t>
-            </w:r>
-          </w:p>
-        </w:tc>
-      </w:tr>
-      <w:tr>
-        <w:tc>
-          <w:tcPr/>
-          <w:p>
-            <w:pPr>
-              <w:pStyle w:val="Compact"/>
-              <w:jc w:val="left"/>
-            </w:pPr>
-            <w:r>
-              <w:t xml:space="preserve">CDDXK_c</w:t>
-            </w:r>
-          </w:p>
-        </w:tc>
-        <w:tc>
-          <w:tcPr/>
-          <w:p>
-            <w:pPr>
-              <w:pStyle w:val="Compact"/>
-              <w:jc w:val="left"/>
-            </w:pPr>
-            <w:r>
-              <w:t xml:space="preserve">d3c</w:t>
-            </w:r>
-          </w:p>
-        </w:tc>
-        <w:tc>
-          <w:tcPr/>
-          <w:p>
-            <w:pPr>
-              <w:pStyle w:val="Compact"/>
-              <w:jc w:val="left"/>
-            </w:pPr>
-            <w:r>
-              <w:t xml:space="preserve">(d3c/100) − mean_wave: centred</w:t>
-            </w:r>
-          </w:p>
-        </w:tc>
-        <w:tc>
-          <w:tcPr/>
-          <w:p>
-            <w:pPr>
-              <w:pStyle w:val="Compact"/>
-              <w:jc w:val="left"/>
-            </w:pPr>
-            <w:r>
-              <w:t xml:space="preserve">Biến độc lập (I)</w:t>
-            </w:r>
-          </w:p>
-        </w:tc>
-      </w:tr>
-      <w:tr>
-        <w:tc>
-          <w:tcPr/>
-          <w:p>
-            <w:pPr>
-              <w:pStyle w:val="Compact"/>
-              <w:jc w:val="left"/>
-            </w:pPr>
-            <w:r>
-              <w:t xml:space="preserve">CDDXK_c²</w:t>
-            </w:r>
-          </w:p>
-        </w:tc>
-        <w:tc>
-          <w:tcPr/>
-          <w:p>
-            <w:pPr>
-              <w:pStyle w:val="Compact"/>
-              <w:jc w:val="left"/>
-            </w:pPr>
-            <w:r>
-              <w:t xml:space="preserve">d3c</w:t>
-            </w:r>
-          </w:p>
-        </w:tc>
-        <w:tc>
-          <w:tcPr/>
-          <w:p>
-            <w:pPr>
-              <w:pStyle w:val="Compact"/>
-              <w:jc w:val="left"/>
-            </w:pPr>
-            <w:r>
-              <w:t xml:space="preserve">CDDXK_c bình phương</w:t>
-            </w:r>
-          </w:p>
-        </w:tc>
-        <w:tc>
-          <w:tcPr/>
-          <w:p>
-            <w:pPr>
-              <w:pStyle w:val="Compact"/>
-              <w:jc w:val="left"/>
-            </w:pPr>
-            <w:r>
-              <w:t xml:space="preserve">I — kiểm định phi tuyến</w:t>
-            </w:r>
-          </w:p>
-        </w:tc>
-      </w:tr>
-      <w:tr>
-        <w:tc>
-          <w:tcPr/>
-          <w:p>
-            <w:pPr>
-              <w:pStyle w:val="Compact"/>
-              <w:jc w:val="left"/>
-            </w:pPr>
-            <w:r>
-              <w:t xml:space="preserve">NLCN_z</w:t>
-            </w:r>
-          </w:p>
-        </w:tc>
-        <w:tc>
-          <w:tcPr/>
-          <w:p>
-            <w:pPr>
-              <w:pStyle w:val="Compact"/>
-              <w:jc w:val="left"/>
-            </w:pPr>
-            <w:r>
-              <w:t xml:space="preserve">b8, e6</w:t>
-            </w:r>
-          </w:p>
-        </w:tc>
-        <w:tc>
-          <w:tcPr/>
-          <w:p>
-            <w:pPr>
-              <w:pStyle w:val="Compact"/>
-              <w:jc w:val="left"/>
-            </w:pPr>
-            <w:r>
-              <w:t xml:space="preserve">z-std(cert + CN nước ngoài)</w:t>
-            </w:r>
-          </w:p>
-        </w:tc>
-        <w:tc>
-          <w:tcPr/>
-          <w:p>
-            <w:pPr>
-              <w:pStyle w:val="Compact"/>
-              <w:jc w:val="left"/>
-            </w:pPr>
-            <w:r>
-              <w:t xml:space="preserve">Năng lực công nghệ</w:t>
-            </w:r>
-          </w:p>
-        </w:tc>
-      </w:tr>
-      <w:tr>
-        <w:tc>
-          <w:tcPr/>
-          <w:p>
-            <w:pPr>
-              <w:pStyle w:val="Compact"/>
-              <w:jc w:val="left"/>
-            </w:pPr>
-            <w:r>
-              <w:t xml:space="preserve">CSS_z</w:t>
-            </w:r>
-          </w:p>
-        </w:tc>
-        <w:tc>
-          <w:tcPr/>
-          <w:p>
-            <w:pPr>
-              <w:pStyle w:val="Compact"/>
-              <w:jc w:val="left"/>
-            </w:pPr>
-            <w:r>
-              <w:t xml:space="preserve">c22b</w:t>
-            </w:r>
-          </w:p>
-        </w:tc>
-        <w:tc>
-          <w:tcPr/>
-          <w:p>
-            <w:pPr>
-              <w:pStyle w:val="Compact"/>
-              <w:jc w:val="left"/>
-            </w:pPr>
-            <w:r>
-              <w:t xml:space="preserve">z-std(website binary): Tier-1 only</w:t>
-            </w:r>
-          </w:p>
-        </w:tc>
-        <w:tc>
-          <w:tcPr/>
-          <w:p>
-            <w:pPr>
-              <w:pStyle w:val="Compact"/>
-              <w:jc w:val="left"/>
-            </w:pPr>
-            <w:r>
-              <w:t xml:space="preserve">Số hoá — proxy tĩnh</w:t>
-            </w:r>
-          </w:p>
-        </w:tc>
-      </w:tr>
-      <w:tr>
-        <w:tc>
-          <w:tcPr/>
-          <w:p>
-            <w:pPr>
-              <w:pStyle w:val="Compact"/>
-              <w:jc w:val="left"/>
-            </w:pPr>
-            <w:r>
-              <w:t xml:space="preserve">lnLD</w:t>
-            </w:r>
-          </w:p>
-        </w:tc>
-        <w:tc>
-          <w:tcPr/>
-          <w:p>
-            <w:pPr>
-              <w:pStyle w:val="Compact"/>
-              <w:jc w:val="left"/>
-            </w:pPr>
-            <w:r>
-              <w:t xml:space="preserve">l1</w:t>
-            </w:r>
-          </w:p>
-        </w:tc>
-        <w:tc>
-          <w:tcPr/>
-          <w:p>
-            <w:pPr>
-              <w:pStyle w:val="Compact"/>
-              <w:jc w:val="left"/>
-            </w:pPr>
-            <w:r>
-              <w:t xml:space="preserve">ln(lao động thường trực)</w:t>
-            </w:r>
-          </w:p>
-        </w:tc>
-        <w:tc>
-          <w:tcPr/>
-          <w:p>
-            <w:pPr>
-              <w:pStyle w:val="Compact"/>
-              <w:jc w:val="left"/>
-            </w:pPr>
-            <w:r>
-              <w:t xml:space="preserve">Control (quy mô)</w:t>
-            </w:r>
-          </w:p>
-        </w:tc>
-      </w:tr>
-      <w:tr>
-        <w:tc>
-          <w:tcPr/>
-          <w:p>
-            <w:pPr>
-              <w:pStyle w:val="Compact"/>
-              <w:jc w:val="left"/>
-            </w:pPr>
-            <w:r>
-              <w:t xml:space="preserve">TuoiDN</w:t>
-            </w:r>
-          </w:p>
-        </w:tc>
-        <w:tc>
-          <w:tcPr/>
-          <w:p>
-            <w:pPr>
-              <w:pStyle w:val="Compact"/>
-              <w:jc w:val="left"/>
-            </w:pPr>
-            <w:r>
-              <w:t xml:space="preserve">b5</w:t>
-            </w:r>
-          </w:p>
-        </w:tc>
-        <w:tc>
-          <w:tcPr/>
-          <w:p>
-            <w:pPr>
-              <w:pStyle w:val="Compact"/>
-              <w:jc w:val="left"/>
-            </w:pPr>
-            <w:r>
-              <w:t xml:space="preserve">năm_KS − năm_thành_lập</w:t>
-            </w:r>
-          </w:p>
-        </w:tc>
-        <w:tc>
-          <w:tcPr/>
-          <w:p>
-            <w:pPr>
-              <w:pStyle w:val="Compact"/>
-              <w:jc w:val="left"/>
-            </w:pPr>
-            <w:r>
-              <w:t xml:space="preserve">Control (tuổi DN)</w:t>
-            </w:r>
-          </w:p>
-        </w:tc>
-      </w:tr>
-      <w:tr>
-        <w:tc>
-          <w:tcPr/>
-          <w:p>
-            <w:pPr>
-              <w:pStyle w:val="Compact"/>
-              <w:jc w:val="left"/>
-            </w:pPr>
-            <w:r>
-              <w:t xml:space="preserve">SoHuuNN</w:t>
-            </w:r>
-          </w:p>
-        </w:tc>
-        <w:tc>
-          <w:tcPr/>
-          <w:p>
-            <w:pPr>
-              <w:pStyle w:val="Compact"/>
-              <w:jc w:val="left"/>
-            </w:pPr>
-            <w:r>
-              <w:t xml:space="preserve">b6a</w:t>
-            </w:r>
-          </w:p>
-        </w:tc>
-        <w:tc>
-          <w:tcPr/>
-          <w:p>
-            <w:pPr>
-              <w:pStyle w:val="Compact"/>
-              <w:jc w:val="left"/>
-            </w:pPr>
-            <w:r>
-              <w:t xml:space="preserve">tỷ lệ sở hữu nước ngoài</w:t>
-            </w:r>
-          </w:p>
-        </w:tc>
-        <w:tc>
-          <w:tcPr/>
-          <w:p>
-            <w:pPr>
-              <w:pStyle w:val="Compact"/>
-              <w:jc w:val="left"/>
-            </w:pPr>
-            <w:r>
-              <w:t xml:space="preserve">Control (sở hữu)</w:t>
-            </w:r>
-          </w:p>
-        </w:tc>
-      </w:tr>
-      <w:tr>
-        <w:tc>
-          <w:tcPr/>
-          <w:p>
-            <w:pPr>
-              <w:pStyle w:val="Compact"/>
-              <w:jc w:val="left"/>
-            </w:pPr>
-            <w:r>
-              <w:t xml:space="preserve">δ_c</w:t>
-            </w:r>
-          </w:p>
-        </w:tc>
-        <w:tc>
-          <w:tcPr/>
-          <w:p>
-            <w:pPr>
-              <w:pStyle w:val="Compact"/>
-              <w:jc w:val="left"/>
-            </w:pPr>
-            <w:r>
-              <w:t xml:space="preserve">a3b</w:t>
-            </w:r>
-          </w:p>
-        </w:tc>
-        <w:tc>
-          <w:tcPr/>
-          <w:p>
-            <w:pPr>
-              <w:pStyle w:val="Compact"/>
-              <w:jc w:val="left"/>
-            </w:pPr>
-            <w:r>
-              <w:t xml:space="preserve">country FE</w:t>
-            </w:r>
-          </w:p>
-        </w:tc>
-        <w:tc>
-          <w:tcPr/>
-          <w:p>
-            <w:pPr>
-              <w:pStyle w:val="Compact"/>
-              <w:jc w:val="left"/>
-            </w:pPr>
-            <w:r>
-              <w:t xml:space="preserve">Fixed effects</w:t>
-            </w:r>
-          </w:p>
-        </w:tc>
-      </w:tr>
-      <w:tr>
-        <w:tc>
-          <w:tcPr/>
-          <w:p>
-            <w:pPr>
-              <w:pStyle w:val="Compact"/>
-              <w:jc w:val="left"/>
-            </w:pPr>
-            <w:r>
-              <w:t xml:space="preserve">λ_t</w:t>
-            </w:r>
-          </w:p>
-        </w:tc>
-        <w:tc>
-          <w:tcPr/>
-          <w:p>
-            <w:pPr>
-              <w:pStyle w:val="Compact"/>
-              <w:jc w:val="left"/>
-            </w:pPr>
-            <w:r>
-              <w:t xml:space="preserve">wave</w:t>
-            </w:r>
-          </w:p>
-        </w:tc>
-        <w:tc>
-          <w:tcPr/>
-          <w:p>
-            <w:pPr>
-              <w:pStyle w:val="Compact"/>
-              <w:jc w:val="left"/>
-            </w:pPr>
-            <w:r>
-              <w:t xml:space="preserve">wave FE</w:t>
-            </w:r>
-          </w:p>
-        </w:tc>
-        <w:tc>
-          <w:tcPr/>
-          <w:p>
-            <w:pPr>
-              <w:pStyle w:val="Compact"/>
-              <w:jc w:val="left"/>
-            </w:pPr>
-            <w:r>
-              <w:t xml:space="preserve">Fixed effects</w:t>
-            </w:r>
-          </w:p>
-        </w:tc>
-      </w:tr>
-    </w:tbl>
-    <w:p>
-      <w:pPr>
-        <w:pStyle w:val="BodyText"/>
-      </w:pPr>
+        <w:t xml:space="preserve">Đóng góp lý thuyết từ Nghiên cứu 8</w:t>
+      </w:r>
+      <w:r>
+        <w:t xml:space="preserve">: FIP là</w:t>
+      </w:r>
+      <w:r>
+        <w:t xml:space="preserve"> </w:t>
+      </w:r>
       <w:r>
         <w:rPr>
-          <w:iCs/>
-          <w:i/>
+          <w:bCs/>
+          <w:b/>
         </w:rPr>
-        <w:t xml:space="preserve">Ghi chú: FIP là điều kiện biên (boundary condition) của mô hình chữ U ngược — áp dụng đặc thù tại ICRV Nhóm VI nơi 3 điều kiện cấu trúc bị vi phạm đồng thời: (1) không có thị trường nội địa đủ lớn, (2) chi phí thương mại không kiểm soát được, (3) hỗ trợ thể chế không đủ chức năng. DAI (CSS_z) Tier-1 only — WBES không thu thập thang đo đầy đủ cho số hoá động tại SIDS.</w:t>
+        <w:t xml:space="preserve">boundary condition</w:t>
+      </w:r>
+      <w:r>
+        <w:t xml:space="preserve"> </w:t>
+      </w:r>
+      <w:r>
+        <w:t xml:space="preserve">của mô hình inverted-U: khi 3 điều kiện tiên quyết cấu trúc đồng thời không được đáp ứng — (1) thị trường nội địa khả thi, (2) chi phí thương mại chấp nhận được, (3) thể chế hỗ trợ trao đổi quốc tế — quan hệ I→P chuyển từ inverted-U thành đường thẳng âm đơn điệu không có điểm uốn. Chuyển dịch lý thuyết từ "institutional moderation of I-P intensity" (Marano et al., 2016) sang "institutional determination of I-P sign".</w:t>
       </w:r>
     </w:p>
     <w:p>
@@ -17034,15 +15313,14 @@
         </w:pict>
       </w:r>
     </w:p>
-    <w:bookmarkEnd w:id="41"/>
-    <w:bookmarkEnd w:id="42"/>
-    <w:bookmarkStart w:id="43" w:name="Xcb5234575391557b76fcccc317c70eb26569684"/>
+    <w:bookmarkEnd w:id="47"/>
+    <w:bookmarkStart w:id="48" w:name="X6ef7915cef2320d0a5a0851ec4b4441ab8af223"/>
     <w:p>
       <w:pPr>
         <w:pStyle w:val="Heading3"/>
       </w:pPr>
       <w:r>
-        <w:t xml:space="preserve">3.4.6 Sai số chuẩn</w:t>
+        <w:t xml:space="preserve">4.6 Sai số chuẩn</w:t>
       </w:r>
     </w:p>
     <w:p>
@@ -17053,31 +15331,31 @@
         <w:t xml:space="preserve">Tất cả các mô hình đều sử dụng HC1/HC3 robust standard errors (Long &amp; Ervin, 2000; White, 1980) để xử lý heteroscedasticity. Đối với multi-country, bổ sung clustered SE theo country.</w:t>
       </w:r>
     </w:p>
-    <w:bookmarkEnd w:id="43"/>
-    <w:bookmarkEnd w:id="44"/>
-    <w:bookmarkStart w:id="50" w:name="X8be9b8b49491f51852c13794a1720d171ee5535"/>
+    <w:bookmarkEnd w:id="48"/>
+    <w:bookmarkEnd w:id="49"/>
+    <w:bookmarkStart w:id="55" w:name="Xbd137c7549379bc59bd868848e5dfb5b5e4e977"/>
     <w:p>
       <w:pPr>
         <w:pStyle w:val="Heading2"/>
       </w:pPr>
       <w:r>
-        <w:t xml:space="preserve">3.5 Kiểm định độ vững</w:t>
-      </w:r>
-    </w:p>
-    <w:bookmarkStart w:id="45" w:name="Xa00f076f3963b547ab7d43d6f55fd4f3a5113c5"/>
+        <w:t xml:space="preserve">5. Kiểm định độ vững</w:t>
+      </w:r>
+    </w:p>
+    <w:bookmarkStart w:id="50" w:name="X431ee618c3d4d2cdcb5311a37313dcf18ed1464"/>
     <w:p>
       <w:pPr>
         <w:pStyle w:val="Heading3"/>
       </w:pPr>
       <w:r>
-        <w:t xml:space="preserve">3.5.1 Thay đổi thước đo</w:t>
+        <w:t xml:space="preserve">5.1 Thay đổi thước đo</w:t>
       </w:r>
     </w:p>
     <w:p>
       <w:pPr>
         <w:numPr>
           <w:ilvl w:val="0"/>
-          <w:numId w:val="1007"/>
+          <w:numId w:val="1008"/>
         </w:numPr>
         <w:pStyle w:val="Compact"/>
       </w:pPr>
@@ -17122,70 +15400,12 @@
       <w:pPr>
         <w:numPr>
           <w:ilvl w:val="0"/>
-          <w:numId w:val="1007"/>
+          <w:numId w:val="1008"/>
         </w:numPr>
         <w:pStyle w:val="Compact"/>
       </w:pPr>
       <w:r>
         <w:t xml:space="preserve">Biến độc lập: thay FSTS bằng export status (binary), foreign sales count.</w:t>
-      </w:r>
-    </w:p>
-    <w:p>
-      <w:pPr>
-        <w:numPr>
-          <w:ilvl w:val="0"/>
-          <w:numId w:val="1007"/>
-        </w:numPr>
-        <w:pStyle w:val="Compact"/>
-      </w:pPr>
-      <w:r>
-        <w:t xml:space="preserve">Biến moderator: thay DAI_thin bằng DAI_rich (cho subset 2024+).</w:t>
-      </w:r>
-    </w:p>
-    <w:bookmarkEnd w:id="45"/>
-    <w:bookmarkStart w:id="46" w:name="Xac2ebbdc11b48daafdee8742a5cbdf7e2e607ee"/>
-    <w:p>
-      <w:pPr>
-        <w:pStyle w:val="Heading3"/>
-      </w:pPr>
-      <w:r>
-        <w:t xml:space="preserve">3.5.2 Mẫu phụ</w:t>
-      </w:r>
-    </w:p>
-    <w:p>
-      <w:pPr>
-        <w:pStyle w:val="FirstParagraph"/>
-      </w:pPr>
-      <w:r>
-        <w:t xml:space="preserve">Loại trừ micro firms (&lt;5 lao động); chỉ giữ SMEs; chỉ giữ manufacturing; chỉ giữ exporters (FSTS &gt; 0); subgroup theo 6 sub-regime ICRV.</w:t>
-      </w:r>
-    </w:p>
-    <w:bookmarkEnd w:id="46"/>
-    <w:bookmarkStart w:id="47" w:name="X7f474d927517549e35ccb278e2098f6d3b759d4"/>
-    <w:p>
-      <w:pPr>
-        <w:pStyle w:val="Heading3"/>
-      </w:pPr>
-      <w:r>
-        <w:t xml:space="preserve">3.5.3 Outliers</w:t>
-      </w:r>
-    </w:p>
-    <w:p>
-      <w:pPr>
-        <w:pStyle w:val="FirstParagraph"/>
-      </w:pPr>
-      <w:r>
-        <w:t xml:space="preserve">Winsorization 1% và 5% đối với labor productivity và employment, áp dụng trong từng country-year.</w:t>
-      </w:r>
-    </w:p>
-    <w:bookmarkEnd w:id="47"/>
-    <w:bookmarkStart w:id="48" w:name="X2da9a9ba2cec2086c1dda0df0458753db93e2e3"/>
-    <w:p>
-      <w:pPr>
-        <w:pStyle w:val="Heading3"/>
-      </w:pPr>
-      <w:r>
-        <w:t xml:space="preserve">3.5.4 Multicollinearity và heteroscedasticity</w:t>
       </w:r>
     </w:p>
     <w:p>
@@ -17197,29 +15417,53 @@
         <w:pStyle w:val="Compact"/>
       </w:pPr>
       <w:r>
-        <w:t xml:space="preserve">VIF cho tất cả mô hình; ngưỡng VIF &lt; 5 (Hair et al., 2019).</w:t>
-      </w:r>
-    </w:p>
-    <w:p>
-      <w:pPr>
-        <w:numPr>
-          <w:ilvl w:val="0"/>
-          <w:numId w:val="1008"/>
-        </w:numPr>
-        <w:pStyle w:val="Compact"/>
-      </w:pPr>
-      <w:r>
-        <w:t xml:space="preserve">Breusch–Pagan test (Breusch &amp; Pagan, 1979).</w:t>
-      </w:r>
-    </w:p>
-    <w:bookmarkEnd w:id="48"/>
-    <w:bookmarkStart w:id="49" w:name="Xece3d027367fef795bcf55aad7417945cf4f49c"/>
+        <w:t xml:space="preserve">Biến moderator: thay DAI_thin bằng DAI_rich (cho subset 2024+).</w:t>
+      </w:r>
+    </w:p>
+    <w:bookmarkEnd w:id="50"/>
+    <w:bookmarkStart w:id="51" w:name="X9e9ef139d57d7f609b0bd2a30f6aacc57ffda85"/>
     <w:p>
       <w:pPr>
         <w:pStyle w:val="Heading3"/>
       </w:pPr>
       <w:r>
-        <w:t xml:space="preserve">3.5.5 Sensitivity analysis cho meta-analysis</w:t>
+        <w:t xml:space="preserve">5.2 Mẫu phụ</w:t>
+      </w:r>
+    </w:p>
+    <w:p>
+      <w:pPr>
+        <w:pStyle w:val="FirstParagraph"/>
+      </w:pPr>
+      <w:r>
+        <w:t xml:space="preserve">Loại trừ micro firms (&lt;5 lao động); chỉ giữ SMEs; chỉ giữ manufacturing; chỉ giữ exporters (FSTS &gt; 0); subgroup theo 6 sub-regime ICRV.</w:t>
+      </w:r>
+    </w:p>
+    <w:bookmarkEnd w:id="51"/>
+    <w:bookmarkStart w:id="52" w:name="X98cc73fc712d9e44cc5d18b702bb976620f7fc1"/>
+    <w:p>
+      <w:pPr>
+        <w:pStyle w:val="Heading3"/>
+      </w:pPr>
+      <w:r>
+        <w:t xml:space="preserve">5.3 Outliers</w:t>
+      </w:r>
+    </w:p>
+    <w:p>
+      <w:pPr>
+        <w:pStyle w:val="FirstParagraph"/>
+      </w:pPr>
+      <w:r>
+        <w:t xml:space="preserve">Winsorization 1% và 5% đối với labor productivity và employment, áp dụng trong từng country-year.</w:t>
+      </w:r>
+    </w:p>
+    <w:bookmarkEnd w:id="52"/>
+    <w:bookmarkStart w:id="53" w:name="X33d8f36a6a0e8ad3d10f0b0d165a7983b25acc1"/>
+    <w:p>
+      <w:pPr>
+        <w:pStyle w:val="Heading3"/>
+      </w:pPr>
+      <w:r>
+        <w:t xml:space="preserve">5.4 Multicollinearity và heteroscedasticity</w:t>
       </w:r>
     </w:p>
     <w:p>
@@ -17231,7 +15475,7 @@
         <w:pStyle w:val="Compact"/>
       </w:pPr>
       <w:r>
-        <w:t xml:space="preserve">Leave-one-out: loại từng nghiên cứu và tái tính pooled effect.</w:t>
+        <w:t xml:space="preserve">VIF cho tất cả mô hình; ngưỡng VIF &lt; 5 (Hair et al., 2019).</w:t>
       </w:r>
     </w:p>
     <w:p>
@@ -17243,18 +15487,52 @@
         <w:pStyle w:val="Compact"/>
       </w:pPr>
       <w:r>
+        <w:t xml:space="preserve">Breusch–Pagan test (Breusch &amp; Pagan, 1979).</w:t>
+      </w:r>
+    </w:p>
+    <w:bookmarkEnd w:id="53"/>
+    <w:bookmarkStart w:id="54" w:name="X72f2a8f16e87d5c44ffc52bf2b3af577e467955"/>
+    <w:p>
+      <w:pPr>
+        <w:pStyle w:val="Heading3"/>
+      </w:pPr>
+      <w:r>
+        <w:t xml:space="preserve">5.5 Sensitivity analysis cho meta-analysis</w:t>
+      </w:r>
+    </w:p>
+    <w:p>
+      <w:pPr>
+        <w:numPr>
+          <w:ilvl w:val="0"/>
+          <w:numId w:val="1010"/>
+        </w:numPr>
+        <w:pStyle w:val="Compact"/>
+      </w:pPr>
+      <w:r>
+        <w:t xml:space="preserve">Leave-one-out: loại từng nghiên cứu và tái tính pooled effect.</w:t>
+      </w:r>
+    </w:p>
+    <w:p>
+      <w:pPr>
+        <w:numPr>
+          <w:ilvl w:val="0"/>
+          <w:numId w:val="1010"/>
+        </w:numPr>
+        <w:pStyle w:val="Compact"/>
+      </w:pPr>
+      <w:r>
         <w:t xml:space="preserve">Trim-and-fill (Duval &amp; Tweedie, 2000) cho publication bias.</w:t>
       </w:r>
     </w:p>
-    <w:bookmarkEnd w:id="49"/>
-    <w:bookmarkEnd w:id="50"/>
-    <w:bookmarkStart w:id="51" w:name="Xda9461543ca17f4fffc4dad7e6165fee80c6b0c"/>
+    <w:bookmarkEnd w:id="54"/>
+    <w:bookmarkEnd w:id="55"/>
+    <w:bookmarkStart w:id="56" w:name="Xba1727fc0da4fc8e26a315fbd09b8799e5ac3db"/>
     <w:p>
       <w:pPr>
         <w:pStyle w:val="Heading2"/>
       </w:pPr>
       <w:r>
-        <w:t xml:space="preserve">3.6 Tóm tắt phương pháp: Kế thừa và đóng góp mới</w:t>
+        <w:t xml:space="preserve">6. Tóm tắt kế thừa và đóng góp mới</w:t>
       </w:r>
     </w:p>
     <w:tbl>
@@ -17761,14 +16039,14 @@
         </w:tc>
       </w:tr>
     </w:tbl>
-    <w:bookmarkEnd w:id="51"/>
-    <w:bookmarkStart w:id="52" w:name="X8731c6039be62b4d182e17d98ac2bec3a898506"/>
+    <w:bookmarkEnd w:id="56"/>
+    <w:bookmarkStart w:id="57" w:name="X696efacd1a1ef1aca1868f20b67b10fe2c2b182"/>
     <w:p>
       <w:pPr>
         <w:pStyle w:val="Heading2"/>
       </w:pPr>
       <w:r>
-        <w:t xml:space="preserve">3.7 Đạo đức nghiên cứu</w:t>
+        <w:t xml:space="preserve">7. Đạo đức nghiên cứu</w:t>
       </w:r>
     </w:p>
     <w:p>
@@ -17779,8 +16057,8 @@
         <w:t xml:space="preserve">Luận án sử dụng dữ liệu thứ cấp từ WBES — bộ dữ liệu công khai được World Bank cung cấp miễn phí cho mục đích nghiên cứu (World Bank, n.d.). Tất cả các citation theo APA 7th để ghi nhận đầy đủ công sức của các tác giả trước, tránh đạo văn. Code và dữ liệu phân tích được lưu trữ trên các nhánh chuyên biệt của repository để bảo đảm khả năng tái lập kết quả.</w:t>
       </w:r>
     </w:p>
-    <w:bookmarkEnd w:id="52"/>
-    <w:bookmarkEnd w:id="53"/>
+    <w:bookmarkEnd w:id="57"/>
+    <w:bookmarkEnd w:id="58"/>
     <w:sectPr>
       <w:pgSz w:h="16838" w:w="11906"/>
       <w:pgMar w:bottom="1134" w:left="1701" w:right="1134" w:top="1134"/>
@@ -17994,6 +16272,9 @@
     <w:abstractNumId w:val="991"/>
   </w:num>
   <w:num w:numId="1009">
+    <w:abstractNumId w:val="991"/>
+  </w:num>
+  <w:num w:numId="1010">
     <w:abstractNumId w:val="991"/>
   </w:num>
 </w:numbering>

</xml_diff>